<commit_message>
resturucture: resutucture the folder structure
</commit_message>
<xml_diff>
--- a/docs/SYSTEM_DIAGRAM.docx
+++ b/docs/SYSTEM_DIAGRAM.docx
@@ -24,7 +24,7 @@
       </w:pPr>
       <w:r>
         <w:rPr/>
-        <w:t>This document describes the complete system: browser, authentication, chat UI, Astro server, action engine, events, LLM provider, and the planned email delivery layer.</w:t>
+        <w:t>This document describes the complete system: browser, authentication, chat UI, the Astro SSR front-end, the Bun HTTP API, the action engine, events, LLM provider, XState workflow machines, the in-memory execution queue, and Brevo transactional email.</w:t>
       </w:r>
     </w:p>
     <w:p>
@@ -201,17 +201,39 @@
       </w:pPr>
       <w:r>
         <w:rPr/>
-        <w:t xml:space="preserve">Email delivery, scheduling, Brevo integration, parameter collection, and confirmation are </w:t>
+        <w:t xml:space="preserve">Immediate </w:t>
       </w:r>
       <w:r>
         <w:rPr>
-          <w:rStyle w:val="Strong"/>
+          <w:rStyle w:val="SourceText"/>
         </w:rPr>
-        <w:t>not implemented</w:t>
-      </w:r>
-      <w:r>
-        <w:rPr/>
-        <w:t xml:space="preserve"> yet. They are shown as planned.</w:t>
+        <w:t>send_email</w:t>
+      </w:r>
+      <w:r>
+        <w:rPr/>
+        <w:t xml:space="preserve"> delivery is implemented through a Bun HTTP API, a server-side XState root machine, an in-memory FIFO queue, and a Brevo actor. The chat client keeps the clarification and confirmation conversation, then enqueues a confirmed action. Scheduling has a placeholder root-machine state only. Persistent records, retries, background workers, and server-side authentication remain planned.</w:t>
+      </w:r>
+    </w:p>
+    <w:p>
+      <w:pPr>
+        <w:pStyle w:val="BodyText"/>
+        <w:bidi w:val="0"/>
+        <w:jc w:val="start"/>
+        <w:rPr/>
+      </w:pPr>
+      <w:r>
+        <w:rPr/>
+        <w:t xml:space="preserve">In development, the Astro front-end proxies relative </w:t>
+      </w:r>
+      <w:r>
+        <w:rPr>
+          <w:rStyle w:val="SourceText"/>
+        </w:rPr>
+        <w:t>/api</w:t>
+      </w:r>
+      <w:r>
+        <w:rPr/>
+        <w:t xml:space="preserve"> requests to the Bun API. The Astro production server does not include that proxy automatically; production needs a reverse proxy or equivalent same-origin routing.</w:t>
       </w:r>
     </w:p>
     <w:p>
@@ -238,7 +260,7 @@
         <w:rPr/>
         <w:drawing>
           <wp:inline distT="0" distB="0" distL="0" distR="0">
-            <wp:extent cx="9525000" cy="1914525"/>
+            <wp:extent cx="9525000" cy="1885950"/>
             <wp:effectExtent l="0" t="0" r="0" b="0"/>
             <wp:docPr id="1" name="Image1" descr="" title="Diagram 1"/>
             <wp:cNvGraphicFramePr>
@@ -262,7 +284,7 @@
                   <pic:spPr bwMode="auto">
                     <a:xfrm>
                       <a:off x="0" y="0"/>
-                      <a:ext cx="9525000" cy="1914525"/>
+                      <a:ext cx="9525000" cy="1885950"/>
                     </a:xfrm>
                     <a:prstGeom prst="rect">
                       <a:avLst/>
@@ -288,12 +310,12 @@
       </w:pPr>
       <w:r>
         <w:rPr/>
-        <w:t>Event-to-Brevo workflow mapping (for now)</w:t>
+        <w:t>Event-to-Brevo workflow mapping</w:t>
       </w:r>
     </w:p>
     <w:tbl>
       <w:tblPr>
-        <w:tblW w:w="7668" w:type="dxa"/>
+        <w:tblW w:w="9888" w:type="dxa"/>
         <w:jc w:val="start"/>
         <w:tblInd w:w="0" w:type="dxa"/>
         <w:tblLayout w:type="fixed"/>
@@ -305,9 +327,9 @@
         </w:tblCellMar>
       </w:tblPr>
       <w:tblGrid>
-        <w:gridCol w:w="2361"/>
-        <w:gridCol w:w="3441"/>
-        <w:gridCol w:w="1866"/>
+        <w:gridCol w:w="2901"/>
+        <w:gridCol w:w="3291"/>
+        <w:gridCol w:w="3696"/>
       </w:tblGrid>
       <w:tr>
         <w:trPr>
@@ -315,7 +337,7 @@
         </w:trPr>
         <w:tc>
           <w:tcPr>
-            <w:tcW w:w="2361" w:type="dxa"/>
+            <w:tcW w:w="2901" w:type="dxa"/>
             <w:tcBorders/>
             <w:vAlign w:val="center"/>
           </w:tcPr>
@@ -337,7 +359,7 @@
         </w:tc>
         <w:tc>
           <w:tcPr>
-            <w:tcW w:w="3441" w:type="dxa"/>
+            <w:tcW w:w="3291" w:type="dxa"/>
             <w:tcBorders/>
             <w:vAlign w:val="center"/>
           </w:tcPr>
@@ -359,7 +381,7 @@
         </w:tc>
         <w:tc>
           <w:tcPr>
-            <w:tcW w:w="1866" w:type="dxa"/>
+            <w:tcW w:w="3696" w:type="dxa"/>
             <w:tcBorders/>
             <w:vAlign w:val="center"/>
           </w:tcPr>
@@ -375,7 +397,7 @@
             </w:pPr>
             <w:r>
               <w:rPr/>
-              <w:t>Brevo workflow</w:t>
+              <w:t>Execution</w:t>
             </w:r>
           </w:p>
         </w:tc>
@@ -384,7 +406,7 @@
         <w:trPr/>
         <w:tc>
           <w:tcPr>
-            <w:tcW w:w="2361" w:type="dxa"/>
+            <w:tcW w:w="2901" w:type="dxa"/>
             <w:tcBorders/>
             <w:vAlign w:val="center"/>
           </w:tcPr>
@@ -400,43 +422,62 @@
               <w:rPr>
                 <w:rStyle w:val="SourceText"/>
               </w:rPr>
-              <w:t>email.send.requested</w:t>
-            </w:r>
-          </w:p>
-        </w:tc>
-        <w:tc>
-          <w:tcPr>
-            <w:tcW w:w="3441" w:type="dxa"/>
-            <w:tcBorders/>
-            <w:vAlign w:val="center"/>
-          </w:tcPr>
-          <w:p>
-            <w:pPr>
-              <w:pStyle w:val="TableContents"/>
-              <w:bidi w:val="0"/>
-              <w:spacing w:before="80" w:after="140"/>
-              <w:jc w:val="start"/>
-              <w:rPr/>
-            </w:pPr>
-            <w:r>
-              <w:rPr/>
-              <w:t xml:space="preserve">User confirms a </w:t>
+              <w:t>chat.action.identified</w:t>
+            </w:r>
+          </w:p>
+        </w:tc>
+        <w:tc>
+          <w:tcPr>
+            <w:tcW w:w="3291" w:type="dxa"/>
+            <w:tcBorders/>
+            <w:vAlign w:val="center"/>
+          </w:tcPr>
+          <w:p>
+            <w:pPr>
+              <w:pStyle w:val="TableContents"/>
+              <w:bidi w:val="0"/>
+              <w:spacing w:before="80" w:after="140"/>
+              <w:jc w:val="start"/>
+              <w:rPr/>
+            </w:pPr>
+            <w:r>
+              <w:rPr/>
+              <w:t xml:space="preserve">An action is identified as </w:t>
             </w:r>
             <w:r>
               <w:rPr>
                 <w:rStyle w:val="SourceText"/>
               </w:rPr>
-              <w:t>send_email</w:t>
-            </w:r>
-            <w:r>
-              <w:rPr/>
-              <w:t xml:space="preserve"> action</w:t>
-            </w:r>
-          </w:p>
-        </w:tc>
-        <w:tc>
-          <w:tcPr>
-            <w:tcW w:w="1866" w:type="dxa"/>
+              <w:t>clear</w:t>
+            </w:r>
+          </w:p>
+        </w:tc>
+        <w:tc>
+          <w:tcPr>
+            <w:tcW w:w="3696" w:type="dxa"/>
+            <w:tcBorders/>
+            <w:vAlign w:val="center"/>
+          </w:tcPr>
+          <w:p>
+            <w:pPr>
+              <w:pStyle w:val="TableContents"/>
+              <w:bidi w:val="0"/>
+              <w:spacing w:before="80" w:after="140"/>
+              <w:jc w:val="start"/>
+              <w:rPr/>
+            </w:pPr>
+            <w:r>
+              <w:rPr/>
+              <w:t>None; identification only</w:t>
+            </w:r>
+          </w:p>
+        </w:tc>
+      </w:tr>
+      <w:tr>
+        <w:trPr/>
+        <w:tc>
+          <w:tcPr>
+            <w:tcW w:w="2901" w:type="dxa"/>
             <w:tcBorders/>
             <w:vAlign w:val="center"/>
           </w:tcPr>
@@ -452,7 +493,47 @@
               <w:rPr>
                 <w:rStyle w:val="SourceText"/>
               </w:rPr>
-              <w:t>send_email</w:t>
+              <w:t>workflow.action.requested</w:t>
+            </w:r>
+          </w:p>
+        </w:tc>
+        <w:tc>
+          <w:tcPr>
+            <w:tcW w:w="3291" w:type="dxa"/>
+            <w:tcBorders/>
+            <w:vAlign w:val="center"/>
+          </w:tcPr>
+          <w:p>
+            <w:pPr>
+              <w:pStyle w:val="TableContents"/>
+              <w:bidi w:val="0"/>
+              <w:spacing w:before="80" w:after="140"/>
+              <w:jc w:val="start"/>
+              <w:rPr/>
+            </w:pPr>
+            <w:r>
+              <w:rPr/>
+              <w:t>User confirms a complete action</w:t>
+            </w:r>
+          </w:p>
+        </w:tc>
+        <w:tc>
+          <w:tcPr>
+            <w:tcW w:w="3696" w:type="dxa"/>
+            <w:tcBorders/>
+            <w:vAlign w:val="center"/>
+          </w:tcPr>
+          <w:p>
+            <w:pPr>
+              <w:pStyle w:val="TableContents"/>
+              <w:bidi w:val="0"/>
+              <w:spacing w:before="80" w:after="140"/>
+              <w:jc w:val="start"/>
+              <w:rPr/>
+            </w:pPr>
+            <w:r>
+              <w:rPr/>
+              <w:t>Queued for the server root machine</w:t>
             </w:r>
           </w:p>
         </w:tc>
@@ -467,37 +548,7 @@
       </w:pPr>
       <w:r>
         <w:rPr/>
-        <w:t xml:space="preserve">The current implementation emits </w:t>
-      </w:r>
-      <w:r>
-        <w:rPr>
-          <w:rStyle w:val="SourceText"/>
-        </w:rPr>
-        <w:t>chat.action.identified</w:t>
-      </w:r>
-      <w:r>
-        <w:rPr/>
-        <w:t xml:space="preserve">. The </w:t>
-      </w:r>
-      <w:r>
-        <w:rPr>
-          <w:rStyle w:val="SourceText"/>
-        </w:rPr>
-        <w:t>email.send.requested</w:t>
-      </w:r>
-      <w:r>
-        <w:rPr/>
-        <w:t xml:space="preserve"> event is the planned execution event, emitted only after confirmation. </w:t>
-      </w:r>
-      <w:r>
-        <w:rPr>
-          <w:rStyle w:val="SourceText"/>
-        </w:rPr>
-        <w:t>email.schedule.requested</w:t>
-      </w:r>
-      <w:r>
-        <w:rPr/>
-        <w:t xml:space="preserve"> can be added later for </w:t>
+        <w:t xml:space="preserve">The raw identification event is not an execution command. Execution requires a confirmed, complete action. </w:t>
       </w:r>
       <w:r>
         <w:rPr>
@@ -507,7 +558,7 @@
       </w:r>
       <w:r>
         <w:rPr/>
-        <w:t>.</w:t>
+        <w:t xml:space="preserve"> events are accepted by the queue but fail in the placeholder actor.</w:t>
       </w:r>
     </w:p>
     <w:p>
@@ -534,7 +585,7 @@
         <w:rPr/>
         <w:drawing>
           <wp:inline distT="0" distB="0" distL="0" distR="0">
-            <wp:extent cx="4781550" cy="6191250"/>
+            <wp:extent cx="3048000" cy="5143500"/>
             <wp:effectExtent l="0" t="0" r="0" b="0"/>
             <wp:docPr id="2" name="Image2" descr="" title="Diagram 2"/>
             <wp:cNvGraphicFramePr>
@@ -558,7 +609,7 @@
                   <pic:spPr bwMode="auto">
                     <a:xfrm>
                       <a:off x="0" y="0"/>
-                      <a:ext cx="4781550" cy="6191250"/>
+                      <a:ext cx="3048000" cy="5143500"/>
                     </a:xfrm>
                     <a:prstGeom prst="rect">
                       <a:avLst/>
@@ -584,7 +635,7 @@
       </w:pPr>
       <w:r>
         <w:rPr/>
-        <w:t>3. Current implemented flow</w:t>
+        <w:t>3. Identification and clarification flow</w:t>
       </w:r>
     </w:p>
     <w:p>
@@ -596,7 +647,27 @@
       </w:pPr>
       <w:r>
         <w:rPr/>
-        <w:t>This is the flow that exists in the repository today.</w:t>
+        <w:t xml:space="preserve">Clear </w:t>
+      </w:r>
+      <w:r>
+        <w:rPr>
+          <w:rStyle w:val="SourceText"/>
+        </w:rPr>
+        <w:t>send_email</w:t>
+      </w:r>
+      <w:r>
+        <w:rPr/>
+        <w:t xml:space="preserve"> results continue into the client conversation machine in section 4. Clear </w:t>
+      </w:r>
+      <w:r>
+        <w:rPr>
+          <w:rStyle w:val="SourceText"/>
+        </w:rPr>
+        <w:t>schedule_email</w:t>
+      </w:r>
+      <w:r>
+        <w:rPr/>
+        <w:t xml:space="preserve"> results stop at the action card.</w:t>
       </w:r>
     </w:p>
     <w:p>
@@ -611,7 +682,7 @@
         <w:rPr/>
         <w:drawing>
           <wp:inline distT="0" distB="0" distL="0" distR="0">
-            <wp:extent cx="8677275" cy="6191250"/>
+            <wp:extent cx="7086600" cy="5143500"/>
             <wp:effectExtent l="0" t="0" r="0" b="0"/>
             <wp:docPr id="3" name="Image3" descr="" title="Diagram 3"/>
             <wp:cNvGraphicFramePr>
@@ -635,7 +706,7 @@
                   <pic:spPr bwMode="auto">
                     <a:xfrm>
                       <a:off x="0" y="0"/>
-                      <a:ext cx="8677275" cy="6191250"/>
+                      <a:ext cx="7086600" cy="5143500"/>
                     </a:xfrm>
                     <a:prstGeom prst="rect">
                       <a:avLst/>
@@ -661,7 +732,7 @@
       </w:pPr>
       <w:r>
         <w:rPr/>
-        <w:t>4. Planned send_email flow</w:t>
+        <w:t>4. send_email flow (implemented)</w:t>
       </w:r>
     </w:p>
     <w:p>
@@ -675,11 +746,11 @@
         <w:rPr>
           <w:rStyle w:val="SourceText"/>
         </w:rPr>
-        <w:t>send_email</w:t>
-      </w:r>
-      <w:r>
-        <w:rPr/>
-        <w:t xml:space="preserve"> is currently identified but not executed.</w:t>
+        <w:t>Chat.tsx</w:t>
+      </w:r>
+      <w:r>
+        <w:rPr/>
+        <w:t xml:space="preserve"> owns the client conversation state and the enqueue/poll effects. The server root machine owns execution after the confirmed event is queued.</w:t>
       </w:r>
     </w:p>
     <w:p>
@@ -694,7 +765,7 @@
         <w:rPr/>
         <w:drawing>
           <wp:inline distT="0" distB="0" distL="0" distR="0">
-            <wp:extent cx="9525000" cy="5895975"/>
+            <wp:extent cx="7534275" cy="5143500"/>
             <wp:effectExtent l="0" t="0" r="0" b="0"/>
             <wp:docPr id="4" name="Image4" descr="" title="Diagram 4"/>
             <wp:cNvGraphicFramePr>
@@ -718,7 +789,7 @@
                   <pic:spPr bwMode="auto">
                     <a:xfrm>
                       <a:off x="0" y="0"/>
-                      <a:ext cx="9525000" cy="5895975"/>
+                      <a:ext cx="7534275" cy="5143500"/>
                     </a:xfrm>
                     <a:prstGeom prst="rect">
                       <a:avLst/>
@@ -737,6 +808,38 @@
     </w:p>
     <w:p>
       <w:pPr>
+        <w:pStyle w:val="BodyText"/>
+        <w:bidi w:val="0"/>
+        <w:jc w:val="start"/>
+        <w:rPr/>
+      </w:pPr>
+      <w:r>
+        <w:rPr/>
+        <w:t xml:space="preserve">If the actor fails, the root machine records </w:t>
+      </w:r>
+      <w:r>
+        <w:rPr>
+          <w:rStyle w:val="SourceText"/>
+        </w:rPr>
+        <w:t>status: failed</w:t>
+      </w:r>
+      <w:r>
+        <w:rPr/>
+        <w:t xml:space="preserve"> and the error. Chat sends </w:t>
+      </w:r>
+      <w:r>
+        <w:rPr>
+          <w:rStyle w:val="SourceText"/>
+        </w:rPr>
+        <w:t>EXECUTION_FAILED</w:t>
+      </w:r>
+      <w:r>
+        <w:rPr/>
+        <w:t xml:space="preserve"> to the client machine.</w:t>
+      </w:r>
+    </w:p>
+    <w:p>
+      <w:pPr>
         <w:pStyle w:val="Heading2"/>
         <w:bidi w:val="0"/>
         <w:jc w:val="start"/>
@@ -744,7 +847,7 @@
       </w:pPr>
       <w:r>
         <w:rPr/>
-        <w:t>5. Planned schedule_email flow</w:t>
+        <w:t>5. Server root workflow machine (implemented)</w:t>
       </w:r>
     </w:p>
     <w:p>
@@ -755,14 +858,28 @@
         <w:rPr/>
       </w:pPr>
       <w:r>
+        <w:rPr/>
+        <w:t xml:space="preserve">The root machine lives in </w:t>
+      </w:r>
+      <w:r>
         <w:rPr>
           <w:rStyle w:val="SourceText"/>
         </w:rPr>
-        <w:t>schedule_email</w:t>
-      </w:r>
-      <w:r>
-        <w:rPr/>
-        <w:t xml:space="preserve"> is currently identified but not executed.</w:t>
+        <w:t>server/src/workflow/root-machine.ts</w:t>
+      </w:r>
+      <w:r>
+        <w:rPr/>
+        <w:t xml:space="preserve">. It is started only by </w:t>
+      </w:r>
+      <w:r>
+        <w:rPr>
+          <w:rStyle w:val="SourceText"/>
+        </w:rPr>
+        <w:t>server/src/workflow/runtime.ts</w:t>
+      </w:r>
+      <w:r>
+        <w:rPr/>
+        <w:t xml:space="preserve"> inside the Bun API process.</w:t>
       </w:r>
     </w:p>
     <w:p>
@@ -777,7 +894,7 @@
         <w:rPr/>
         <w:drawing>
           <wp:inline distT="0" distB="0" distL="0" distR="0">
-            <wp:extent cx="9525000" cy="5143500"/>
+            <wp:extent cx="9525000" cy="4943475"/>
             <wp:effectExtent l="0" t="0" r="0" b="0"/>
             <wp:docPr id="5" name="Image5" descr="" title="Diagram 5"/>
             <wp:cNvGraphicFramePr>
@@ -801,7 +918,7 @@
                   <pic:spPr bwMode="auto">
                     <a:xfrm>
                       <a:off x="0" y="0"/>
-                      <a:ext cx="9525000" cy="5143500"/>
+                      <a:ext cx="9525000" cy="4943475"/>
                     </a:xfrm>
                     <a:prstGeom prst="rect">
                       <a:avLst/>
@@ -820,6 +937,18 @@
     </w:p>
     <w:p>
       <w:pPr>
+        <w:pStyle w:val="BodyText"/>
+        <w:bidi w:val="0"/>
+        <w:jc w:val="start"/>
+        <w:rPr/>
+      </w:pPr>
+      <w:r>
+        <w:rPr/>
+        <w:t>The queue listener wakes the machine whenever a job is enqueued. The machine processes one job at a time and raises another wake-up after completion.</w:t>
+      </w:r>
+    </w:p>
+    <w:p>
+      <w:pPr>
         <w:pStyle w:val="Heading2"/>
         <w:bidi w:val="0"/>
         <w:jc w:val="start"/>
@@ -827,7 +956,7 @@
       </w:pPr>
       <w:r>
         <w:rPr/>
-        <w:t>6. Clarification and confirmation state machine</w:t>
+        <w:t>6. Client send-email conversation machine (implemented)</w:t>
       </w:r>
     </w:p>
     <w:p>
@@ -839,7 +968,37 @@
       </w:pPr>
       <w:r>
         <w:rPr/>
-        <w:t>Implemented states are solid. Planned states are dashed.</w:t>
+        <w:t xml:space="preserve">The client machine lives in </w:t>
+      </w:r>
+      <w:r>
+        <w:rPr>
+          <w:rStyle w:val="SourceText"/>
+        </w:rPr>
+        <w:t>workflow/src/core/create-email-workflow.ts</w:t>
+      </w:r>
+      <w:r>
+        <w:rPr/>
+        <w:t xml:space="preserve">. </w:t>
+      </w:r>
+      <w:r>
+        <w:rPr>
+          <w:rStyle w:val="SourceText"/>
+        </w:rPr>
+        <w:t>Chat.tsx</w:t>
+      </w:r>
+      <w:r>
+        <w:rPr/>
+        <w:t xml:space="preserve"> sends events into it and performs the enqueue/poll effects after </w:t>
+      </w:r>
+      <w:r>
+        <w:rPr>
+          <w:rStyle w:val="SourceText"/>
+        </w:rPr>
+        <w:t>CONFIRM</w:t>
+      </w:r>
+      <w:r>
+        <w:rPr/>
+        <w:t>.</w:t>
       </w:r>
     </w:p>
     <w:p>
@@ -854,7 +1013,7 @@
         <w:rPr/>
         <w:drawing>
           <wp:inline distT="0" distB="0" distL="0" distR="0">
-            <wp:extent cx="3819525" cy="6191250"/>
+            <wp:extent cx="5829300" cy="5143500"/>
             <wp:effectExtent l="0" t="0" r="0" b="0"/>
             <wp:docPr id="6" name="Image6" descr="" title="Diagram 6"/>
             <wp:cNvGraphicFramePr>
@@ -878,7 +1037,7 @@
                   <pic:spPr bwMode="auto">
                     <a:xfrm>
                       <a:off x="0" y="0"/>
-                      <a:ext cx="3819525" cy="6191250"/>
+                      <a:ext cx="5829300" cy="5143500"/>
                     </a:xfrm>
                     <a:prstGeom prst="rect">
                       <a:avLst/>
@@ -904,79 +1063,37 @@
       </w:pPr>
       <w:r>
         <w:rPr/>
-        <w:t xml:space="preserve">Current implementation stops at </w:t>
-      </w:r>
+        <w:t>The machine is pure and framework-free. The React layer calls the workflow API; the client machine does not perform I/O.</w:t>
+      </w:r>
+    </w:p>
+    <w:p>
+      <w:pPr>
+        <w:pStyle w:val="Heading2"/>
+        <w:bidi w:val="0"/>
+        <w:jc w:val="start"/>
+        <w:rPr/>
+      </w:pPr>
+      <w:r>
+        <w:rPr/>
+        <w:t>7. schedule_email placeholder flow</w:t>
+      </w:r>
+    </w:p>
+    <w:p>
+      <w:pPr>
+        <w:pStyle w:val="BodyText"/>
+        <w:bidi w:val="0"/>
+        <w:jc w:val="start"/>
+        <w:rPr/>
+      </w:pPr>
       <w:r>
         <w:rPr>
           <w:rStyle w:val="SourceText"/>
         </w:rPr>
-        <w:t>ActionCard</w:t>
-      </w:r>
-      <w:r>
-        <w:rPr/>
-        <w:t xml:space="preserve"> or </w:t>
-      </w:r>
-      <w:r>
-        <w:rPr>
-          <w:rStyle w:val="SourceText"/>
-        </w:rPr>
-        <w:t>Clarify</w:t>
-      </w:r>
-      <w:r>
-        <w:rPr/>
-        <w:t xml:space="preserve">. </w:t>
-      </w:r>
-      <w:r>
-        <w:rPr>
-          <w:rStyle w:val="SourceText"/>
-        </w:rPr>
-        <w:t>Collecting</w:t>
-      </w:r>
-      <w:r>
-        <w:rPr/>
-        <w:t xml:space="preserve">, </w:t>
-      </w:r>
-      <w:r>
-        <w:rPr>
-          <w:rStyle w:val="SourceText"/>
-        </w:rPr>
-        <w:t>Confirming</w:t>
-      </w:r>
-      <w:r>
-        <w:rPr/>
-        <w:t xml:space="preserve">, </w:t>
-      </w:r>
-      <w:r>
-        <w:rPr>
-          <w:rStyle w:val="SourceText"/>
-        </w:rPr>
-        <w:t>Executing</w:t>
-      </w:r>
-      <w:r>
-        <w:rPr/>
-        <w:t xml:space="preserve">, and </w:t>
-      </w:r>
-      <w:r>
-        <w:rPr>
-          <w:rStyle w:val="SourceText"/>
-        </w:rPr>
-        <w:t>Success</w:t>
-      </w:r>
-      <w:r>
-        <w:rPr/>
-        <w:t xml:space="preserve"> are planned.</w:t>
-      </w:r>
-    </w:p>
-    <w:p>
-      <w:pPr>
-        <w:pStyle w:val="Heading2"/>
-        <w:bidi w:val="0"/>
-        <w:jc w:val="start"/>
-        <w:rPr/>
-      </w:pPr>
-      <w:r>
-        <w:rPr/>
-        <w:t>7. Event pipeline</w:t>
+        <w:t>schedule_email</w:t>
+      </w:r>
+      <w:r>
+        <w:rPr/>
+        <w:t xml:space="preserve"> is identified by the catalog, but Chat does not collect or confirm it. The workflow API accepts a complete event for exercising the root machine, where the placeholder actor fails the job.</w:t>
       </w:r>
     </w:p>
     <w:p>
@@ -991,7 +1108,7 @@
         <w:rPr/>
         <w:drawing>
           <wp:inline distT="0" distB="0" distL="0" distR="0">
-            <wp:extent cx="2266950" cy="6191250"/>
+            <wp:extent cx="9525000" cy="3486150"/>
             <wp:effectExtent l="0" t="0" r="0" b="0"/>
             <wp:docPr id="7" name="Image7" descr="" title="Diagram 7"/>
             <wp:cNvGraphicFramePr>
@@ -1015,7 +1132,7 @@
                   <pic:spPr bwMode="auto">
                     <a:xfrm>
                       <a:off x="0" y="0"/>
-                      <a:ext cx="2266950" cy="6191250"/>
+                      <a:ext cx="9525000" cy="3486150"/>
                     </a:xfrm>
                     <a:prstGeom prst="rect">
                       <a:avLst/>
@@ -1034,6 +1151,18 @@
     </w:p>
     <w:p>
       <w:pPr>
+        <w:pStyle w:val="BodyText"/>
+        <w:bidi w:val="0"/>
+        <w:jc w:val="start"/>
+        <w:rPr/>
+      </w:pPr>
+      <w:r>
+        <w:rPr/>
+        <w:t>There is no schedule store, worker, or real scheduled delivery yet.</w:t>
+      </w:r>
+    </w:p>
+    <w:p>
+      <w:pPr>
         <w:pStyle w:val="Heading2"/>
         <w:bidi w:val="0"/>
         <w:jc w:val="start"/>
@@ -1041,7 +1170,7 @@
       </w:pPr>
       <w:r>
         <w:rPr/>
-        <w:t>8. Authentication and session flow</w:t>
+        <w:t>8. Event pipeline</w:t>
       </w:r>
     </w:p>
     <w:p>
@@ -1053,17 +1182,7 @@
       </w:pPr>
       <w:r>
         <w:rPr/>
-        <w:t xml:space="preserve">Authentication is client-only and stored in </w:t>
-      </w:r>
-      <w:r>
-        <w:rPr>
-          <w:rStyle w:val="SourceText"/>
-        </w:rPr>
-        <w:t>localStorage</w:t>
-      </w:r>
-      <w:r>
-        <w:rPr/>
-        <w:t>.</w:t>
+        <w:t>Identification events and execution events are separate.</w:t>
       </w:r>
     </w:p>
     <w:p>
@@ -1078,7 +1197,7 @@
         <w:rPr/>
         <w:drawing>
           <wp:inline distT="0" distB="0" distL="0" distR="0">
-            <wp:extent cx="9525000" cy="2971800"/>
+            <wp:extent cx="2114550" cy="5143500"/>
             <wp:effectExtent l="0" t="0" r="0" b="0"/>
             <wp:docPr id="8" name="Image8" descr="" title="Diagram 8"/>
             <wp:cNvGraphicFramePr>
@@ -1102,7 +1221,7 @@
                   <pic:spPr bwMode="auto">
                     <a:xfrm>
                       <a:off x="0" y="0"/>
-                      <a:ext cx="9525000" cy="2971800"/>
+                      <a:ext cx="2114550" cy="5143500"/>
                     </a:xfrm>
                     <a:prstGeom prst="rect">
                       <a:avLst/>
@@ -1121,6 +1240,18 @@
     </w:p>
     <w:p>
       <w:pPr>
+        <w:pStyle w:val="Heading2"/>
+        <w:bidi w:val="0"/>
+        <w:jc w:val="start"/>
+        <w:rPr/>
+      </w:pPr>
+      <w:r>
+        <w:rPr/>
+        <w:t>9. Authentication and session flow</w:t>
+      </w:r>
+    </w:p>
+    <w:p>
+      <w:pPr>
         <w:pStyle w:val="BodyText"/>
         <w:bidi w:val="0"/>
         <w:jc w:val="start"/>
@@ -1128,19 +1259,17 @@
       </w:pPr>
       <w:r>
         <w:rPr/>
-        <w:t>Security note: there is no server-side authentication, password hashing, or session validation. Anyone with browser access can read or modify the stored user data.</w:t>
-      </w:r>
-    </w:p>
-    <w:p>
-      <w:pPr>
-        <w:pStyle w:val="Heading2"/>
-        <w:bidi w:val="0"/>
-        <w:jc w:val="start"/>
-        <w:rPr/>
-      </w:pPr>
-      <w:r>
-        <w:rPr/>
-        <w:t>9. Runtime topology</w:t>
+        <w:t xml:space="preserve">Authentication is client-only and stored in </w:t>
+      </w:r>
+      <w:r>
+        <w:rPr>
+          <w:rStyle w:val="SourceText"/>
+        </w:rPr>
+        <w:t>localStorage</w:t>
+      </w:r>
+      <w:r>
+        <w:rPr/>
+        <w:t>.</w:t>
       </w:r>
     </w:p>
     <w:p>
@@ -1155,7 +1284,7 @@
         <w:rPr/>
         <w:drawing>
           <wp:inline distT="0" distB="0" distL="0" distR="0">
-            <wp:extent cx="4105275" cy="6191250"/>
+            <wp:extent cx="9525000" cy="3571875"/>
             <wp:effectExtent l="0" t="0" r="0" b="0"/>
             <wp:docPr id="9" name="Image9" descr="" title="Diagram 9"/>
             <wp:cNvGraphicFramePr>
@@ -1179,7 +1308,7 @@
                   <pic:spPr bwMode="auto">
                     <a:xfrm>
                       <a:off x="0" y="0"/>
-                      <a:ext cx="4105275" cy="6191250"/>
+                      <a:ext cx="9525000" cy="3571875"/>
                     </a:xfrm>
                     <a:prstGeom prst="rect">
                       <a:avLst/>
@@ -1198,6 +1327,18 @@
     </w:p>
     <w:p>
       <w:pPr>
+        <w:pStyle w:val="BodyText"/>
+        <w:bidi w:val="0"/>
+        <w:jc w:val="start"/>
+        <w:rPr/>
+      </w:pPr>
+      <w:r>
+        <w:rPr/>
+        <w:t>Security note: there is no server-side authentication, password hashing, or session validation. Anyone with browser access can read or modify the stored user data.</w:t>
+      </w:r>
+    </w:p>
+    <w:p>
+      <w:pPr>
         <w:pStyle w:val="Heading2"/>
         <w:bidi w:val="0"/>
         <w:jc w:val="start"/>
@@ -1205,12 +1346,77 @@
       </w:pPr>
       <w:r>
         <w:rPr/>
-        <w:t>10. Data stores</w:t>
+        <w:t>10. Runtime topology</w:t>
+      </w:r>
+    </w:p>
+    <w:p>
+      <w:pPr>
+        <w:pStyle w:val="BodyText"/>
+        <w:bidi w:val="0"/>
+        <w:ind w:hanging="0" w:start="0" w:end="0"/>
+        <w:jc w:val="center"/>
+        <w:rPr/>
+      </w:pPr>
+      <w:r>
+        <w:rPr/>
+        <w:drawing>
+          <wp:inline distT="0" distB="0" distL="0" distR="0">
+            <wp:extent cx="3829050" cy="5143500"/>
+            <wp:effectExtent l="0" t="0" r="0" b="0"/>
+            <wp:docPr id="10" name="Image10" descr="" title="Diagram 10"/>
+            <wp:cNvGraphicFramePr>
+              <a:graphicFrameLocks xmlns:a="http://schemas.openxmlformats.org/drawingml/2006/main" noChangeAspect="1"/>
+            </wp:cNvGraphicFramePr>
+            <a:graphic xmlns:a="http://schemas.openxmlformats.org/drawingml/2006/main">
+              <a:graphicData uri="http://schemas.openxmlformats.org/drawingml/2006/picture">
+                <pic:pic xmlns:pic="http://schemas.openxmlformats.org/drawingml/2006/picture">
+                  <pic:nvPicPr>
+                    <pic:cNvPr id="10" name="Image10" descr="" title="Diagram 10"/>
+                    <pic:cNvPicPr>
+                      <a:picLocks noChangeAspect="1" noChangeArrowheads="1"/>
+                    </pic:cNvPicPr>
+                  </pic:nvPicPr>
+                  <pic:blipFill>
+                    <a:blip r:embed="rId11"/>
+                    <a:stretch>
+                      <a:fillRect/>
+                    </a:stretch>
+                  </pic:blipFill>
+                  <pic:spPr bwMode="auto">
+                    <a:xfrm>
+                      <a:off x="0" y="0"/>
+                      <a:ext cx="3829050" cy="5143500"/>
+                    </a:xfrm>
+                    <a:prstGeom prst="rect">
+                      <a:avLst/>
+                    </a:prstGeom>
+                  </pic:spPr>
+                </pic:pic>
+              </a:graphicData>
+            </a:graphic>
+          </wp:inline>
+        </w:drawing>
+      </w:r>
+      <w:r>
+        <w:rPr/>
+        <w:t xml:space="preserve"> </w:t>
+      </w:r>
+    </w:p>
+    <w:p>
+      <w:pPr>
+        <w:pStyle w:val="Heading2"/>
+        <w:bidi w:val="0"/>
+        <w:jc w:val="start"/>
+        <w:rPr/>
+      </w:pPr>
+      <w:r>
+        <w:rPr/>
+        <w:t>11. Data stores</w:t>
       </w:r>
     </w:p>
     <w:tbl>
       <w:tblPr>
-        <w:tblW w:w="9759" w:type="dxa"/>
+        <w:tblW w:w="11339" w:type="dxa"/>
         <w:jc w:val="start"/>
         <w:tblInd w:w="0" w:type="dxa"/>
         <w:tblLayout w:type="fixed"/>
@@ -1222,10 +1428,10 @@
         </w:tblCellMar>
       </w:tblPr>
       <w:tblGrid>
-        <w:gridCol w:w="2556"/>
-        <w:gridCol w:w="2556"/>
-        <w:gridCol w:w="1806"/>
-        <w:gridCol w:w="2841"/>
+        <w:gridCol w:w="2129"/>
+        <w:gridCol w:w="3604"/>
+        <w:gridCol w:w="1702"/>
+        <w:gridCol w:w="3904"/>
       </w:tblGrid>
       <w:tr>
         <w:trPr>
@@ -1233,7 +1439,7 @@
         </w:trPr>
         <w:tc>
           <w:tcPr>
-            <w:tcW w:w="2556" w:type="dxa"/>
+            <w:tcW w:w="2129" w:type="dxa"/>
             <w:tcBorders/>
             <w:vAlign w:val="center"/>
           </w:tcPr>
@@ -1255,7 +1461,7 @@
         </w:tc>
         <w:tc>
           <w:tcPr>
-            <w:tcW w:w="2556" w:type="dxa"/>
+            <w:tcW w:w="3604" w:type="dxa"/>
             <w:tcBorders/>
             <w:vAlign w:val="center"/>
           </w:tcPr>
@@ -1277,7 +1483,7 @@
         </w:tc>
         <w:tc>
           <w:tcPr>
-            <w:tcW w:w="1806" w:type="dxa"/>
+            <w:tcW w:w="1702" w:type="dxa"/>
             <w:tcBorders/>
             <w:vAlign w:val="center"/>
           </w:tcPr>
@@ -1299,7 +1505,7 @@
         </w:tc>
         <w:tc>
           <w:tcPr>
-            <w:tcW w:w="2841" w:type="dxa"/>
+            <w:tcW w:w="3904" w:type="dxa"/>
             <w:tcBorders/>
             <w:vAlign w:val="center"/>
           </w:tcPr>
@@ -1324,7 +1530,7 @@
         <w:trPr/>
         <w:tc>
           <w:tcPr>
-            <w:tcW w:w="2556" w:type="dxa"/>
+            <w:tcW w:w="2129" w:type="dxa"/>
             <w:tcBorders/>
             <w:vAlign w:val="center"/>
           </w:tcPr>
@@ -1346,7 +1552,7 @@
         </w:tc>
         <w:tc>
           <w:tcPr>
-            <w:tcW w:w="2556" w:type="dxa"/>
+            <w:tcW w:w="3604" w:type="dxa"/>
             <w:tcBorders/>
             <w:vAlign w:val="center"/>
           </w:tcPr>
@@ -1372,7 +1578,7 @@
         </w:tc>
         <w:tc>
           <w:tcPr>
-            <w:tcW w:w="1806" w:type="dxa"/>
+            <w:tcW w:w="1702" w:type="dxa"/>
             <w:tcBorders/>
             <w:vAlign w:val="center"/>
           </w:tcPr>
@@ -1392,7 +1598,7 @@
         </w:tc>
         <w:tc>
           <w:tcPr>
-            <w:tcW w:w="2841" w:type="dxa"/>
+            <w:tcW w:w="3904" w:type="dxa"/>
             <w:tcBorders/>
             <w:vAlign w:val="center"/>
           </w:tcPr>
@@ -1415,7 +1621,7 @@
         <w:trPr/>
         <w:tc>
           <w:tcPr>
-            <w:tcW w:w="2556" w:type="dxa"/>
+            <w:tcW w:w="2129" w:type="dxa"/>
             <w:tcBorders/>
             <w:vAlign w:val="center"/>
           </w:tcPr>
@@ -1437,7 +1643,7 @@
         </w:tc>
         <w:tc>
           <w:tcPr>
-            <w:tcW w:w="2556" w:type="dxa"/>
+            <w:tcW w:w="3604" w:type="dxa"/>
             <w:tcBorders/>
             <w:vAlign w:val="center"/>
           </w:tcPr>
@@ -1463,7 +1669,7 @@
         </w:tc>
         <w:tc>
           <w:tcPr>
-            <w:tcW w:w="1806" w:type="dxa"/>
+            <w:tcW w:w="1702" w:type="dxa"/>
             <w:tcBorders/>
             <w:vAlign w:val="center"/>
           </w:tcPr>
@@ -1483,7 +1689,7 @@
         </w:tc>
         <w:tc>
           <w:tcPr>
-            <w:tcW w:w="2841" w:type="dxa"/>
+            <w:tcW w:w="3904" w:type="dxa"/>
             <w:tcBorders/>
             <w:vAlign w:val="center"/>
           </w:tcPr>
@@ -1506,7 +1712,7 @@
         <w:trPr/>
         <w:tc>
           <w:tcPr>
-            <w:tcW w:w="2556" w:type="dxa"/>
+            <w:tcW w:w="2129" w:type="dxa"/>
             <w:tcBorders/>
             <w:vAlign w:val="center"/>
           </w:tcPr>
@@ -1528,7 +1734,7 @@
         </w:tc>
         <w:tc>
           <w:tcPr>
-            <w:tcW w:w="2556" w:type="dxa"/>
+            <w:tcW w:w="3604" w:type="dxa"/>
             <w:tcBorders/>
             <w:vAlign w:val="center"/>
           </w:tcPr>
@@ -1554,7 +1760,7 @@
         </w:tc>
         <w:tc>
           <w:tcPr>
-            <w:tcW w:w="1806" w:type="dxa"/>
+            <w:tcW w:w="1702" w:type="dxa"/>
             <w:tcBorders/>
             <w:vAlign w:val="center"/>
           </w:tcPr>
@@ -1574,7 +1780,7 @@
         </w:tc>
         <w:tc>
           <w:tcPr>
-            <w:tcW w:w="2841" w:type="dxa"/>
+            <w:tcW w:w="3904" w:type="dxa"/>
             <w:tcBorders/>
             <w:vAlign w:val="center"/>
           </w:tcPr>
@@ -1597,7 +1803,7 @@
         <w:trPr/>
         <w:tc>
           <w:tcPr>
-            <w:tcW w:w="2556" w:type="dxa"/>
+            <w:tcW w:w="2129" w:type="dxa"/>
             <w:tcBorders/>
             <w:vAlign w:val="center"/>
           </w:tcPr>
@@ -1617,7 +1823,7 @@
         </w:tc>
         <w:tc>
           <w:tcPr>
-            <w:tcW w:w="2556" w:type="dxa"/>
+            <w:tcW w:w="3604" w:type="dxa"/>
             <w:tcBorders/>
             <w:vAlign w:val="center"/>
           </w:tcPr>
@@ -1635,11 +1841,15 @@
               </w:rPr>
               <w:t>InMemoryEventSink</w:t>
             </w:r>
-          </w:p>
-        </w:tc>
-        <w:tc>
-          <w:tcPr>
-            <w:tcW w:w="1806" w:type="dxa"/>
+            <w:r>
+              <w:rPr/>
+              <w:t xml:space="preserve"> in the Bun process</w:t>
+            </w:r>
+          </w:p>
+        </w:tc>
+        <w:tc>
+          <w:tcPr>
+            <w:tcW w:w="1702" w:type="dxa"/>
             <w:tcBorders/>
             <w:vAlign w:val="center"/>
           </w:tcPr>
@@ -1659,7 +1869,7 @@
         </w:tc>
         <w:tc>
           <w:tcPr>
-            <w:tcW w:w="2841" w:type="dxa"/>
+            <w:tcW w:w="3904" w:type="dxa"/>
             <w:tcBorders/>
             <w:vAlign w:val="center"/>
           </w:tcPr>
@@ -1682,7 +1892,7 @@
         <w:trPr/>
         <w:tc>
           <w:tcPr>
-            <w:tcW w:w="2556" w:type="dxa"/>
+            <w:tcW w:w="2129" w:type="dxa"/>
             <w:tcBorders/>
             <w:vAlign w:val="center"/>
           </w:tcPr>
@@ -1702,27 +1912,27 @@
         </w:tc>
         <w:tc>
           <w:tcPr>
-            <w:tcW w:w="2556" w:type="dxa"/>
-            <w:tcBorders/>
-            <w:vAlign w:val="center"/>
-          </w:tcPr>
-          <w:p>
-            <w:pPr>
-              <w:pStyle w:val="TableContents"/>
-              <w:bidi w:val="0"/>
-              <w:spacing w:before="80" w:after="140"/>
-              <w:jc w:val="start"/>
-              <w:rPr/>
-            </w:pPr>
-            <w:r>
-              <w:rPr/>
-              <w:t>Browser memory</w:t>
-            </w:r>
-          </w:p>
-        </w:tc>
-        <w:tc>
-          <w:tcPr>
-            <w:tcW w:w="1806" w:type="dxa"/>
+            <w:tcW w:w="3604" w:type="dxa"/>
+            <w:tcBorders/>
+            <w:vAlign w:val="center"/>
+          </w:tcPr>
+          <w:p>
+            <w:pPr>
+              <w:pStyle w:val="TableContents"/>
+              <w:bidi w:val="0"/>
+              <w:spacing w:before="80" w:after="140"/>
+              <w:jc w:val="start"/>
+              <w:rPr/>
+            </w:pPr>
+            <w:r>
+              <w:rPr/>
+              <w:t>Browser memory (client XState)</w:t>
+            </w:r>
+          </w:p>
+        </w:tc>
+        <w:tc>
+          <w:tcPr>
+            <w:tcW w:w="1702" w:type="dxa"/>
             <w:tcBorders/>
             <w:vAlign w:val="center"/>
           </w:tcPr>
@@ -1742,21 +1952,31 @@
         </w:tc>
         <w:tc>
           <w:tcPr>
-            <w:tcW w:w="2841" w:type="dxa"/>
-            <w:tcBorders/>
-            <w:vAlign w:val="center"/>
-          </w:tcPr>
-          <w:p>
-            <w:pPr>
-              <w:pStyle w:val="TableContents"/>
-              <w:bidi w:val="0"/>
-              <w:spacing w:before="80" w:after="140"/>
-              <w:jc w:val="start"/>
-              <w:rPr/>
-            </w:pPr>
-            <w:r>
-              <w:rPr/>
-              <w:t>Planned state machine</w:t>
+            <w:tcW w:w="3904" w:type="dxa"/>
+            <w:tcBorders/>
+            <w:vAlign w:val="center"/>
+          </w:tcPr>
+          <w:p>
+            <w:pPr>
+              <w:pStyle w:val="TableContents"/>
+              <w:bidi w:val="0"/>
+              <w:spacing w:before="80" w:after="140"/>
+              <w:jc w:val="start"/>
+              <w:rPr/>
+            </w:pPr>
+            <w:r>
+              <w:rPr/>
+              <w:t xml:space="preserve">Implemented </w:t>
+            </w:r>
+            <w:r>
+              <w:rPr>
+                <w:rStyle w:val="SourceText"/>
+              </w:rPr>
+              <w:t>send_email</w:t>
+            </w:r>
+            <w:r>
+              <w:rPr/>
+              <w:t xml:space="preserve"> conversation</w:t>
             </w:r>
           </w:p>
         </w:tc>
@@ -1765,7 +1985,96 @@
         <w:trPr/>
         <w:tc>
           <w:tcPr>
-            <w:tcW w:w="2556" w:type="dxa"/>
+            <w:tcW w:w="2129" w:type="dxa"/>
+            <w:tcBorders/>
+            <w:vAlign w:val="center"/>
+          </w:tcPr>
+          <w:p>
+            <w:pPr>
+              <w:pStyle w:val="TableContents"/>
+              <w:bidi w:val="0"/>
+              <w:spacing w:before="80" w:after="140"/>
+              <w:jc w:val="start"/>
+              <w:rPr/>
+            </w:pPr>
+            <w:r>
+              <w:rPr/>
+              <w:t>Workflow jobs</w:t>
+            </w:r>
+          </w:p>
+        </w:tc>
+        <w:tc>
+          <w:tcPr>
+            <w:tcW w:w="3604" w:type="dxa"/>
+            <w:tcBorders/>
+            <w:vAlign w:val="center"/>
+          </w:tcPr>
+          <w:p>
+            <w:pPr>
+              <w:pStyle w:val="TableContents"/>
+              <w:bidi w:val="0"/>
+              <w:spacing w:before="80" w:after="140"/>
+              <w:jc w:val="start"/>
+              <w:rPr/>
+            </w:pPr>
+            <w:r>
+              <w:rPr>
+                <w:rStyle w:val="SourceText"/>
+              </w:rPr>
+              <w:t>InMemoryWorkflowQueue</w:t>
+            </w:r>
+            <w:r>
+              <w:rPr/>
+              <w:t xml:space="preserve"> in the Bun process</w:t>
+            </w:r>
+          </w:p>
+        </w:tc>
+        <w:tc>
+          <w:tcPr>
+            <w:tcW w:w="1702" w:type="dxa"/>
+            <w:tcBorders/>
+            <w:vAlign w:val="center"/>
+          </w:tcPr>
+          <w:p>
+            <w:pPr>
+              <w:pStyle w:val="TableContents"/>
+              <w:bidi w:val="0"/>
+              <w:spacing w:before="80" w:after="140"/>
+              <w:jc w:val="start"/>
+              <w:rPr/>
+            </w:pPr>
+            <w:r>
+              <w:rPr/>
+              <w:t>Process memory</w:t>
+            </w:r>
+          </w:p>
+        </w:tc>
+        <w:tc>
+          <w:tcPr>
+            <w:tcW w:w="3904" w:type="dxa"/>
+            <w:tcBorders/>
+            <w:vAlign w:val="center"/>
+          </w:tcPr>
+          <w:p>
+            <w:pPr>
+              <w:pStyle w:val="TableContents"/>
+              <w:bidi w:val="0"/>
+              <w:spacing w:before="80" w:after="140"/>
+              <w:jc w:val="start"/>
+              <w:rPr/>
+            </w:pPr>
+            <w:r>
+              <w:rPr/>
+              <w:t>Queue, status, result, errors</w:t>
+            </w:r>
+          </w:p>
+        </w:tc>
+      </w:tr>
+      <w:tr>
+        <w:trPr/>
+        <w:tc>
+          <w:tcPr>
+            <w:tcW w:w="2129" w:type="dxa"/>
             <w:tcBorders/>
             <w:vAlign w:val="center"/>
           </w:tcPr>
@@ -1785,7 +2094,7 @@
         </w:tc>
         <w:tc>
           <w:tcPr>
-            <w:tcW w:w="2556" w:type="dxa"/>
+            <w:tcW w:w="3604" w:type="dxa"/>
             <w:tcBorders/>
             <w:vAlign w:val="center"/>
           </w:tcPr>
@@ -1805,7 +2114,7 @@
         </w:tc>
         <w:tc>
           <w:tcPr>
-            <w:tcW w:w="1806" w:type="dxa"/>
+            <w:tcW w:w="1702" w:type="dxa"/>
             <w:tcBorders/>
             <w:vAlign w:val="center"/>
           </w:tcPr>
@@ -1825,21 +2134,21 @@
         </w:tc>
         <w:tc>
           <w:tcPr>
-            <w:tcW w:w="2841" w:type="dxa"/>
-            <w:tcBorders/>
-            <w:vAlign w:val="center"/>
-          </w:tcPr>
-          <w:p>
-            <w:pPr>
-              <w:pStyle w:val="TableContents"/>
-              <w:bidi w:val="0"/>
-              <w:spacing w:before="80" w:after="140"/>
-              <w:jc w:val="start"/>
-              <w:rPr/>
-            </w:pPr>
-            <w:r>
-              <w:rPr/>
-              <w:t>Planned</w:t>
+            <w:tcW w:w="3904" w:type="dxa"/>
+            <w:tcBorders/>
+            <w:vAlign w:val="center"/>
+          </w:tcPr>
+          <w:p>
+            <w:pPr>
+              <w:pStyle w:val="TableContents"/>
+              <w:bidi w:val="0"/>
+              <w:spacing w:before="80" w:after="140"/>
+              <w:jc w:val="start"/>
+              <w:rPr/>
+            </w:pPr>
+            <w:r>
+              <w:rPr/>
+              <w:t>Brevo message ID is returned but not stored</w:t>
             </w:r>
           </w:p>
         </w:tc>
@@ -1848,7 +2157,7 @@
         <w:trPr/>
         <w:tc>
           <w:tcPr>
-            <w:tcW w:w="2556" w:type="dxa"/>
+            <w:tcW w:w="2129" w:type="dxa"/>
             <w:tcBorders/>
             <w:vAlign w:val="center"/>
           </w:tcPr>
@@ -1868,7 +2177,7 @@
         </w:tc>
         <w:tc>
           <w:tcPr>
-            <w:tcW w:w="2556" w:type="dxa"/>
+            <w:tcW w:w="3604" w:type="dxa"/>
             <w:tcBorders/>
             <w:vAlign w:val="center"/>
           </w:tcPr>
@@ -1888,7 +2197,7 @@
         </w:tc>
         <w:tc>
           <w:tcPr>
-            <w:tcW w:w="1806" w:type="dxa"/>
+            <w:tcW w:w="1702" w:type="dxa"/>
             <w:tcBorders/>
             <w:vAlign w:val="center"/>
           </w:tcPr>
@@ -1908,21 +2217,21 @@
         </w:tc>
         <w:tc>
           <w:tcPr>
-            <w:tcW w:w="2841" w:type="dxa"/>
-            <w:tcBorders/>
-            <w:vAlign w:val="center"/>
-          </w:tcPr>
-          <w:p>
-            <w:pPr>
-              <w:pStyle w:val="TableContents"/>
-              <w:bidi w:val="0"/>
-              <w:spacing w:before="80" w:after="140"/>
-              <w:jc w:val="start"/>
-              <w:rPr/>
-            </w:pPr>
-            <w:r>
-              <w:rPr/>
-              <w:t>Future extension</w:t>
+            <w:tcW w:w="3904" w:type="dxa"/>
+            <w:tcBorders/>
+            <w:vAlign w:val="center"/>
+          </w:tcPr>
+          <w:p>
+            <w:pPr>
+              <w:pStyle w:val="TableContents"/>
+              <w:bidi w:val="0"/>
+              <w:spacing w:before="80" w:after="140"/>
+              <w:jc w:val="start"/>
+              <w:rPr/>
+            </w:pPr>
+            <w:r>
+              <w:rPr/>
+              <w:t>Future extension; Brevo has no public sequence API</w:t>
             </w:r>
           </w:p>
         </w:tc>
@@ -1937,12 +2246,12 @@
       </w:pPr>
       <w:r>
         <w:rPr/>
-        <w:t>11. Implementation status</w:t>
+        <w:t>12. Implementation status</w:t>
       </w:r>
     </w:p>
     <w:tbl>
       <w:tblPr>
-        <w:tblW w:w="5802" w:type="dxa"/>
+        <w:tblW w:w="8217" w:type="dxa"/>
         <w:jc w:val="start"/>
         <w:tblInd w:w="0" w:type="dxa"/>
         <w:tblLayout w:type="fixed"/>
@@ -1954,8 +2263,8 @@
         </w:tblCellMar>
       </w:tblPr>
       <w:tblGrid>
-        <w:gridCol w:w="3846"/>
-        <w:gridCol w:w="1956"/>
+        <w:gridCol w:w="4611"/>
+        <w:gridCol w:w="3606"/>
       </w:tblGrid>
       <w:tr>
         <w:trPr>
@@ -1963,7 +2272,7 @@
         </w:trPr>
         <w:tc>
           <w:tcPr>
-            <w:tcW w:w="3846" w:type="dxa"/>
+            <w:tcW w:w="4611" w:type="dxa"/>
             <w:tcBorders/>
             <w:vAlign w:val="center"/>
           </w:tcPr>
@@ -1985,7 +2294,7 @@
         </w:tc>
         <w:tc>
           <w:tcPr>
-            <w:tcW w:w="1956" w:type="dxa"/>
+            <w:tcW w:w="3606" w:type="dxa"/>
             <w:tcBorders/>
             <w:vAlign w:val="center"/>
           </w:tcPr>
@@ -2010,7 +2319,7 @@
         <w:trPr/>
         <w:tc>
           <w:tcPr>
-            <w:tcW w:w="3846" w:type="dxa"/>
+            <w:tcW w:w="4611" w:type="dxa"/>
             <w:tcBorders/>
             <w:vAlign w:val="center"/>
           </w:tcPr>
@@ -2030,7 +2339,7 @@
         </w:tc>
         <w:tc>
           <w:tcPr>
-            <w:tcW w:w="1956" w:type="dxa"/>
+            <w:tcW w:w="3606" w:type="dxa"/>
             <w:tcBorders/>
             <w:vAlign w:val="center"/>
           </w:tcPr>
@@ -2053,7 +2362,7 @@
         <w:trPr/>
         <w:tc>
           <w:tcPr>
-            <w:tcW w:w="3846" w:type="dxa"/>
+            <w:tcW w:w="4611" w:type="dxa"/>
             <w:tcBorders/>
             <w:vAlign w:val="center"/>
           </w:tcPr>
@@ -2073,7 +2382,7 @@
         </w:tc>
         <w:tc>
           <w:tcPr>
-            <w:tcW w:w="1956" w:type="dxa"/>
+            <w:tcW w:w="3606" w:type="dxa"/>
             <w:tcBorders/>
             <w:vAlign w:val="center"/>
           </w:tcPr>
@@ -2096,7 +2405,103 @@
         <w:trPr/>
         <w:tc>
           <w:tcPr>
-            <w:tcW w:w="3846" w:type="dxa"/>
+            <w:tcW w:w="4611" w:type="dxa"/>
+            <w:tcBorders/>
+            <w:vAlign w:val="center"/>
+          </w:tcPr>
+          <w:p>
+            <w:pPr>
+              <w:pStyle w:val="TableContents"/>
+              <w:bidi w:val="0"/>
+              <w:spacing w:before="80" w:after="140"/>
+              <w:jc w:val="start"/>
+              <w:rPr/>
+            </w:pPr>
+            <w:r>
+              <w:rPr/>
+              <w:t>Bun HTTP server and route table</w:t>
+            </w:r>
+          </w:p>
+        </w:tc>
+        <w:tc>
+          <w:tcPr>
+            <w:tcW w:w="3606" w:type="dxa"/>
+            <w:tcBorders/>
+            <w:vAlign w:val="center"/>
+          </w:tcPr>
+          <w:p>
+            <w:pPr>
+              <w:pStyle w:val="TableContents"/>
+              <w:bidi w:val="0"/>
+              <w:spacing w:before="80" w:after="140"/>
+              <w:jc w:val="start"/>
+              <w:rPr/>
+            </w:pPr>
+            <w:r>
+              <w:rPr/>
+              <w:t>Implemented</w:t>
+            </w:r>
+          </w:p>
+        </w:tc>
+      </w:tr>
+      <w:tr>
+        <w:trPr/>
+        <w:tc>
+          <w:tcPr>
+            <w:tcW w:w="4611" w:type="dxa"/>
+            <w:tcBorders/>
+            <w:vAlign w:val="center"/>
+          </w:tcPr>
+          <w:p>
+            <w:pPr>
+              <w:pStyle w:val="TableContents"/>
+              <w:bidi w:val="0"/>
+              <w:spacing w:before="80" w:after="140"/>
+              <w:jc w:val="start"/>
+              <w:rPr/>
+            </w:pPr>
+            <w:r>
+              <w:rPr/>
+              <w:t xml:space="preserve">Vite </w:t>
+            </w:r>
+            <w:r>
+              <w:rPr>
+                <w:rStyle w:val="SourceText"/>
+              </w:rPr>
+              <w:t>/api</w:t>
+            </w:r>
+            <w:r>
+              <w:rPr/>
+              <w:t xml:space="preserve"> development proxy</w:t>
+            </w:r>
+          </w:p>
+        </w:tc>
+        <w:tc>
+          <w:tcPr>
+            <w:tcW w:w="3606" w:type="dxa"/>
+            <w:tcBorders/>
+            <w:vAlign w:val="center"/>
+          </w:tcPr>
+          <w:p>
+            <w:pPr>
+              <w:pStyle w:val="TableContents"/>
+              <w:bidi w:val="0"/>
+              <w:spacing w:before="80" w:after="140"/>
+              <w:jc w:val="start"/>
+              <w:rPr/>
+            </w:pPr>
+            <w:r>
+              <w:rPr/>
+              <w:t>Implemented</w:t>
+            </w:r>
+          </w:p>
+        </w:tc>
+      </w:tr>
+      <w:tr>
+        <w:trPr/>
+        <w:tc>
+          <w:tcPr>
+            <w:tcW w:w="4611" w:type="dxa"/>
             <w:tcBorders/>
             <w:vAlign w:val="center"/>
           </w:tcPr>
@@ -2118,21 +2523,21 @@
         </w:tc>
         <w:tc>
           <w:tcPr>
-            <w:tcW w:w="1956" w:type="dxa"/>
-            <w:tcBorders/>
-            <w:vAlign w:val="center"/>
-          </w:tcPr>
-          <w:p>
-            <w:pPr>
-              <w:pStyle w:val="TableContents"/>
-              <w:bidi w:val="0"/>
-              <w:spacing w:before="80" w:after="140"/>
-              <w:jc w:val="start"/>
-              <w:rPr/>
-            </w:pPr>
-            <w:r>
-              <w:rPr/>
-              <w:t>Implemented</w:t>
+            <w:tcW w:w="3606" w:type="dxa"/>
+            <w:tcBorders/>
+            <w:vAlign w:val="center"/>
+          </w:tcPr>
+          <w:p>
+            <w:pPr>
+              <w:pStyle w:val="TableContents"/>
+              <w:bidi w:val="0"/>
+              <w:spacing w:before="80" w:after="140"/>
+              <w:jc w:val="start"/>
+              <w:rPr/>
+            </w:pPr>
+            <w:r>
+              <w:rPr/>
+              <w:t>Implemented (Bun API)</w:t>
             </w:r>
           </w:p>
         </w:tc>
@@ -2141,7 +2546,7 @@
         <w:trPr/>
         <w:tc>
           <w:tcPr>
-            <w:tcW w:w="3846" w:type="dxa"/>
+            <w:tcW w:w="4611" w:type="dxa"/>
             <w:tcBorders/>
             <w:vAlign w:val="center"/>
           </w:tcPr>
@@ -2167,7 +2572,7 @@
         </w:tc>
         <w:tc>
           <w:tcPr>
-            <w:tcW w:w="1956" w:type="dxa"/>
+            <w:tcW w:w="3606" w:type="dxa"/>
             <w:tcBorders/>
             <w:vAlign w:val="center"/>
           </w:tcPr>
@@ -2190,7 +2595,7 @@
         <w:trPr/>
         <w:tc>
           <w:tcPr>
-            <w:tcW w:w="3846" w:type="dxa"/>
+            <w:tcW w:w="4611" w:type="dxa"/>
             <w:tcBorders/>
             <w:vAlign w:val="center"/>
           </w:tcPr>
@@ -2216,7 +2621,7 @@
         </w:tc>
         <w:tc>
           <w:tcPr>
-            <w:tcW w:w="1956" w:type="dxa"/>
+            <w:tcW w:w="3606" w:type="dxa"/>
             <w:tcBorders/>
             <w:vAlign w:val="center"/>
           </w:tcPr>
@@ -2239,7 +2644,7 @@
         <w:trPr/>
         <w:tc>
           <w:tcPr>
-            <w:tcW w:w="3846" w:type="dxa"/>
+            <w:tcW w:w="4611" w:type="dxa"/>
             <w:tcBorders/>
             <w:vAlign w:val="center"/>
           </w:tcPr>
@@ -2259,7 +2664,7 @@
         </w:tc>
         <w:tc>
           <w:tcPr>
-            <w:tcW w:w="1956" w:type="dxa"/>
+            <w:tcW w:w="3606" w:type="dxa"/>
             <w:tcBorders/>
             <w:vAlign w:val="center"/>
           </w:tcPr>
@@ -2282,7 +2687,7 @@
         <w:trPr/>
         <w:tc>
           <w:tcPr>
-            <w:tcW w:w="3846" w:type="dxa"/>
+            <w:tcW w:w="4611" w:type="dxa"/>
             <w:tcBorders/>
             <w:vAlign w:val="center"/>
           </w:tcPr>
@@ -2302,7 +2707,7 @@
         </w:tc>
         <w:tc>
           <w:tcPr>
-            <w:tcW w:w="1956" w:type="dxa"/>
+            <w:tcW w:w="3606" w:type="dxa"/>
             <w:tcBorders/>
             <w:vAlign w:val="center"/>
           </w:tcPr>
@@ -2325,7 +2730,7 @@
         <w:trPr/>
         <w:tc>
           <w:tcPr>
-            <w:tcW w:w="3846" w:type="dxa"/>
+            <w:tcW w:w="4611" w:type="dxa"/>
             <w:tcBorders/>
             <w:vAlign w:val="center"/>
           </w:tcPr>
@@ -2345,7 +2750,7 @@
         </w:tc>
         <w:tc>
           <w:tcPr>
-            <w:tcW w:w="1956" w:type="dxa"/>
+            <w:tcW w:w="3606" w:type="dxa"/>
             <w:tcBorders/>
             <w:vAlign w:val="center"/>
           </w:tcPr>
@@ -2368,7 +2773,7 @@
         <w:trPr/>
         <w:tc>
           <w:tcPr>
-            <w:tcW w:w="3846" w:type="dxa"/>
+            <w:tcW w:w="4611" w:type="dxa"/>
             <w:tcBorders/>
             <w:vAlign w:val="center"/>
           </w:tcPr>
@@ -2388,7 +2793,7 @@
         </w:tc>
         <w:tc>
           <w:tcPr>
-            <w:tcW w:w="1956" w:type="dxa"/>
+            <w:tcW w:w="3606" w:type="dxa"/>
             <w:tcBorders/>
             <w:vAlign w:val="center"/>
           </w:tcPr>
@@ -2411,7 +2816,7 @@
         <w:trPr/>
         <w:tc>
           <w:tcPr>
-            <w:tcW w:w="3846" w:type="dxa"/>
+            <w:tcW w:w="4611" w:type="dxa"/>
             <w:tcBorders/>
             <w:vAlign w:val="center"/>
           </w:tcPr>
@@ -2431,7 +2836,7 @@
         </w:tc>
         <w:tc>
           <w:tcPr>
-            <w:tcW w:w="1956" w:type="dxa"/>
+            <w:tcW w:w="3606" w:type="dxa"/>
             <w:tcBorders/>
             <w:vAlign w:val="center"/>
           </w:tcPr>
@@ -2454,7 +2859,7 @@
         <w:trPr/>
         <w:tc>
           <w:tcPr>
-            <w:tcW w:w="3846" w:type="dxa"/>
+            <w:tcW w:w="4611" w:type="dxa"/>
             <w:tcBorders/>
             <w:vAlign w:val="center"/>
           </w:tcPr>
@@ -2474,7 +2879,7 @@
         </w:tc>
         <w:tc>
           <w:tcPr>
-            <w:tcW w:w="1956" w:type="dxa"/>
+            <w:tcW w:w="3606" w:type="dxa"/>
             <w:tcBorders/>
             <w:vAlign w:val="center"/>
           </w:tcPr>
@@ -2497,7 +2902,7 @@
         <w:trPr/>
         <w:tc>
           <w:tcPr>
-            <w:tcW w:w="3846" w:type="dxa"/>
+            <w:tcW w:w="4611" w:type="dxa"/>
             <w:tcBorders/>
             <w:vAlign w:val="center"/>
           </w:tcPr>
@@ -2517,7 +2922,7 @@
         </w:tc>
         <w:tc>
           <w:tcPr>
-            <w:tcW w:w="1956" w:type="dxa"/>
+            <w:tcW w:w="3606" w:type="dxa"/>
             <w:tcBorders/>
             <w:vAlign w:val="center"/>
           </w:tcPr>
@@ -2540,7 +2945,60 @@
         <w:trPr/>
         <w:tc>
           <w:tcPr>
-            <w:tcW w:w="3846" w:type="dxa"/>
+            <w:tcW w:w="4611" w:type="dxa"/>
+            <w:tcBorders/>
+            <w:vAlign w:val="center"/>
+          </w:tcPr>
+          <w:p>
+            <w:pPr>
+              <w:pStyle w:val="TableContents"/>
+              <w:bidi w:val="0"/>
+              <w:spacing w:before="80" w:after="140"/>
+              <w:jc w:val="start"/>
+              <w:rPr/>
+            </w:pPr>
+            <w:r>
+              <w:rPr/>
+              <w:t xml:space="preserve">Client XState </w:t>
+            </w:r>
+            <w:r>
+              <w:rPr>
+                <w:rStyle w:val="SourceText"/>
+              </w:rPr>
+              <w:t>send_email</w:t>
+            </w:r>
+            <w:r>
+              <w:rPr/>
+              <w:t xml:space="preserve"> conversation</w:t>
+            </w:r>
+          </w:p>
+        </w:tc>
+        <w:tc>
+          <w:tcPr>
+            <w:tcW w:w="3606" w:type="dxa"/>
+            <w:tcBorders/>
+            <w:vAlign w:val="center"/>
+          </w:tcPr>
+          <w:p>
+            <w:pPr>
+              <w:pStyle w:val="TableContents"/>
+              <w:bidi w:val="0"/>
+              <w:spacing w:before="80" w:after="140"/>
+              <w:jc w:val="start"/>
+              <w:rPr/>
+            </w:pPr>
+            <w:r>
+              <w:rPr/>
+              <w:t>Implemented</w:t>
+            </w:r>
+          </w:p>
+        </w:tc>
+      </w:tr>
+      <w:tr>
+        <w:trPr/>
+        <w:tc>
+          <w:tcPr>
+            <w:tcW w:w="4611" w:type="dxa"/>
             <w:tcBorders/>
             <w:vAlign w:val="center"/>
           </w:tcPr>
@@ -2560,7 +3018,561 @@
         </w:tc>
         <w:tc>
           <w:tcPr>
-            <w:tcW w:w="1956" w:type="dxa"/>
+            <w:tcW w:w="3606" w:type="dxa"/>
+            <w:tcBorders/>
+            <w:vAlign w:val="center"/>
+          </w:tcPr>
+          <w:p>
+            <w:pPr>
+              <w:pStyle w:val="TableContents"/>
+              <w:bidi w:val="0"/>
+              <w:spacing w:before="80" w:after="140"/>
+              <w:jc w:val="start"/>
+              <w:rPr/>
+            </w:pPr>
+            <w:r>
+              <w:rPr/>
+              <w:t>Implemented in the client machine</w:t>
+            </w:r>
+          </w:p>
+        </w:tc>
+      </w:tr>
+      <w:tr>
+        <w:trPr/>
+        <w:tc>
+          <w:tcPr>
+            <w:tcW w:w="4611" w:type="dxa"/>
+            <w:tcBorders/>
+            <w:vAlign w:val="center"/>
+          </w:tcPr>
+          <w:p>
+            <w:pPr>
+              <w:pStyle w:val="TableContents"/>
+              <w:bidi w:val="0"/>
+              <w:spacing w:before="80" w:after="140"/>
+              <w:jc w:val="start"/>
+              <w:rPr/>
+            </w:pPr>
+            <w:r>
+              <w:rPr/>
+              <w:t>Explicit confirmation</w:t>
+            </w:r>
+          </w:p>
+        </w:tc>
+        <w:tc>
+          <w:tcPr>
+            <w:tcW w:w="3606" w:type="dxa"/>
+            <w:tcBorders/>
+            <w:vAlign w:val="center"/>
+          </w:tcPr>
+          <w:p>
+            <w:pPr>
+              <w:pStyle w:val="TableContents"/>
+              <w:bidi w:val="0"/>
+              <w:spacing w:before="80" w:after="140"/>
+              <w:jc w:val="start"/>
+              <w:rPr/>
+            </w:pPr>
+            <w:r>
+              <w:rPr/>
+              <w:t>Implemented in the client machine</w:t>
+            </w:r>
+          </w:p>
+        </w:tc>
+      </w:tr>
+      <w:tr>
+        <w:trPr/>
+        <w:tc>
+          <w:tcPr>
+            <w:tcW w:w="4611" w:type="dxa"/>
+            <w:tcBorders/>
+            <w:vAlign w:val="center"/>
+          </w:tcPr>
+          <w:p>
+            <w:pPr>
+              <w:pStyle w:val="TableContents"/>
+              <w:bidi w:val="0"/>
+              <w:spacing w:before="80" w:after="140"/>
+              <w:jc w:val="start"/>
+              <w:rPr/>
+            </w:pPr>
+            <w:r>
+              <w:rPr>
+                <w:rStyle w:val="SourceText"/>
+              </w:rPr>
+              <w:t>POST /api/workflow/events</w:t>
+            </w:r>
+          </w:p>
+        </w:tc>
+        <w:tc>
+          <w:tcPr>
+            <w:tcW w:w="3606" w:type="dxa"/>
+            <w:tcBorders/>
+            <w:vAlign w:val="center"/>
+          </w:tcPr>
+          <w:p>
+            <w:pPr>
+              <w:pStyle w:val="TableContents"/>
+              <w:bidi w:val="0"/>
+              <w:spacing w:before="80" w:after="140"/>
+              <w:jc w:val="start"/>
+              <w:rPr/>
+            </w:pPr>
+            <w:r>
+              <w:rPr/>
+              <w:t>Implemented (Bun API)</w:t>
+            </w:r>
+          </w:p>
+        </w:tc>
+      </w:tr>
+      <w:tr>
+        <w:trPr/>
+        <w:tc>
+          <w:tcPr>
+            <w:tcW w:w="4611" w:type="dxa"/>
+            <w:tcBorders/>
+            <w:vAlign w:val="center"/>
+          </w:tcPr>
+          <w:p>
+            <w:pPr>
+              <w:pStyle w:val="TableContents"/>
+              <w:bidi w:val="0"/>
+              <w:spacing w:before="80" w:after="140"/>
+              <w:jc w:val="start"/>
+              <w:rPr/>
+            </w:pPr>
+            <w:r>
+              <w:rPr>
+                <w:rStyle w:val="SourceText"/>
+              </w:rPr>
+              <w:t>GET /api/workflow/events/:eventId</w:t>
+            </w:r>
+          </w:p>
+        </w:tc>
+        <w:tc>
+          <w:tcPr>
+            <w:tcW w:w="3606" w:type="dxa"/>
+            <w:tcBorders/>
+            <w:vAlign w:val="center"/>
+          </w:tcPr>
+          <w:p>
+            <w:pPr>
+              <w:pStyle w:val="TableContents"/>
+              <w:bidi w:val="0"/>
+              <w:spacing w:before="80" w:after="140"/>
+              <w:jc w:val="start"/>
+              <w:rPr/>
+            </w:pPr>
+            <w:r>
+              <w:rPr/>
+              <w:t>Implemented (Bun API)</w:t>
+            </w:r>
+          </w:p>
+        </w:tc>
+      </w:tr>
+      <w:tr>
+        <w:trPr/>
+        <w:tc>
+          <w:tcPr>
+            <w:tcW w:w="4611" w:type="dxa"/>
+            <w:tcBorders/>
+            <w:vAlign w:val="center"/>
+          </w:tcPr>
+          <w:p>
+            <w:pPr>
+              <w:pStyle w:val="TableContents"/>
+              <w:bidi w:val="0"/>
+              <w:spacing w:before="80" w:after="140"/>
+              <w:jc w:val="start"/>
+              <w:rPr/>
+            </w:pPr>
+            <w:r>
+              <w:rPr>
+                <w:rStyle w:val="SourceText"/>
+              </w:rPr>
+              <w:t>GET /health</w:t>
+            </w:r>
+          </w:p>
+        </w:tc>
+        <w:tc>
+          <w:tcPr>
+            <w:tcW w:w="3606" w:type="dxa"/>
+            <w:tcBorders/>
+            <w:vAlign w:val="center"/>
+          </w:tcPr>
+          <w:p>
+            <w:pPr>
+              <w:pStyle w:val="TableContents"/>
+              <w:bidi w:val="0"/>
+              <w:spacing w:before="80" w:after="140"/>
+              <w:jc w:val="start"/>
+              <w:rPr/>
+            </w:pPr>
+            <w:r>
+              <w:rPr/>
+              <w:t>Implemented (Bun API)</w:t>
+            </w:r>
+          </w:p>
+        </w:tc>
+      </w:tr>
+      <w:tr>
+        <w:trPr/>
+        <w:tc>
+          <w:tcPr>
+            <w:tcW w:w="4611" w:type="dxa"/>
+            <w:tcBorders/>
+            <w:vAlign w:val="center"/>
+          </w:tcPr>
+          <w:p>
+            <w:pPr>
+              <w:pStyle w:val="TableContents"/>
+              <w:bidi w:val="0"/>
+              <w:spacing w:before="80" w:after="140"/>
+              <w:jc w:val="start"/>
+              <w:rPr/>
+            </w:pPr>
+            <w:r>
+              <w:rPr/>
+              <w:t>In-memory workflow queue</w:t>
+            </w:r>
+          </w:p>
+        </w:tc>
+        <w:tc>
+          <w:tcPr>
+            <w:tcW w:w="3606" w:type="dxa"/>
+            <w:tcBorders/>
+            <w:vAlign w:val="center"/>
+          </w:tcPr>
+          <w:p>
+            <w:pPr>
+              <w:pStyle w:val="TableContents"/>
+              <w:bidi w:val="0"/>
+              <w:spacing w:before="80" w:after="140"/>
+              <w:jc w:val="start"/>
+              <w:rPr/>
+            </w:pPr>
+            <w:r>
+              <w:rPr/>
+              <w:t>Implemented</w:t>
+            </w:r>
+          </w:p>
+        </w:tc>
+      </w:tr>
+      <w:tr>
+        <w:trPr/>
+        <w:tc>
+          <w:tcPr>
+            <w:tcW w:w="4611" w:type="dxa"/>
+            <w:tcBorders/>
+            <w:vAlign w:val="center"/>
+          </w:tcPr>
+          <w:p>
+            <w:pPr>
+              <w:pStyle w:val="TableContents"/>
+              <w:bidi w:val="0"/>
+              <w:spacing w:before="80" w:after="140"/>
+              <w:jc w:val="start"/>
+              <w:rPr/>
+            </w:pPr>
+            <w:r>
+              <w:rPr/>
+              <w:t>Server-side root XState machine</w:t>
+            </w:r>
+          </w:p>
+        </w:tc>
+        <w:tc>
+          <w:tcPr>
+            <w:tcW w:w="3606" w:type="dxa"/>
+            <w:tcBorders/>
+            <w:vAlign w:val="center"/>
+          </w:tcPr>
+          <w:p>
+            <w:pPr>
+              <w:pStyle w:val="TableContents"/>
+              <w:bidi w:val="0"/>
+              <w:spacing w:before="80" w:after="140"/>
+              <w:jc w:val="start"/>
+              <w:rPr/>
+            </w:pPr>
+            <w:r>
+              <w:rPr/>
+              <w:t>Implemented</w:t>
+            </w:r>
+          </w:p>
+        </w:tc>
+      </w:tr>
+      <w:tr>
+        <w:trPr/>
+        <w:tc>
+          <w:tcPr>
+            <w:tcW w:w="4611" w:type="dxa"/>
+            <w:tcBorders/>
+            <w:vAlign w:val="center"/>
+          </w:tcPr>
+          <w:p>
+            <w:pPr>
+              <w:pStyle w:val="TableContents"/>
+              <w:bidi w:val="0"/>
+              <w:spacing w:before="80" w:after="140"/>
+              <w:jc w:val="start"/>
+              <w:rPr/>
+            </w:pPr>
+            <w:r>
+              <w:rPr>
+                <w:rStyle w:val="SourceText"/>
+              </w:rPr>
+              <w:t>send_email</w:t>
+            </w:r>
+            <w:r>
+              <w:rPr/>
+              <w:t xml:space="preserve"> actor and Brevo sending</w:t>
+            </w:r>
+          </w:p>
+        </w:tc>
+        <w:tc>
+          <w:tcPr>
+            <w:tcW w:w="3606" w:type="dxa"/>
+            <w:tcBorders/>
+            <w:vAlign w:val="center"/>
+          </w:tcPr>
+          <w:p>
+            <w:pPr>
+              <w:pStyle w:val="TableContents"/>
+              <w:bidi w:val="0"/>
+              <w:spacing w:before="80" w:after="140"/>
+              <w:jc w:val="start"/>
+              <w:rPr/>
+            </w:pPr>
+            <w:r>
+              <w:rPr/>
+              <w:t>Implemented</w:t>
+            </w:r>
+          </w:p>
+        </w:tc>
+      </w:tr>
+      <w:tr>
+        <w:trPr/>
+        <w:tc>
+          <w:tcPr>
+            <w:tcW w:w="4611" w:type="dxa"/>
+            <w:tcBorders/>
+            <w:vAlign w:val="center"/>
+          </w:tcPr>
+          <w:p>
+            <w:pPr>
+              <w:pStyle w:val="TableContents"/>
+              <w:bidi w:val="0"/>
+              <w:spacing w:before="80" w:after="140"/>
+              <w:jc w:val="start"/>
+              <w:rPr/>
+            </w:pPr>
+            <w:r>
+              <w:rPr>
+                <w:rStyle w:val="SourceText"/>
+              </w:rPr>
+              <w:t>schedule_email</w:t>
+            </w:r>
+            <w:r>
+              <w:rPr/>
+              <w:t xml:space="preserve"> root state</w:t>
+            </w:r>
+          </w:p>
+        </w:tc>
+        <w:tc>
+          <w:tcPr>
+            <w:tcW w:w="3606" w:type="dxa"/>
+            <w:tcBorders/>
+            <w:vAlign w:val="center"/>
+          </w:tcPr>
+          <w:p>
+            <w:pPr>
+              <w:pStyle w:val="TableContents"/>
+              <w:bidi w:val="0"/>
+              <w:spacing w:before="80" w:after="140"/>
+              <w:jc w:val="start"/>
+              <w:rPr/>
+            </w:pPr>
+            <w:r>
+              <w:rPr/>
+              <w:t>Placeholder; always fails</w:t>
+            </w:r>
+          </w:p>
+        </w:tc>
+      </w:tr>
+      <w:tr>
+        <w:trPr/>
+        <w:tc>
+          <w:tcPr>
+            <w:tcW w:w="4611" w:type="dxa"/>
+            <w:tcBorders/>
+            <w:vAlign w:val="center"/>
+          </w:tcPr>
+          <w:p>
+            <w:pPr>
+              <w:pStyle w:val="TableContents"/>
+              <w:bidi w:val="0"/>
+              <w:spacing w:before="80" w:after="140"/>
+              <w:jc w:val="start"/>
+              <w:rPr/>
+            </w:pPr>
+            <w:r>
+              <w:rPr/>
+              <w:t>Execution event (</w:t>
+            </w:r>
+            <w:r>
+              <w:rPr>
+                <w:rStyle w:val="SourceText"/>
+              </w:rPr>
+              <w:t>workflow.action.requested</w:t>
+            </w:r>
+            <w:r>
+              <w:rPr/>
+              <w:t>)</w:t>
+            </w:r>
+          </w:p>
+        </w:tc>
+        <w:tc>
+          <w:tcPr>
+            <w:tcW w:w="3606" w:type="dxa"/>
+            <w:tcBorders/>
+            <w:vAlign w:val="center"/>
+          </w:tcPr>
+          <w:p>
+            <w:pPr>
+              <w:pStyle w:val="TableContents"/>
+              <w:bidi w:val="0"/>
+              <w:spacing w:before="80" w:after="140"/>
+              <w:jc w:val="start"/>
+              <w:rPr/>
+            </w:pPr>
+            <w:r>
+              <w:rPr/>
+              <w:t>Implemented</w:t>
+            </w:r>
+          </w:p>
+        </w:tc>
+      </w:tr>
+      <w:tr>
+        <w:trPr/>
+        <w:tc>
+          <w:tcPr>
+            <w:tcW w:w="4611" w:type="dxa"/>
+            <w:tcBorders/>
+            <w:vAlign w:val="center"/>
+          </w:tcPr>
+          <w:p>
+            <w:pPr>
+              <w:pStyle w:val="TableContents"/>
+              <w:bidi w:val="0"/>
+              <w:spacing w:before="80" w:after="140"/>
+              <w:jc w:val="start"/>
+              <w:rPr/>
+            </w:pPr>
+            <w:r>
+              <w:rPr/>
+              <w:t>Job status polling in Chat</w:t>
+            </w:r>
+          </w:p>
+        </w:tc>
+        <w:tc>
+          <w:tcPr>
+            <w:tcW w:w="3606" w:type="dxa"/>
+            <w:tcBorders/>
+            <w:vAlign w:val="center"/>
+          </w:tcPr>
+          <w:p>
+            <w:pPr>
+              <w:pStyle w:val="TableContents"/>
+              <w:bidi w:val="0"/>
+              <w:spacing w:before="80" w:after="140"/>
+              <w:jc w:val="start"/>
+              <w:rPr/>
+            </w:pPr>
+            <w:r>
+              <w:rPr/>
+              <w:t>Implemented</w:t>
+            </w:r>
+          </w:p>
+        </w:tc>
+      </w:tr>
+      <w:tr>
+        <w:trPr/>
+        <w:tc>
+          <w:tcPr>
+            <w:tcW w:w="4611" w:type="dxa"/>
+            <w:tcBorders/>
+            <w:vAlign w:val="center"/>
+          </w:tcPr>
+          <w:p>
+            <w:pPr>
+              <w:pStyle w:val="TableContents"/>
+              <w:bidi w:val="0"/>
+              <w:spacing w:before="80" w:after="140"/>
+              <w:jc w:val="start"/>
+              <w:rPr/>
+            </w:pPr>
+            <w:r>
+              <w:rPr/>
+              <w:t xml:space="preserve">Direct </w:t>
+            </w:r>
+            <w:r>
+              <w:rPr>
+                <w:rStyle w:val="SourceText"/>
+              </w:rPr>
+              <w:t>POST /api/email</w:t>
+            </w:r>
+            <w:r>
+              <w:rPr/>
+              <w:t xml:space="preserve"> debug route</w:t>
+            </w:r>
+          </w:p>
+        </w:tc>
+        <w:tc>
+          <w:tcPr>
+            <w:tcW w:w="3606" w:type="dxa"/>
+            <w:tcBorders/>
+            <w:vAlign w:val="center"/>
+          </w:tcPr>
+          <w:p>
+            <w:pPr>
+              <w:pStyle w:val="TableContents"/>
+              <w:bidi w:val="0"/>
+              <w:spacing w:before="80" w:after="140"/>
+              <w:jc w:val="start"/>
+              <w:rPr/>
+            </w:pPr>
+            <w:r>
+              <w:rPr/>
+              <w:t>Implemented (Bun API)</w:t>
+            </w:r>
+          </w:p>
+        </w:tc>
+      </w:tr>
+      <w:tr>
+        <w:trPr/>
+        <w:tc>
+          <w:tcPr>
+            <w:tcW w:w="4611" w:type="dxa"/>
+            <w:tcBorders/>
+            <w:vAlign w:val="center"/>
+          </w:tcPr>
+          <w:p>
+            <w:pPr>
+              <w:pStyle w:val="TableContents"/>
+              <w:bidi w:val="0"/>
+              <w:spacing w:before="80" w:after="140"/>
+              <w:jc w:val="start"/>
+              <w:rPr/>
+            </w:pPr>
+            <w:r>
+              <w:rPr/>
+              <w:t>Persistent workflow jobs</w:t>
+            </w:r>
+          </w:p>
+        </w:tc>
+        <w:tc>
+          <w:tcPr>
+            <w:tcW w:w="3606" w:type="dxa"/>
             <w:tcBorders/>
             <w:vAlign w:val="center"/>
           </w:tcPr>
@@ -2583,27 +3595,27 @@
         <w:trPr/>
         <w:tc>
           <w:tcPr>
-            <w:tcW w:w="3846" w:type="dxa"/>
-            <w:tcBorders/>
-            <w:vAlign w:val="center"/>
-          </w:tcPr>
-          <w:p>
-            <w:pPr>
-              <w:pStyle w:val="TableContents"/>
-              <w:bidi w:val="0"/>
-              <w:spacing w:before="80" w:after="140"/>
-              <w:jc w:val="start"/>
-              <w:rPr/>
-            </w:pPr>
-            <w:r>
-              <w:rPr/>
-              <w:t>Explicit confirmation</w:t>
-            </w:r>
-          </w:p>
-        </w:tc>
-        <w:tc>
-          <w:tcPr>
-            <w:tcW w:w="1956" w:type="dxa"/>
+            <w:tcW w:w="4611" w:type="dxa"/>
+            <w:tcBorders/>
+            <w:vAlign w:val="center"/>
+          </w:tcPr>
+          <w:p>
+            <w:pPr>
+              <w:pStyle w:val="TableContents"/>
+              <w:bidi w:val="0"/>
+              <w:spacing w:before="80" w:after="140"/>
+              <w:jc w:val="start"/>
+              <w:rPr/>
+            </w:pPr>
+            <w:r>
+              <w:rPr/>
+              <w:t>Retry / cancellation</w:t>
+            </w:r>
+          </w:p>
+        </w:tc>
+        <w:tc>
+          <w:tcPr>
+            <w:tcW w:w="3606" w:type="dxa"/>
             <w:tcBorders/>
             <w:vAlign w:val="center"/>
           </w:tcPr>
@@ -2626,27 +3638,27 @@
         <w:trPr/>
         <w:tc>
           <w:tcPr>
-            <w:tcW w:w="3846" w:type="dxa"/>
-            <w:tcBorders/>
-            <w:vAlign w:val="center"/>
-          </w:tcPr>
-          <w:p>
-            <w:pPr>
-              <w:pStyle w:val="TableContents"/>
-              <w:bidi w:val="0"/>
-              <w:spacing w:before="80" w:after="140"/>
-              <w:jc w:val="start"/>
-              <w:rPr/>
-            </w:pPr>
-            <w:r>
-              <w:rPr/>
-              <w:t>Brevo email sending</w:t>
-            </w:r>
-          </w:p>
-        </w:tc>
-        <w:tc>
-          <w:tcPr>
-            <w:tcW w:w="1956" w:type="dxa"/>
+            <w:tcW w:w="4611" w:type="dxa"/>
+            <w:tcBorders/>
+            <w:vAlign w:val="center"/>
+          </w:tcPr>
+          <w:p>
+            <w:pPr>
+              <w:pStyle w:val="TableContents"/>
+              <w:bidi w:val="0"/>
+              <w:spacing w:before="80" w:after="140"/>
+              <w:jc w:val="start"/>
+              <w:rPr/>
+            </w:pPr>
+            <w:r>
+              <w:rPr/>
+              <w:t>Scheduled email delivery</w:t>
+            </w:r>
+          </w:p>
+        </w:tc>
+        <w:tc>
+          <w:tcPr>
+            <w:tcW w:w="3606" w:type="dxa"/>
             <w:tcBorders/>
             <w:vAlign w:val="center"/>
           </w:tcPr>
@@ -2669,27 +3681,27 @@
         <w:trPr/>
         <w:tc>
           <w:tcPr>
-            <w:tcW w:w="3846" w:type="dxa"/>
-            <w:tcBorders/>
-            <w:vAlign w:val="center"/>
-          </w:tcPr>
-          <w:p>
-            <w:pPr>
-              <w:pStyle w:val="TableContents"/>
-              <w:bidi w:val="0"/>
-              <w:spacing w:before="80" w:after="140"/>
-              <w:jc w:val="start"/>
-              <w:rPr/>
-            </w:pPr>
-            <w:r>
-              <w:rPr/>
-              <w:t>Scheduled email delivery</w:t>
-            </w:r>
-          </w:p>
-        </w:tc>
-        <w:tc>
-          <w:tcPr>
-            <w:tcW w:w="1956" w:type="dxa"/>
+            <w:tcW w:w="4611" w:type="dxa"/>
+            <w:tcBorders/>
+            <w:vAlign w:val="center"/>
+          </w:tcPr>
+          <w:p>
+            <w:pPr>
+              <w:pStyle w:val="TableContents"/>
+              <w:bidi w:val="0"/>
+              <w:spacing w:before="80" w:after="140"/>
+              <w:jc w:val="start"/>
+              <w:rPr/>
+            </w:pPr>
+            <w:r>
+              <w:rPr/>
+              <w:t>Email / schedule storage</w:t>
+            </w:r>
+          </w:p>
+        </w:tc>
+        <w:tc>
+          <w:tcPr>
+            <w:tcW w:w="3606" w:type="dxa"/>
             <w:tcBorders/>
             <w:vAlign w:val="center"/>
           </w:tcPr>
@@ -2712,27 +3724,27 @@
         <w:trPr/>
         <w:tc>
           <w:tcPr>
-            <w:tcW w:w="3846" w:type="dxa"/>
-            <w:tcBorders/>
-            <w:vAlign w:val="center"/>
-          </w:tcPr>
-          <w:p>
-            <w:pPr>
-              <w:pStyle w:val="TableContents"/>
-              <w:bidi w:val="0"/>
-              <w:spacing w:before="80" w:after="140"/>
-              <w:jc w:val="start"/>
-              <w:rPr/>
-            </w:pPr>
-            <w:r>
-              <w:rPr/>
-              <w:t>Email / schedule storage</w:t>
-            </w:r>
-          </w:p>
-        </w:tc>
-        <w:tc>
-          <w:tcPr>
-            <w:tcW w:w="1956" w:type="dxa"/>
+            <w:tcW w:w="4611" w:type="dxa"/>
+            <w:tcBorders/>
+            <w:vAlign w:val="center"/>
+          </w:tcPr>
+          <w:p>
+            <w:pPr>
+              <w:pStyle w:val="TableContents"/>
+              <w:bidi w:val="0"/>
+              <w:spacing w:before="80" w:after="140"/>
+              <w:jc w:val="start"/>
+              <w:rPr/>
+            </w:pPr>
+            <w:r>
+              <w:rPr/>
+              <w:t>Background scheduler</w:t>
+            </w:r>
+          </w:p>
+        </w:tc>
+        <w:tc>
+          <w:tcPr>
+            <w:tcW w:w="3606" w:type="dxa"/>
             <w:tcBorders/>
             <w:vAlign w:val="center"/>
           </w:tcPr>
@@ -2755,27 +3767,27 @@
         <w:trPr/>
         <w:tc>
           <w:tcPr>
-            <w:tcW w:w="3846" w:type="dxa"/>
-            <w:tcBorders/>
-            <w:vAlign w:val="center"/>
-          </w:tcPr>
-          <w:p>
-            <w:pPr>
-              <w:pStyle w:val="TableContents"/>
-              <w:bidi w:val="0"/>
-              <w:spacing w:before="80" w:after="140"/>
-              <w:jc w:val="start"/>
-              <w:rPr/>
-            </w:pPr>
-            <w:r>
-              <w:rPr/>
-              <w:t>Background scheduler</w:t>
-            </w:r>
-          </w:p>
-        </w:tc>
-        <w:tc>
-          <w:tcPr>
-            <w:tcW w:w="1956" w:type="dxa"/>
+            <w:tcW w:w="4611" w:type="dxa"/>
+            <w:tcBorders/>
+            <w:vAlign w:val="center"/>
+          </w:tcPr>
+          <w:p>
+            <w:pPr>
+              <w:pStyle w:val="TableContents"/>
+              <w:bidi w:val="0"/>
+              <w:spacing w:before="80" w:after="140"/>
+              <w:jc w:val="start"/>
+              <w:rPr/>
+            </w:pPr>
+            <w:r>
+              <w:rPr/>
+              <w:t>Sequence execution</w:t>
+            </w:r>
+          </w:p>
+        </w:tc>
+        <w:tc>
+          <w:tcPr>
+            <w:tcW w:w="3606" w:type="dxa"/>
             <w:tcBorders/>
             <w:vAlign w:val="center"/>
           </w:tcPr>
@@ -2798,50 +3810,7 @@
         <w:trPr/>
         <w:tc>
           <w:tcPr>
-            <w:tcW w:w="3846" w:type="dxa"/>
-            <w:tcBorders/>
-            <w:vAlign w:val="center"/>
-          </w:tcPr>
-          <w:p>
-            <w:pPr>
-              <w:pStyle w:val="TableContents"/>
-              <w:bidi w:val="0"/>
-              <w:spacing w:before="80" w:after="140"/>
-              <w:jc w:val="start"/>
-              <w:rPr/>
-            </w:pPr>
-            <w:r>
-              <w:rPr/>
-              <w:t>Sequence execution</w:t>
-            </w:r>
-          </w:p>
-        </w:tc>
-        <w:tc>
-          <w:tcPr>
-            <w:tcW w:w="1956" w:type="dxa"/>
-            <w:tcBorders/>
-            <w:vAlign w:val="center"/>
-          </w:tcPr>
-          <w:p>
-            <w:pPr>
-              <w:pStyle w:val="TableContents"/>
-              <w:bidi w:val="0"/>
-              <w:spacing w:before="80" w:after="140"/>
-              <w:jc w:val="start"/>
-              <w:rPr/>
-            </w:pPr>
-            <w:r>
-              <w:rPr/>
-              <w:t>Not implemented</w:t>
-            </w:r>
-          </w:p>
-        </w:tc>
-      </w:tr>
-      <w:tr>
-        <w:trPr/>
-        <w:tc>
-          <w:tcPr>
-            <w:tcW w:w="3846" w:type="dxa"/>
+            <w:tcW w:w="4611" w:type="dxa"/>
             <w:tcBorders/>
             <w:vAlign w:val="center"/>
           </w:tcPr>
@@ -2861,7 +3830,7 @@
         </w:tc>
         <w:tc>
           <w:tcPr>
-            <w:tcW w:w="1956" w:type="dxa"/>
+            <w:tcW w:w="3606" w:type="dxa"/>
             <w:tcBorders/>
             <w:vAlign w:val="center"/>
           </w:tcPr>
@@ -2890,12 +3859,54 @@
       </w:pPr>
       <w:r>
         <w:rPr/>
-        <w:t>12. Endpoint inventory</w:t>
+        <w:t>13. Endpoint inventory</w:t>
+      </w:r>
+    </w:p>
+    <w:p>
+      <w:pPr>
+        <w:pStyle w:val="BodyText"/>
+        <w:bidi w:val="0"/>
+        <w:jc w:val="start"/>
+        <w:rPr/>
+      </w:pPr>
+      <w:r>
+        <w:rPr/>
+        <w:t xml:space="preserve">All endpoints are served by the Bun API on </w:t>
+      </w:r>
+      <w:r>
+        <w:rPr>
+          <w:rStyle w:val="SourceText"/>
+        </w:rPr>
+        <w:t>HOST:PORT</w:t>
+      </w:r>
+      <w:r>
+        <w:rPr/>
+        <w:t xml:space="preserve"> (default </w:t>
+      </w:r>
+      <w:r>
+        <w:rPr>
+          <w:rStyle w:val="SourceText"/>
+        </w:rPr>
+        <w:t>127.0.0.1:3001</w:t>
+      </w:r>
+      <w:r>
+        <w:rPr/>
+        <w:t xml:space="preserve">). In development, Astro proxies </w:t>
+      </w:r>
+      <w:r>
+        <w:rPr>
+          <w:rStyle w:val="SourceText"/>
+        </w:rPr>
+        <w:t>/api</w:t>
+      </w:r>
+      <w:r>
+        <w:rPr/>
+        <w:t xml:space="preserve"> to it.</w:t>
       </w:r>
     </w:p>
     <w:tbl>
       <w:tblPr>
-        <w:tblW w:w="8763" w:type="dxa"/>
+        <w:tblW w:w="10803" w:type="dxa"/>
         <w:jc w:val="start"/>
         <w:tblInd w:w="0" w:type="dxa"/>
         <w:tblLayout w:type="fixed"/>
@@ -2907,9 +3918,9 @@
         </w:tblCellMar>
       </w:tblPr>
       <w:tblGrid>
-        <w:gridCol w:w="3276"/>
+        <w:gridCol w:w="3711"/>
         <w:gridCol w:w="1521"/>
-        <w:gridCol w:w="3966"/>
+        <w:gridCol w:w="5571"/>
       </w:tblGrid>
       <w:tr>
         <w:trPr>
@@ -2917,7 +3928,7 @@
         </w:trPr>
         <w:tc>
           <w:tcPr>
-            <w:tcW w:w="3276" w:type="dxa"/>
+            <w:tcW w:w="3711" w:type="dxa"/>
             <w:tcBorders/>
             <w:vAlign w:val="center"/>
           </w:tcPr>
@@ -2961,7 +3972,7 @@
         </w:tc>
         <w:tc>
           <w:tcPr>
-            <w:tcW w:w="3966" w:type="dxa"/>
+            <w:tcW w:w="5571" w:type="dxa"/>
             <w:tcBorders/>
             <w:vAlign w:val="center"/>
           </w:tcPr>
@@ -2986,7 +3997,72 @@
         <w:trPr/>
         <w:tc>
           <w:tcPr>
-            <w:tcW w:w="3276" w:type="dxa"/>
+            <w:tcW w:w="3711" w:type="dxa"/>
+            <w:tcBorders/>
+            <w:vAlign w:val="center"/>
+          </w:tcPr>
+          <w:p>
+            <w:pPr>
+              <w:pStyle w:val="TableContents"/>
+              <w:bidi w:val="0"/>
+              <w:spacing w:before="80" w:after="140"/>
+              <w:jc w:val="start"/>
+              <w:rPr/>
+            </w:pPr>
+            <w:r>
+              <w:rPr>
+                <w:rStyle w:val="SourceText"/>
+              </w:rPr>
+              <w:t>GET /health</w:t>
+            </w:r>
+          </w:p>
+        </w:tc>
+        <w:tc>
+          <w:tcPr>
+            <w:tcW w:w="1521" w:type="dxa"/>
+            <w:tcBorders/>
+            <w:vAlign w:val="center"/>
+          </w:tcPr>
+          <w:p>
+            <w:pPr>
+              <w:pStyle w:val="TableContents"/>
+              <w:bidi w:val="0"/>
+              <w:spacing w:before="80" w:after="140"/>
+              <w:jc w:val="start"/>
+              <w:rPr/>
+            </w:pPr>
+            <w:r>
+              <w:rPr/>
+              <w:t>Implemented</w:t>
+            </w:r>
+          </w:p>
+        </w:tc>
+        <w:tc>
+          <w:tcPr>
+            <w:tcW w:w="5571" w:type="dxa"/>
+            <w:tcBorders/>
+            <w:vAlign w:val="center"/>
+          </w:tcPr>
+          <w:p>
+            <w:pPr>
+              <w:pStyle w:val="TableContents"/>
+              <w:bidi w:val="0"/>
+              <w:spacing w:before="80" w:after="140"/>
+              <w:jc w:val="start"/>
+              <w:rPr/>
+            </w:pPr>
+            <w:r>
+              <w:rPr/>
+              <w:t>Bun API health check</w:t>
+            </w:r>
+          </w:p>
+        </w:tc>
+      </w:tr>
+      <w:tr>
+        <w:trPr/>
+        <w:tc>
+          <w:tcPr>
+            <w:tcW w:w="3711" w:type="dxa"/>
             <w:tcBorders/>
             <w:vAlign w:val="center"/>
           </w:tcPr>
@@ -3028,7 +4104,7 @@
         </w:tc>
         <w:tc>
           <w:tcPr>
-            <w:tcW w:w="3966" w:type="dxa"/>
+            <w:tcW w:w="5571" w:type="dxa"/>
             <w:tcBorders/>
             <w:vAlign w:val="center"/>
           </w:tcPr>
@@ -3051,7 +4127,7 @@
         <w:trPr/>
         <w:tc>
           <w:tcPr>
-            <w:tcW w:w="3276" w:type="dxa"/>
+            <w:tcW w:w="3711" w:type="dxa"/>
             <w:tcBorders/>
             <w:vAlign w:val="center"/>
           </w:tcPr>
@@ -3093,7 +4169,7 @@
         </w:tc>
         <w:tc>
           <w:tcPr>
-            <w:tcW w:w="3966" w:type="dxa"/>
+            <w:tcW w:w="5571" w:type="dxa"/>
             <w:tcBorders/>
             <w:vAlign w:val="center"/>
           </w:tcPr>
@@ -3116,7 +4192,7 @@
         <w:trPr/>
         <w:tc>
           <w:tcPr>
-            <w:tcW w:w="3276" w:type="dxa"/>
+            <w:tcW w:w="3711" w:type="dxa"/>
             <w:tcBorders/>
             <w:vAlign w:val="center"/>
           </w:tcPr>
@@ -3132,7 +4208,7 @@
               <w:rPr>
                 <w:rStyle w:val="SourceText"/>
               </w:rPr>
-              <w:t>POST /api/email/send</w:t>
+              <w:t>POST /api/workflow/events</w:t>
             </w:r>
           </w:p>
         </w:tc>
@@ -3152,33 +4228,92 @@
             </w:pPr>
             <w:r>
               <w:rPr/>
-              <w:t>Planned</w:t>
-            </w:r>
-          </w:p>
-        </w:tc>
-        <w:tc>
-          <w:tcPr>
-            <w:tcW w:w="3966" w:type="dxa"/>
-            <w:tcBorders/>
-            <w:vAlign w:val="center"/>
-          </w:tcPr>
-          <w:p>
-            <w:pPr>
-              <w:pStyle w:val="TableContents"/>
-              <w:bidi w:val="0"/>
-              <w:spacing w:before="80" w:after="140"/>
-              <w:jc w:val="start"/>
-              <w:rPr/>
-            </w:pPr>
-            <w:r>
-              <w:rPr/>
-              <w:t xml:space="preserve">Execute </w:t>
-            </w:r>
+              <w:t>Implemented</w:t>
+            </w:r>
+          </w:p>
+        </w:tc>
+        <w:tc>
+          <w:tcPr>
+            <w:tcW w:w="5571" w:type="dxa"/>
+            <w:tcBorders/>
+            <w:vAlign w:val="center"/>
+          </w:tcPr>
+          <w:p>
+            <w:pPr>
+              <w:pStyle w:val="TableContents"/>
+              <w:bidi w:val="0"/>
+              <w:spacing w:before="80" w:after="140"/>
+              <w:jc w:val="start"/>
+              <w:rPr/>
+            </w:pPr>
+            <w:r>
+              <w:rPr/>
+              <w:t>Validate and enqueue a confirmed action</w:t>
+            </w:r>
+          </w:p>
+        </w:tc>
+      </w:tr>
+      <w:tr>
+        <w:trPr/>
+        <w:tc>
+          <w:tcPr>
+            <w:tcW w:w="3711" w:type="dxa"/>
+            <w:tcBorders/>
+            <w:vAlign w:val="center"/>
+          </w:tcPr>
+          <w:p>
+            <w:pPr>
+              <w:pStyle w:val="TableContents"/>
+              <w:bidi w:val="0"/>
+              <w:spacing w:before="80" w:after="140"/>
+              <w:jc w:val="start"/>
+              <w:rPr/>
+            </w:pPr>
             <w:r>
               <w:rPr>
                 <w:rStyle w:val="SourceText"/>
               </w:rPr>
-              <w:t>send_email</w:t>
+              <w:t>GET /api/workflow/events/:eventId</w:t>
+            </w:r>
+          </w:p>
+        </w:tc>
+        <w:tc>
+          <w:tcPr>
+            <w:tcW w:w="1521" w:type="dxa"/>
+            <w:tcBorders/>
+            <w:vAlign w:val="center"/>
+          </w:tcPr>
+          <w:p>
+            <w:pPr>
+              <w:pStyle w:val="TableContents"/>
+              <w:bidi w:val="0"/>
+              <w:spacing w:before="80" w:after="140"/>
+              <w:jc w:val="start"/>
+              <w:rPr/>
+            </w:pPr>
+            <w:r>
+              <w:rPr/>
+              <w:t>Implemented</w:t>
+            </w:r>
+          </w:p>
+        </w:tc>
+        <w:tc>
+          <w:tcPr>
+            <w:tcW w:w="5571" w:type="dxa"/>
+            <w:tcBorders/>
+            <w:vAlign w:val="center"/>
+          </w:tcPr>
+          <w:p>
+            <w:pPr>
+              <w:pStyle w:val="TableContents"/>
+              <w:bidi w:val="0"/>
+              <w:spacing w:before="80" w:after="140"/>
+              <w:jc w:val="start"/>
+              <w:rPr/>
+            </w:pPr>
+            <w:r>
+              <w:rPr/>
+              <w:t>Read workflow job status and result</w:t>
             </w:r>
           </w:p>
         </w:tc>
@@ -3187,7 +4322,72 @@
         <w:trPr/>
         <w:tc>
           <w:tcPr>
-            <w:tcW w:w="3276" w:type="dxa"/>
+            <w:tcW w:w="3711" w:type="dxa"/>
+            <w:tcBorders/>
+            <w:vAlign w:val="center"/>
+          </w:tcPr>
+          <w:p>
+            <w:pPr>
+              <w:pStyle w:val="TableContents"/>
+              <w:bidi w:val="0"/>
+              <w:spacing w:before="80" w:after="140"/>
+              <w:jc w:val="start"/>
+              <w:rPr/>
+            </w:pPr>
+            <w:r>
+              <w:rPr>
+                <w:rStyle w:val="SourceText"/>
+              </w:rPr>
+              <w:t>POST /api/email</w:t>
+            </w:r>
+          </w:p>
+        </w:tc>
+        <w:tc>
+          <w:tcPr>
+            <w:tcW w:w="1521" w:type="dxa"/>
+            <w:tcBorders/>
+            <w:vAlign w:val="center"/>
+          </w:tcPr>
+          <w:p>
+            <w:pPr>
+              <w:pStyle w:val="TableContents"/>
+              <w:bidi w:val="0"/>
+              <w:spacing w:before="80" w:after="140"/>
+              <w:jc w:val="start"/>
+              <w:rPr/>
+            </w:pPr>
+            <w:r>
+              <w:rPr/>
+              <w:t>Implemented</w:t>
+            </w:r>
+          </w:p>
+        </w:tc>
+        <w:tc>
+          <w:tcPr>
+            <w:tcW w:w="5571" w:type="dxa"/>
+            <w:tcBorders/>
+            <w:vAlign w:val="center"/>
+          </w:tcPr>
+          <w:p>
+            <w:pPr>
+              <w:pStyle w:val="TableContents"/>
+              <w:bidi w:val="0"/>
+              <w:spacing w:before="80" w:after="140"/>
+              <w:jc w:val="start"/>
+              <w:rPr/>
+            </w:pPr>
+            <w:r>
+              <w:rPr/>
+              <w:t>Direct debug send through Brevo, bypassing the queue</w:t>
+            </w:r>
+          </w:p>
+        </w:tc>
+      </w:tr>
+      <w:tr>
+        <w:trPr/>
+        <w:tc>
+          <w:tcPr>
+            <w:tcW w:w="3711" w:type="dxa"/>
             <w:tcBorders/>
             <w:vAlign w:val="center"/>
           </w:tcPr>
@@ -3229,27 +4429,21 @@
         </w:tc>
         <w:tc>
           <w:tcPr>
-            <w:tcW w:w="3966" w:type="dxa"/>
-            <w:tcBorders/>
-            <w:vAlign w:val="center"/>
-          </w:tcPr>
-          <w:p>
-            <w:pPr>
-              <w:pStyle w:val="TableContents"/>
-              <w:bidi w:val="0"/>
-              <w:spacing w:before="80" w:after="140"/>
-              <w:jc w:val="start"/>
-              <w:rPr/>
-            </w:pPr>
-            <w:r>
-              <w:rPr/>
-              <w:t xml:space="preserve">Execute </w:t>
-            </w:r>
-            <w:r>
-              <w:rPr>
-                <w:rStyle w:val="SourceText"/>
-              </w:rPr>
-              <w:t>schedule_email</w:t>
+            <w:tcW w:w="5571" w:type="dxa"/>
+            <w:tcBorders/>
+            <w:vAlign w:val="center"/>
+          </w:tcPr>
+          <w:p>
+            <w:pPr>
+              <w:pStyle w:val="TableContents"/>
+              <w:bidi w:val="0"/>
+              <w:spacing w:before="80" w:after="140"/>
+              <w:jc w:val="start"/>
+              <w:rPr/>
+            </w:pPr>
+            <w:r>
+              <w:rPr/>
+              <w:t>Real scheduled delivery</w:t>
             </w:r>
           </w:p>
         </w:tc>
@@ -3258,7 +4452,7 @@
         <w:trPr/>
         <w:tc>
           <w:tcPr>
-            <w:tcW w:w="3276" w:type="dxa"/>
+            <w:tcW w:w="3711" w:type="dxa"/>
             <w:tcBorders/>
             <w:vAlign w:val="center"/>
           </w:tcPr>
@@ -3300,7 +4494,7 @@
         </w:tc>
         <w:tc>
           <w:tcPr>
-            <w:tcW w:w="3966" w:type="dxa"/>
+            <w:tcW w:w="5571" w:type="dxa"/>
             <w:tcBorders/>
             <w:vAlign w:val="center"/>
           </w:tcPr>
@@ -3329,7 +4523,7 @@
       </w:pPr>
       <w:r>
         <w:rPr/>
-        <w:t>13. Related documents</w:t>
+        <w:t>14. Related documents</w:t>
       </w:r>
     </w:p>
     <w:p>
@@ -3349,7 +4543,7 @@
         <w:jc w:val="start"/>
         <w:rPr/>
       </w:pPr>
-      <w:hyperlink r:id="rId11">
+      <w:hyperlink r:id="rId12">
         <w:r>
           <w:rPr>
             <w:rStyle w:val="Hyperlink"/>
@@ -3379,7 +4573,7 @@
         <w:jc w:val="start"/>
         <w:rPr/>
       </w:pPr>
-      <w:hyperlink r:id="rId12">
+      <w:hyperlink r:id="rId13">
         <w:r>
           <w:rPr>
             <w:rStyle w:val="Hyperlink"/>
@@ -3409,7 +4603,7 @@
         <w:jc w:val="start"/>
         <w:rPr/>
       </w:pPr>
-      <w:hyperlink r:id="rId13">
+      <w:hyperlink r:id="rId14">
         <w:r>
           <w:rPr>
             <w:rStyle w:val="Hyperlink"/>
@@ -3822,14 +5016,6 @@
       <w:sz w:val="18"/>
       <w:szCs w:val="18"/>
       <w:shd w:fill="F3F4F6" w:val="clear"/>
-    </w:rPr>
-  </w:style>
-  <w:style w:type="character" w:styleId="Strong">
-    <w:name w:val="Strong"/>
-    <w:qFormat/>
-    <w:rPr>
-      <w:b/>
-      <w:bCs/>
     </w:rPr>
   </w:style>
   <w:style w:type="character" w:styleId="Bullets">

</xml_diff>

<commit_message>
update:added to the main thing
</commit_message>
<xml_diff>
--- a/docs/SYSTEM_DIAGRAM.docx
+++ b/docs/SYSTEM_DIAGRAM.docx
@@ -585,7 +585,7 @@
         <w:rPr/>
         <w:drawing>
           <wp:inline distT="0" distB="0" distL="0" distR="0">
-            <wp:extent cx="3048000" cy="5143500"/>
+            <wp:extent cx="3114675" cy="5143500"/>
             <wp:effectExtent l="0" t="0" r="0" b="0"/>
             <wp:docPr id="2" name="Image2" descr="" title="Diagram 2"/>
             <wp:cNvGraphicFramePr>
@@ -609,7 +609,7 @@
                   <pic:spPr bwMode="auto">
                     <a:xfrm>
                       <a:off x="0" y="0"/>
-                      <a:ext cx="3048000" cy="5143500"/>
+                      <a:ext cx="3114675" cy="5143500"/>
                     </a:xfrm>
                     <a:prstGeom prst="rect">
                       <a:avLst/>
@@ -765,7 +765,7 @@
         <w:rPr/>
         <w:drawing>
           <wp:inline distT="0" distB="0" distL="0" distR="0">
-            <wp:extent cx="7534275" cy="5143500"/>
+            <wp:extent cx="7600950" cy="5143500"/>
             <wp:effectExtent l="0" t="0" r="0" b="0"/>
             <wp:docPr id="4" name="Image4" descr="" title="Diagram 4"/>
             <wp:cNvGraphicFramePr>
@@ -789,7 +789,7 @@
                   <pic:spPr bwMode="auto">
                     <a:xfrm>
                       <a:off x="0" y="0"/>
-                      <a:ext cx="7534275" cy="5143500"/>
+                      <a:ext cx="7600950" cy="5143500"/>
                     </a:xfrm>
                     <a:prstGeom prst="rect">
                       <a:avLst/>
@@ -865,7 +865,7 @@
         <w:rPr>
           <w:rStyle w:val="SourceText"/>
         </w:rPr>
-        <w:t>server/src/workflow/root-machine.ts</w:t>
+        <w:t>workflow/src/server/root-machine.ts</w:t>
       </w:r>
       <w:r>
         <w:rPr/>
@@ -875,7 +875,7 @@
         <w:rPr>
           <w:rStyle w:val="SourceText"/>
         </w:rPr>
-        <w:t>server/src/workflow/runtime.ts</w:t>
+        <w:t>server/src/runtime.ts</w:t>
       </w:r>
       <w:r>
         <w:rPr/>
@@ -968,13 +968,13 @@
       </w:pPr>
       <w:r>
         <w:rPr/>
-        <w:t xml:space="preserve">The client machine lives in </w:t>
+        <w:t xml:space="preserve">The client conversation machine lives in </w:t>
       </w:r>
       <w:r>
         <w:rPr>
           <w:rStyle w:val="SourceText"/>
         </w:rPr>
-        <w:t>workflow/src/core/create-email-workflow.ts</w:t>
+        <w:t>front-end/src/lib/chat/send-email-conversation-machine.ts</w:t>
       </w:r>
       <w:r>
         <w:rPr/>

</xml_diff>

<commit_message>
feat:added shaparation between server client and the workflow
</commit_message>
<xml_diff>
--- a/docs/SYSTEM_DIAGRAM.docx
+++ b/docs/SYSTEM_DIAGRAM.docx
@@ -24,7 +24,7 @@
       </w:pPr>
       <w:r>
         <w:rPr/>
-        <w:t>This document describes the complete system: browser, authentication, chat UI, the Astro SSR front-end, the Bun HTTP API, the action engine, events, LLM provider, XState workflow machines, the in-memory execution queue, and Brevo transactional email.</w:t>
+        <w:t>This document describes the browser, Astro front-end, Bun API server, Bun workflow service, action engine, events, workflow machines, in-memory queue, and Brevo transactional email.</w:t>
       </w:r>
     </w:p>
     <w:p>
@@ -211,7 +211,7 @@
       </w:r>
       <w:r>
         <w:rPr/>
-        <w:t xml:space="preserve"> delivery is implemented through a Bun HTTP API, a server-side XState root machine, an in-memory FIFO queue, and a Brevo actor. The chat client keeps the clarification and confirmation conversation, then enqueues a confirmed action. Scheduling has a placeholder root-machine state only. Persistent records, retries, background workers, and server-side authentication remain planned.</w:t>
+        <w:t xml:space="preserve"> delivery is implemented through the public API server, the standalone workflow service, an in-memory FIFO queue, the main workflow machine, and a Brevo actor. The chat client keeps the clarification and confirmation conversation, then enqueues a confirmed action. Scheduling has a placeholder actor only.</w:t>
       </w:r>
     </w:p>
     <w:p>
@@ -223,17 +223,7 @@
       </w:pPr>
       <w:r>
         <w:rPr/>
-        <w:t xml:space="preserve">In development, the Astro front-end proxies relative </w:t>
-      </w:r>
-      <w:r>
-        <w:rPr>
-          <w:rStyle w:val="SourceText"/>
-        </w:rPr>
-        <w:t>/api</w:t>
-      </w:r>
-      <w:r>
-        <w:rPr/>
-        <w:t xml:space="preserve"> requests to the Bun API. The Astro production server does not include that proxy automatically; production needs a reverse proxy or equivalent same-origin routing.</w:t>
+        <w:t>The API server and workflow service are separate Bun processes. The API server serves public endpoints and proxies workflow requests to the workflow service. The workflow service owns execution state and is intended for a private network.</w:t>
       </w:r>
     </w:p>
     <w:p>
@@ -260,7 +250,7 @@
         <w:rPr/>
         <w:drawing>
           <wp:inline distT="0" distB="0" distL="0" distR="0">
-            <wp:extent cx="9525000" cy="1885950"/>
+            <wp:extent cx="9525000" cy="1628775"/>
             <wp:effectExtent l="0" t="0" r="0" b="0"/>
             <wp:docPr id="1" name="Image1" descr="" title="Diagram 1"/>
             <wp:cNvGraphicFramePr>
@@ -284,7 +274,7 @@
                   <pic:spPr bwMode="auto">
                     <a:xfrm>
                       <a:off x="0" y="0"/>
-                      <a:ext cx="9525000" cy="1885950"/>
+                      <a:ext cx="9525000" cy="1628775"/>
                     </a:xfrm>
                     <a:prstGeom prst="rect">
                       <a:avLst/>
@@ -310,12 +300,12 @@
       </w:pPr>
       <w:r>
         <w:rPr/>
-        <w:t>Event-to-Brevo workflow mapping</w:t>
+        <w:t>Event-to-workflow mapping</w:t>
       </w:r>
     </w:p>
     <w:tbl>
       <w:tblPr>
-        <w:tblW w:w="9888" w:type="dxa"/>
+        <w:tblW w:w="9453" w:type="dxa"/>
         <w:jc w:val="start"/>
         <w:tblInd w:w="0" w:type="dxa"/>
         <w:tblLayout w:type="fixed"/>
@@ -329,7 +319,7 @@
       <w:tblGrid>
         <w:gridCol w:w="2901"/>
         <w:gridCol w:w="3291"/>
-        <w:gridCol w:w="3696"/>
+        <w:gridCol w:w="3261"/>
       </w:tblGrid>
       <w:tr>
         <w:trPr>
@@ -381,7 +371,7 @@
         </w:tc>
         <w:tc>
           <w:tcPr>
-            <w:tcW w:w="3696" w:type="dxa"/>
+            <w:tcW w:w="3261" w:type="dxa"/>
             <w:tcBorders/>
             <w:vAlign w:val="center"/>
           </w:tcPr>
@@ -454,7 +444,7 @@
         </w:tc>
         <w:tc>
           <w:tcPr>
-            <w:tcW w:w="3696" w:type="dxa"/>
+            <w:tcW w:w="3261" w:type="dxa"/>
             <w:tcBorders/>
             <w:vAlign w:val="center"/>
           </w:tcPr>
@@ -519,21 +509,21 @@
         </w:tc>
         <w:tc>
           <w:tcPr>
-            <w:tcW w:w="3696" w:type="dxa"/>
-            <w:tcBorders/>
-            <w:vAlign w:val="center"/>
-          </w:tcPr>
-          <w:p>
-            <w:pPr>
-              <w:pStyle w:val="TableContents"/>
-              <w:bidi w:val="0"/>
-              <w:spacing w:before="80" w:after="140"/>
-              <w:jc w:val="start"/>
-              <w:rPr/>
-            </w:pPr>
-            <w:r>
-              <w:rPr/>
-              <w:t>Queued for the server root machine</w:t>
+            <w:tcW w:w="3261" w:type="dxa"/>
+            <w:tcBorders/>
+            <w:vAlign w:val="center"/>
+          </w:tcPr>
+          <w:p>
+            <w:pPr>
+              <w:pStyle w:val="TableContents"/>
+              <w:bidi w:val="0"/>
+              <w:spacing w:before="80" w:after="140"/>
+              <w:jc w:val="start"/>
+              <w:rPr/>
+            </w:pPr>
+            <w:r>
+              <w:rPr/>
+              <w:t>Queued in the workflow service</w:t>
             </w:r>
           </w:p>
         </w:tc>
@@ -548,17 +538,7 @@
       </w:pPr>
       <w:r>
         <w:rPr/>
-        <w:t xml:space="preserve">The raw identification event is not an execution command. Execution requires a confirmed, complete action. </w:t>
-      </w:r>
-      <w:r>
-        <w:rPr>
-          <w:rStyle w:val="SourceText"/>
-        </w:rPr>
-        <w:t>schedule_email</w:t>
-      </w:r>
-      <w:r>
-        <w:rPr/>
-        <w:t xml:space="preserve"> events are accepted by the queue but fail in the placeholder actor.</w:t>
+        <w:t>The raw identification event is not an execution command. Execution requires a confirmed, complete action.</w:t>
       </w:r>
     </w:p>
     <w:p>
@@ -585,7 +565,7 @@
         <w:rPr/>
         <w:drawing>
           <wp:inline distT="0" distB="0" distL="0" distR="0">
-            <wp:extent cx="3114675" cy="5143500"/>
+            <wp:extent cx="2581275" cy="5143500"/>
             <wp:effectExtent l="0" t="0" r="0" b="0"/>
             <wp:docPr id="2" name="Image2" descr="" title="Diagram 2"/>
             <wp:cNvGraphicFramePr>
@@ -609,7 +589,7 @@
                   <pic:spPr bwMode="auto">
                     <a:xfrm>
                       <a:off x="0" y="0"/>
-                      <a:ext cx="3114675" cy="5143500"/>
+                      <a:ext cx="2581275" cy="5143500"/>
                     </a:xfrm>
                     <a:prstGeom prst="rect">
                       <a:avLst/>
@@ -657,17 +637,7 @@
       </w:r>
       <w:r>
         <w:rPr/>
-        <w:t xml:space="preserve"> results continue into the client conversation machine in section 4. Clear </w:t>
-      </w:r>
-      <w:r>
-        <w:rPr>
-          <w:rStyle w:val="SourceText"/>
-        </w:rPr>
-        <w:t>schedule_email</w:t>
-      </w:r>
-      <w:r>
-        <w:rPr/>
-        <w:t xml:space="preserve"> results stop at the action card.</w:t>
+        <w:t xml:space="preserve"> results continue into the client conversation machine.</w:t>
       </w:r>
     </w:p>
     <w:p>
@@ -682,7 +652,7 @@
         <w:rPr/>
         <w:drawing>
           <wp:inline distT="0" distB="0" distL="0" distR="0">
-            <wp:extent cx="7086600" cy="5143500"/>
+            <wp:extent cx="9515475" cy="5143500"/>
             <wp:effectExtent l="0" t="0" r="0" b="0"/>
             <wp:docPr id="3" name="Image3" descr="" title="Diagram 3"/>
             <wp:cNvGraphicFramePr>
@@ -706,7 +676,7 @@
                   <pic:spPr bwMode="auto">
                     <a:xfrm>
                       <a:off x="0" y="0"/>
-                      <a:ext cx="7086600" cy="5143500"/>
+                      <a:ext cx="9515475" cy="5143500"/>
                     </a:xfrm>
                     <a:prstGeom prst="rect">
                       <a:avLst/>
@@ -732,25 +702,7 @@
       </w:pPr>
       <w:r>
         <w:rPr/>
-        <w:t>4. send_email flow (implemented)</w:t>
-      </w:r>
-    </w:p>
-    <w:p>
-      <w:pPr>
-        <w:pStyle w:val="BodyText"/>
-        <w:bidi w:val="0"/>
-        <w:jc w:val="start"/>
-        <w:rPr/>
-      </w:pPr>
-      <w:r>
-        <w:rPr>
-          <w:rStyle w:val="SourceText"/>
-        </w:rPr>
-        <w:t>Chat.tsx</w:t>
-      </w:r>
-      <w:r>
-        <w:rPr/>
-        <w:t xml:space="preserve"> owns the client conversation state and the enqueue/poll effects. The server root machine owns execution after the confirmed event is queued.</w:t>
+        <w:t>4. send_email flow</w:t>
       </w:r>
     </w:p>
     <w:p>
@@ -765,7 +717,7 @@
         <w:rPr/>
         <w:drawing>
           <wp:inline distT="0" distB="0" distL="0" distR="0">
-            <wp:extent cx="7600950" cy="5143500"/>
+            <wp:extent cx="7029450" cy="5143500"/>
             <wp:effectExtent l="0" t="0" r="0" b="0"/>
             <wp:docPr id="4" name="Image4" descr="" title="Diagram 4"/>
             <wp:cNvGraphicFramePr>
@@ -789,7 +741,7 @@
                   <pic:spPr bwMode="auto">
                     <a:xfrm>
                       <a:off x="0" y="0"/>
-                      <a:ext cx="7600950" cy="5143500"/>
+                      <a:ext cx="7029450" cy="5143500"/>
                     </a:xfrm>
                     <a:prstGeom prst="rect">
                       <a:avLst/>
@@ -815,7 +767,7 @@
       </w:pPr>
       <w:r>
         <w:rPr/>
-        <w:t xml:space="preserve">If the actor fails, the root machine records </w:t>
+        <w:t xml:space="preserve">If the actor fails, the main machine records </w:t>
       </w:r>
       <w:r>
         <w:rPr>
@@ -847,7 +799,7 @@
       </w:pPr>
       <w:r>
         <w:rPr/>
-        <w:t>5. Server root workflow machine (implemented)</w:t>
+        <w:t>5. Main workflow machine</w:t>
       </w:r>
     </w:p>
     <w:p>
@@ -859,27 +811,17 @@
       </w:pPr>
       <w:r>
         <w:rPr/>
-        <w:t xml:space="preserve">The root machine lives in </w:t>
+        <w:t xml:space="preserve">The main machine lives in </w:t>
       </w:r>
       <w:r>
         <w:rPr>
           <w:rStyle w:val="SourceText"/>
         </w:rPr>
-        <w:t>workflow/src/server/root-machine.ts</w:t>
-      </w:r>
-      <w:r>
-        <w:rPr/>
-        <w:t xml:space="preserve">. It is started only by </w:t>
-      </w:r>
-      <w:r>
-        <w:rPr>
-          <w:rStyle w:val="SourceText"/>
-        </w:rPr>
-        <w:t>server/src/runtime.ts</w:t>
-      </w:r>
-      <w:r>
-        <w:rPr/>
-        <w:t xml:space="preserve"> inside the Bun API process.</w:t>
+        <w:t>workflow/src/server/main-machine.ts</w:t>
+      </w:r>
+      <w:r>
+        <w:rPr/>
+        <w:t xml:space="preserve"> inside the workflow service.</w:t>
       </w:r>
     </w:p>
     <w:p>
@@ -894,7 +836,7 @@
         <w:rPr/>
         <w:drawing>
           <wp:inline distT="0" distB="0" distL="0" distR="0">
-            <wp:extent cx="9525000" cy="4943475"/>
+            <wp:extent cx="7458075" cy="5143500"/>
             <wp:effectExtent l="0" t="0" r="0" b="0"/>
             <wp:docPr id="5" name="Image5" descr="" title="Diagram 5"/>
             <wp:cNvGraphicFramePr>
@@ -918,7 +860,7 @@
                   <pic:spPr bwMode="auto">
                     <a:xfrm>
                       <a:off x="0" y="0"/>
-                      <a:ext cx="9525000" cy="4943475"/>
+                      <a:ext cx="7458075" cy="5143500"/>
                     </a:xfrm>
                     <a:prstGeom prst="rect">
                       <a:avLst/>
@@ -944,7 +886,17 @@
       </w:pPr>
       <w:r>
         <w:rPr/>
-        <w:t>The queue listener wakes the machine whenever a job is enqueued. The machine processes one job at a time and raises another wake-up after completion.</w:t>
+        <w:t xml:space="preserve">The queue listener wakes the machine whenever a job is enqueued. The machine processes one job at a time, looks up the actor by </w:t>
+      </w:r>
+      <w:r>
+        <w:rPr>
+          <w:rStyle w:val="SourceText"/>
+        </w:rPr>
+        <w:t>event.actionId</w:t>
+      </w:r>
+      <w:r>
+        <w:rPr/>
+        <w:t>, and raises another wake-up after completion.</w:t>
       </w:r>
     </w:p>
     <w:p>
@@ -956,7 +908,7 @@
       </w:pPr>
       <w:r>
         <w:rPr/>
-        <w:t>6. Client send-email conversation machine (implemented)</w:t>
+        <w:t>6. Client conversation machine</w:t>
       </w:r>
     </w:p>
     <w:p>
@@ -968,33 +920,13 @@
       </w:pPr>
       <w:r>
         <w:rPr/>
-        <w:t xml:space="preserve">The client conversation machine lives in </w:t>
+        <w:t xml:space="preserve">The client machine lives in </w:t>
       </w:r>
       <w:r>
         <w:rPr>
           <w:rStyle w:val="SourceText"/>
         </w:rPr>
         <w:t>front-end/src/lib/chat/send-email-conversation-machine.ts</w:t>
-      </w:r>
-      <w:r>
-        <w:rPr/>
-        <w:t xml:space="preserve">. </w:t>
-      </w:r>
-      <w:r>
-        <w:rPr>
-          <w:rStyle w:val="SourceText"/>
-        </w:rPr>
-        <w:t>Chat.tsx</w:t>
-      </w:r>
-      <w:r>
-        <w:rPr/>
-        <w:t xml:space="preserve"> sends events into it and performs the enqueue/poll effects after </w:t>
-      </w:r>
-      <w:r>
-        <w:rPr>
-          <w:rStyle w:val="SourceText"/>
-        </w:rPr>
-        <w:t>CONFIRM</w:t>
       </w:r>
       <w:r>
         <w:rPr/>
@@ -1063,7 +995,17 @@
       </w:pPr>
       <w:r>
         <w:rPr/>
-        <w:t>The machine is pure and framework-free. The React layer calls the workflow API; the client machine does not perform I/O.</w:t>
+        <w:t xml:space="preserve">The machine is pure and framework-free. </w:t>
+      </w:r>
+      <w:r>
+        <w:rPr>
+          <w:rStyle w:val="SourceText"/>
+        </w:rPr>
+        <w:t>Chat.tsx</w:t>
+      </w:r>
+      <w:r>
+        <w:rPr/>
+        <w:t xml:space="preserve"> performs identification, enqueueing, and polling.</w:t>
       </w:r>
     </w:p>
     <w:p>
@@ -1075,25 +1017,7 @@
       </w:pPr>
       <w:r>
         <w:rPr/>
-        <w:t>7. schedule_email placeholder flow</w:t>
-      </w:r>
-    </w:p>
-    <w:p>
-      <w:pPr>
-        <w:pStyle w:val="BodyText"/>
-        <w:bidi w:val="0"/>
-        <w:jc w:val="start"/>
-        <w:rPr/>
-      </w:pPr>
-      <w:r>
-        <w:rPr>
-          <w:rStyle w:val="SourceText"/>
-        </w:rPr>
-        <w:t>schedule_email</w:t>
-      </w:r>
-      <w:r>
-        <w:rPr/>
-        <w:t xml:space="preserve"> is identified by the catalog, but Chat does not collect or confirm it. The workflow API accepts a complete event for exercising the root machine, where the placeholder actor fails the job.</w:t>
+        <w:t>7. Runtime topology</w:t>
       </w:r>
     </w:p>
     <w:p>
@@ -1108,7 +1032,7 @@
         <w:rPr/>
         <w:drawing>
           <wp:inline distT="0" distB="0" distL="0" distR="0">
-            <wp:extent cx="9525000" cy="3486150"/>
+            <wp:extent cx="2476500" cy="5143500"/>
             <wp:effectExtent l="0" t="0" r="0" b="0"/>
             <wp:docPr id="7" name="Image7" descr="" title="Diagram 7"/>
             <wp:cNvGraphicFramePr>
@@ -1132,7 +1056,7 @@
                   <pic:spPr bwMode="auto">
                     <a:xfrm>
                       <a:off x="0" y="0"/>
-                      <a:ext cx="9525000" cy="3486150"/>
+                      <a:ext cx="2476500" cy="5143500"/>
                     </a:xfrm>
                     <a:prstGeom prst="rect">
                       <a:avLst/>
@@ -1151,18 +1075,6 @@
     </w:p>
     <w:p>
       <w:pPr>
-        <w:pStyle w:val="BodyText"/>
-        <w:bidi w:val="0"/>
-        <w:jc w:val="start"/>
-        <w:rPr/>
-      </w:pPr>
-      <w:r>
-        <w:rPr/>
-        <w:t>There is no schedule store, worker, or real scheduled delivery yet.</w:t>
-      </w:r>
-    </w:p>
-    <w:p>
-      <w:pPr>
         <w:pStyle w:val="Heading2"/>
         <w:bidi w:val="0"/>
         <w:jc w:val="start"/>
@@ -1170,248 +1082,7 @@
       </w:pPr>
       <w:r>
         <w:rPr/>
-        <w:t>8. Event pipeline</w:t>
-      </w:r>
-    </w:p>
-    <w:p>
-      <w:pPr>
-        <w:pStyle w:val="BodyText"/>
-        <w:bidi w:val="0"/>
-        <w:jc w:val="start"/>
-        <w:rPr/>
-      </w:pPr>
-      <w:r>
-        <w:rPr/>
-        <w:t>Identification events and execution events are separate.</w:t>
-      </w:r>
-    </w:p>
-    <w:p>
-      <w:pPr>
-        <w:pStyle w:val="BodyText"/>
-        <w:bidi w:val="0"/>
-        <w:ind w:hanging="0" w:start="0" w:end="0"/>
-        <w:jc w:val="center"/>
-        <w:rPr/>
-      </w:pPr>
-      <w:r>
-        <w:rPr/>
-        <w:drawing>
-          <wp:inline distT="0" distB="0" distL="0" distR="0">
-            <wp:extent cx="2114550" cy="5143500"/>
-            <wp:effectExtent l="0" t="0" r="0" b="0"/>
-            <wp:docPr id="8" name="Image8" descr="" title="Diagram 8"/>
-            <wp:cNvGraphicFramePr>
-              <a:graphicFrameLocks xmlns:a="http://schemas.openxmlformats.org/drawingml/2006/main" noChangeAspect="1"/>
-            </wp:cNvGraphicFramePr>
-            <a:graphic xmlns:a="http://schemas.openxmlformats.org/drawingml/2006/main">
-              <a:graphicData uri="http://schemas.openxmlformats.org/drawingml/2006/picture">
-                <pic:pic xmlns:pic="http://schemas.openxmlformats.org/drawingml/2006/picture">
-                  <pic:nvPicPr>
-                    <pic:cNvPr id="8" name="Image8" descr="" title="Diagram 8"/>
-                    <pic:cNvPicPr>
-                      <a:picLocks noChangeAspect="1" noChangeArrowheads="1"/>
-                    </pic:cNvPicPr>
-                  </pic:nvPicPr>
-                  <pic:blipFill>
-                    <a:blip r:embed="rId9"/>
-                    <a:stretch>
-                      <a:fillRect/>
-                    </a:stretch>
-                  </pic:blipFill>
-                  <pic:spPr bwMode="auto">
-                    <a:xfrm>
-                      <a:off x="0" y="0"/>
-                      <a:ext cx="2114550" cy="5143500"/>
-                    </a:xfrm>
-                    <a:prstGeom prst="rect">
-                      <a:avLst/>
-                    </a:prstGeom>
-                  </pic:spPr>
-                </pic:pic>
-              </a:graphicData>
-            </a:graphic>
-          </wp:inline>
-        </w:drawing>
-      </w:r>
-      <w:r>
-        <w:rPr/>
-        <w:t xml:space="preserve"> </w:t>
-      </w:r>
-    </w:p>
-    <w:p>
-      <w:pPr>
-        <w:pStyle w:val="Heading2"/>
-        <w:bidi w:val="0"/>
-        <w:jc w:val="start"/>
-        <w:rPr/>
-      </w:pPr>
-      <w:r>
-        <w:rPr/>
-        <w:t>9. Authentication and session flow</w:t>
-      </w:r>
-    </w:p>
-    <w:p>
-      <w:pPr>
-        <w:pStyle w:val="BodyText"/>
-        <w:bidi w:val="0"/>
-        <w:jc w:val="start"/>
-        <w:rPr/>
-      </w:pPr>
-      <w:r>
-        <w:rPr/>
-        <w:t xml:space="preserve">Authentication is client-only and stored in </w:t>
-      </w:r>
-      <w:r>
-        <w:rPr>
-          <w:rStyle w:val="SourceText"/>
-        </w:rPr>
-        <w:t>localStorage</w:t>
-      </w:r>
-      <w:r>
-        <w:rPr/>
-        <w:t>.</w:t>
-      </w:r>
-    </w:p>
-    <w:p>
-      <w:pPr>
-        <w:pStyle w:val="BodyText"/>
-        <w:bidi w:val="0"/>
-        <w:ind w:hanging="0" w:start="0" w:end="0"/>
-        <w:jc w:val="center"/>
-        <w:rPr/>
-      </w:pPr>
-      <w:r>
-        <w:rPr/>
-        <w:drawing>
-          <wp:inline distT="0" distB="0" distL="0" distR="0">
-            <wp:extent cx="9525000" cy="3571875"/>
-            <wp:effectExtent l="0" t="0" r="0" b="0"/>
-            <wp:docPr id="9" name="Image9" descr="" title="Diagram 9"/>
-            <wp:cNvGraphicFramePr>
-              <a:graphicFrameLocks xmlns:a="http://schemas.openxmlformats.org/drawingml/2006/main" noChangeAspect="1"/>
-            </wp:cNvGraphicFramePr>
-            <a:graphic xmlns:a="http://schemas.openxmlformats.org/drawingml/2006/main">
-              <a:graphicData uri="http://schemas.openxmlformats.org/drawingml/2006/picture">
-                <pic:pic xmlns:pic="http://schemas.openxmlformats.org/drawingml/2006/picture">
-                  <pic:nvPicPr>
-                    <pic:cNvPr id="9" name="Image9" descr="" title="Diagram 9"/>
-                    <pic:cNvPicPr>
-                      <a:picLocks noChangeAspect="1" noChangeArrowheads="1"/>
-                    </pic:cNvPicPr>
-                  </pic:nvPicPr>
-                  <pic:blipFill>
-                    <a:blip r:embed="rId10"/>
-                    <a:stretch>
-                      <a:fillRect/>
-                    </a:stretch>
-                  </pic:blipFill>
-                  <pic:spPr bwMode="auto">
-                    <a:xfrm>
-                      <a:off x="0" y="0"/>
-                      <a:ext cx="9525000" cy="3571875"/>
-                    </a:xfrm>
-                    <a:prstGeom prst="rect">
-                      <a:avLst/>
-                    </a:prstGeom>
-                  </pic:spPr>
-                </pic:pic>
-              </a:graphicData>
-            </a:graphic>
-          </wp:inline>
-        </w:drawing>
-      </w:r>
-      <w:r>
-        <w:rPr/>
-        <w:t xml:space="preserve"> </w:t>
-      </w:r>
-    </w:p>
-    <w:p>
-      <w:pPr>
-        <w:pStyle w:val="BodyText"/>
-        <w:bidi w:val="0"/>
-        <w:jc w:val="start"/>
-        <w:rPr/>
-      </w:pPr>
-      <w:r>
-        <w:rPr/>
-        <w:t>Security note: there is no server-side authentication, password hashing, or session validation. Anyone with browser access can read or modify the stored user data.</w:t>
-      </w:r>
-    </w:p>
-    <w:p>
-      <w:pPr>
-        <w:pStyle w:val="Heading2"/>
-        <w:bidi w:val="0"/>
-        <w:jc w:val="start"/>
-        <w:rPr/>
-      </w:pPr>
-      <w:r>
-        <w:rPr/>
-        <w:t>10. Runtime topology</w:t>
-      </w:r>
-    </w:p>
-    <w:p>
-      <w:pPr>
-        <w:pStyle w:val="BodyText"/>
-        <w:bidi w:val="0"/>
-        <w:ind w:hanging="0" w:start="0" w:end="0"/>
-        <w:jc w:val="center"/>
-        <w:rPr/>
-      </w:pPr>
-      <w:r>
-        <w:rPr/>
-        <w:drawing>
-          <wp:inline distT="0" distB="0" distL="0" distR="0">
-            <wp:extent cx="3829050" cy="5143500"/>
-            <wp:effectExtent l="0" t="0" r="0" b="0"/>
-            <wp:docPr id="10" name="Image10" descr="" title="Diagram 10"/>
-            <wp:cNvGraphicFramePr>
-              <a:graphicFrameLocks xmlns:a="http://schemas.openxmlformats.org/drawingml/2006/main" noChangeAspect="1"/>
-            </wp:cNvGraphicFramePr>
-            <a:graphic xmlns:a="http://schemas.openxmlformats.org/drawingml/2006/main">
-              <a:graphicData uri="http://schemas.openxmlformats.org/drawingml/2006/picture">
-                <pic:pic xmlns:pic="http://schemas.openxmlformats.org/drawingml/2006/picture">
-                  <pic:nvPicPr>
-                    <pic:cNvPr id="10" name="Image10" descr="" title="Diagram 10"/>
-                    <pic:cNvPicPr>
-                      <a:picLocks noChangeAspect="1" noChangeArrowheads="1"/>
-                    </pic:cNvPicPr>
-                  </pic:nvPicPr>
-                  <pic:blipFill>
-                    <a:blip r:embed="rId11"/>
-                    <a:stretch>
-                      <a:fillRect/>
-                    </a:stretch>
-                  </pic:blipFill>
-                  <pic:spPr bwMode="auto">
-                    <a:xfrm>
-                      <a:off x="0" y="0"/>
-                      <a:ext cx="3829050" cy="5143500"/>
-                    </a:xfrm>
-                    <a:prstGeom prst="rect">
-                      <a:avLst/>
-                    </a:prstGeom>
-                  </pic:spPr>
-                </pic:pic>
-              </a:graphicData>
-            </a:graphic>
-          </wp:inline>
-        </w:drawing>
-      </w:r>
-      <w:r>
-        <w:rPr/>
-        <w:t xml:space="preserve"> </w:t>
-      </w:r>
-    </w:p>
-    <w:p>
-      <w:pPr>
-        <w:pStyle w:val="Heading2"/>
-        <w:bidi w:val="0"/>
-        <w:jc w:val="start"/>
-        <w:rPr/>
-      </w:pPr>
-      <w:r>
-        <w:rPr/>
-        <w:t>11. Data stores</w:t>
+        <w:t>8. Data stores</w:t>
       </w:r>
     </w:p>
     <w:tbl>
@@ -1428,10 +1099,10 @@
         </w:tblCellMar>
       </w:tblPr>
       <w:tblGrid>
-        <w:gridCol w:w="2129"/>
-        <w:gridCol w:w="3604"/>
-        <w:gridCol w:w="1702"/>
-        <w:gridCol w:w="3904"/>
+        <w:gridCol w:w="2167"/>
+        <w:gridCol w:w="3954"/>
+        <w:gridCol w:w="1711"/>
+        <w:gridCol w:w="3507"/>
       </w:tblGrid>
       <w:tr>
         <w:trPr>
@@ -1439,7 +1110,7 @@
         </w:trPr>
         <w:tc>
           <w:tcPr>
-            <w:tcW w:w="2129" w:type="dxa"/>
+            <w:tcW w:w="2167" w:type="dxa"/>
             <w:tcBorders/>
             <w:vAlign w:val="center"/>
           </w:tcPr>
@@ -1461,7 +1132,7 @@
         </w:tc>
         <w:tc>
           <w:tcPr>
-            <w:tcW w:w="3604" w:type="dxa"/>
+            <w:tcW w:w="3954" w:type="dxa"/>
             <w:tcBorders/>
             <w:vAlign w:val="center"/>
           </w:tcPr>
@@ -1483,7 +1154,7 @@
         </w:tc>
         <w:tc>
           <w:tcPr>
-            <w:tcW w:w="1702" w:type="dxa"/>
+            <w:tcW w:w="1711" w:type="dxa"/>
             <w:tcBorders/>
             <w:vAlign w:val="center"/>
           </w:tcPr>
@@ -1505,7 +1176,7 @@
         </w:tc>
         <w:tc>
           <w:tcPr>
-            <w:tcW w:w="3904" w:type="dxa"/>
+            <w:tcW w:w="3507" w:type="dxa"/>
             <w:tcBorders/>
             <w:vAlign w:val="center"/>
           </w:tcPr>
@@ -1530,7 +1201,7 @@
         <w:trPr/>
         <w:tc>
           <w:tcPr>
-            <w:tcW w:w="2129" w:type="dxa"/>
+            <w:tcW w:w="2167" w:type="dxa"/>
             <w:tcBorders/>
             <w:vAlign w:val="center"/>
           </w:tcPr>
@@ -1552,7 +1223,7 @@
         </w:tc>
         <w:tc>
           <w:tcPr>
-            <w:tcW w:w="3604" w:type="dxa"/>
+            <w:tcW w:w="3954" w:type="dxa"/>
             <w:tcBorders/>
             <w:vAlign w:val="center"/>
           </w:tcPr>
@@ -1578,7 +1249,7 @@
         </w:tc>
         <w:tc>
           <w:tcPr>
-            <w:tcW w:w="1702" w:type="dxa"/>
+            <w:tcW w:w="1711" w:type="dxa"/>
             <w:tcBorders/>
             <w:vAlign w:val="center"/>
           </w:tcPr>
@@ -1598,7 +1269,7 @@
         </w:tc>
         <w:tc>
           <w:tcPr>
-            <w:tcW w:w="3904" w:type="dxa"/>
+            <w:tcW w:w="3507" w:type="dxa"/>
             <w:tcBorders/>
             <w:vAlign w:val="center"/>
           </w:tcPr>
@@ -1621,7 +1292,7 @@
         <w:trPr/>
         <w:tc>
           <w:tcPr>
-            <w:tcW w:w="2129" w:type="dxa"/>
+            <w:tcW w:w="2167" w:type="dxa"/>
             <w:tcBorders/>
             <w:vAlign w:val="center"/>
           </w:tcPr>
@@ -1643,7 +1314,7 @@
         </w:tc>
         <w:tc>
           <w:tcPr>
-            <w:tcW w:w="3604" w:type="dxa"/>
+            <w:tcW w:w="3954" w:type="dxa"/>
             <w:tcBorders/>
             <w:vAlign w:val="center"/>
           </w:tcPr>
@@ -1669,7 +1340,7 @@
         </w:tc>
         <w:tc>
           <w:tcPr>
-            <w:tcW w:w="1702" w:type="dxa"/>
+            <w:tcW w:w="1711" w:type="dxa"/>
             <w:tcBorders/>
             <w:vAlign w:val="center"/>
           </w:tcPr>
@@ -1689,7 +1360,7 @@
         </w:tc>
         <w:tc>
           <w:tcPr>
-            <w:tcW w:w="3904" w:type="dxa"/>
+            <w:tcW w:w="3507" w:type="dxa"/>
             <w:tcBorders/>
             <w:vAlign w:val="center"/>
           </w:tcPr>
@@ -1712,7 +1383,7 @@
         <w:trPr/>
         <w:tc>
           <w:tcPr>
-            <w:tcW w:w="2129" w:type="dxa"/>
+            <w:tcW w:w="2167" w:type="dxa"/>
             <w:tcBorders/>
             <w:vAlign w:val="center"/>
           </w:tcPr>
@@ -1734,7 +1405,7 @@
         </w:tc>
         <w:tc>
           <w:tcPr>
-            <w:tcW w:w="3604" w:type="dxa"/>
+            <w:tcW w:w="3954" w:type="dxa"/>
             <w:tcBorders/>
             <w:vAlign w:val="center"/>
           </w:tcPr>
@@ -1760,7 +1431,7 @@
         </w:tc>
         <w:tc>
           <w:tcPr>
-            <w:tcW w:w="1702" w:type="dxa"/>
+            <w:tcW w:w="1711" w:type="dxa"/>
             <w:tcBorders/>
             <w:vAlign w:val="center"/>
           </w:tcPr>
@@ -1780,7 +1451,7 @@
         </w:tc>
         <w:tc>
           <w:tcPr>
-            <w:tcW w:w="3904" w:type="dxa"/>
+            <w:tcW w:w="3507" w:type="dxa"/>
             <w:tcBorders/>
             <w:vAlign w:val="center"/>
           </w:tcPr>
@@ -1803,7 +1474,7 @@
         <w:trPr/>
         <w:tc>
           <w:tcPr>
-            <w:tcW w:w="2129" w:type="dxa"/>
+            <w:tcW w:w="2167" w:type="dxa"/>
             <w:tcBorders/>
             <w:vAlign w:val="center"/>
           </w:tcPr>
@@ -1823,7 +1494,7 @@
         </w:tc>
         <w:tc>
           <w:tcPr>
-            <w:tcW w:w="3604" w:type="dxa"/>
+            <w:tcW w:w="3954" w:type="dxa"/>
             <w:tcBorders/>
             <w:vAlign w:val="center"/>
           </w:tcPr>
@@ -1843,13 +1514,13 @@
             </w:r>
             <w:r>
               <w:rPr/>
-              <w:t xml:space="preserve"> in the Bun process</w:t>
-            </w:r>
-          </w:p>
-        </w:tc>
-        <w:tc>
-          <w:tcPr>
-            <w:tcW w:w="1702" w:type="dxa"/>
+              <w:t xml:space="preserve"> in the API server</w:t>
+            </w:r>
+          </w:p>
+        </w:tc>
+        <w:tc>
+          <w:tcPr>
+            <w:tcW w:w="1711" w:type="dxa"/>
             <w:tcBorders/>
             <w:vAlign w:val="center"/>
           </w:tcPr>
@@ -1869,7 +1540,7 @@
         </w:tc>
         <w:tc>
           <w:tcPr>
-            <w:tcW w:w="3904" w:type="dxa"/>
+            <w:tcW w:w="3507" w:type="dxa"/>
             <w:tcBorders/>
             <w:vAlign w:val="center"/>
           </w:tcPr>
@@ -1892,7 +1563,7 @@
         <w:trPr/>
         <w:tc>
           <w:tcPr>
-            <w:tcW w:w="2129" w:type="dxa"/>
+            <w:tcW w:w="2167" w:type="dxa"/>
             <w:tcBorders/>
             <w:vAlign w:val="center"/>
           </w:tcPr>
@@ -1912,7 +1583,7 @@
         </w:tc>
         <w:tc>
           <w:tcPr>
-            <w:tcW w:w="3604" w:type="dxa"/>
+            <w:tcW w:w="3954" w:type="dxa"/>
             <w:tcBorders/>
             <w:vAlign w:val="center"/>
           </w:tcPr>
@@ -1932,7 +1603,7 @@
         </w:tc>
         <w:tc>
           <w:tcPr>
-            <w:tcW w:w="1702" w:type="dxa"/>
+            <w:tcW w:w="1711" w:type="dxa"/>
             <w:tcBorders/>
             <w:vAlign w:val="center"/>
           </w:tcPr>
@@ -1952,22 +1623,18 @@
         </w:tc>
         <w:tc>
           <w:tcPr>
-            <w:tcW w:w="3904" w:type="dxa"/>
-            <w:tcBorders/>
-            <w:vAlign w:val="center"/>
-          </w:tcPr>
-          <w:p>
-            <w:pPr>
-              <w:pStyle w:val="TableContents"/>
-              <w:bidi w:val="0"/>
-              <w:spacing w:before="80" w:after="140"/>
-              <w:jc w:val="start"/>
-              <w:rPr/>
-            </w:pPr>
-            <w:r>
-              <w:rPr/>
-              <w:t xml:space="preserve">Implemented </w:t>
-            </w:r>
+            <w:tcW w:w="3507" w:type="dxa"/>
+            <w:tcBorders/>
+            <w:vAlign w:val="center"/>
+          </w:tcPr>
+          <w:p>
+            <w:pPr>
+              <w:pStyle w:val="TableContents"/>
+              <w:bidi w:val="0"/>
+              <w:spacing w:before="80" w:after="140"/>
+              <w:jc w:val="start"/>
+              <w:rPr/>
+            </w:pPr>
             <w:r>
               <w:rPr>
                 <w:rStyle w:val="SourceText"/>
@@ -1985,7 +1652,7 @@
         <w:trPr/>
         <w:tc>
           <w:tcPr>
-            <w:tcW w:w="2129" w:type="dxa"/>
+            <w:tcW w:w="2167" w:type="dxa"/>
             <w:tcBorders/>
             <w:vAlign w:val="center"/>
           </w:tcPr>
@@ -2005,7 +1672,7 @@
         </w:tc>
         <w:tc>
           <w:tcPr>
-            <w:tcW w:w="3604" w:type="dxa"/>
+            <w:tcW w:w="3954" w:type="dxa"/>
             <w:tcBorders/>
             <w:vAlign w:val="center"/>
           </w:tcPr>
@@ -2025,13 +1692,13 @@
             </w:r>
             <w:r>
               <w:rPr/>
-              <w:t xml:space="preserve"> in the Bun process</w:t>
-            </w:r>
-          </w:p>
-        </w:tc>
-        <w:tc>
-          <w:tcPr>
-            <w:tcW w:w="1702" w:type="dxa"/>
+              <w:t xml:space="preserve"> in the workflow service</w:t>
+            </w:r>
+          </w:p>
+        </w:tc>
+        <w:tc>
+          <w:tcPr>
+            <w:tcW w:w="1711" w:type="dxa"/>
             <w:tcBorders/>
             <w:vAlign w:val="center"/>
           </w:tcPr>
@@ -2051,7 +1718,7 @@
         </w:tc>
         <w:tc>
           <w:tcPr>
-            <w:tcW w:w="3904" w:type="dxa"/>
+            <w:tcW w:w="3507" w:type="dxa"/>
             <w:tcBorders/>
             <w:vAlign w:val="center"/>
           </w:tcPr>
@@ -2074,7 +1741,7 @@
         <w:trPr/>
         <w:tc>
           <w:tcPr>
-            <w:tcW w:w="2129" w:type="dxa"/>
+            <w:tcW w:w="2167" w:type="dxa"/>
             <w:tcBorders/>
             <w:vAlign w:val="center"/>
           </w:tcPr>
@@ -2094,7 +1761,7 @@
         </w:tc>
         <w:tc>
           <w:tcPr>
-            <w:tcW w:w="3604" w:type="dxa"/>
+            <w:tcW w:w="3954" w:type="dxa"/>
             <w:tcBorders/>
             <w:vAlign w:val="center"/>
           </w:tcPr>
@@ -2114,7 +1781,7 @@
         </w:tc>
         <w:tc>
           <w:tcPr>
-            <w:tcW w:w="1702" w:type="dxa"/>
+            <w:tcW w:w="1711" w:type="dxa"/>
             <w:tcBorders/>
             <w:vAlign w:val="center"/>
           </w:tcPr>
@@ -2134,7 +1801,7 @@
         </w:tc>
         <w:tc>
           <w:tcPr>
-            <w:tcW w:w="3904" w:type="dxa"/>
+            <w:tcW w:w="3507" w:type="dxa"/>
             <w:tcBorders/>
             <w:vAlign w:val="center"/>
           </w:tcPr>
@@ -2157,7 +1824,7 @@
         <w:trPr/>
         <w:tc>
           <w:tcPr>
-            <w:tcW w:w="2129" w:type="dxa"/>
+            <w:tcW w:w="2167" w:type="dxa"/>
             <w:tcBorders/>
             <w:vAlign w:val="center"/>
           </w:tcPr>
@@ -2177,7 +1844,7 @@
         </w:tc>
         <w:tc>
           <w:tcPr>
-            <w:tcW w:w="3604" w:type="dxa"/>
+            <w:tcW w:w="3954" w:type="dxa"/>
             <w:tcBorders/>
             <w:vAlign w:val="center"/>
           </w:tcPr>
@@ -2197,7 +1864,7 @@
         </w:tc>
         <w:tc>
           <w:tcPr>
-            <w:tcW w:w="1702" w:type="dxa"/>
+            <w:tcW w:w="1711" w:type="dxa"/>
             <w:tcBorders/>
             <w:vAlign w:val="center"/>
           </w:tcPr>
@@ -2217,21 +1884,21 @@
         </w:tc>
         <w:tc>
           <w:tcPr>
-            <w:tcW w:w="3904" w:type="dxa"/>
-            <w:tcBorders/>
-            <w:vAlign w:val="center"/>
-          </w:tcPr>
-          <w:p>
-            <w:pPr>
-              <w:pStyle w:val="TableContents"/>
-              <w:bidi w:val="0"/>
-              <w:spacing w:before="80" w:after="140"/>
-              <w:jc w:val="start"/>
-              <w:rPr/>
-            </w:pPr>
-            <w:r>
-              <w:rPr/>
-              <w:t>Future extension; Brevo has no public sequence API</w:t>
+            <w:tcW w:w="3507" w:type="dxa"/>
+            <w:tcBorders/>
+            <w:vAlign w:val="center"/>
+          </w:tcPr>
+          <w:p>
+            <w:pPr>
+              <w:pStyle w:val="TableContents"/>
+              <w:bidi w:val="0"/>
+              <w:spacing w:before="80" w:after="140"/>
+              <w:jc w:val="start"/>
+              <w:rPr/>
+            </w:pPr>
+            <w:r>
+              <w:rPr/>
+              <w:t>Future extension</w:t>
             </w:r>
           </w:p>
         </w:tc>
@@ -2246,12 +1913,12 @@
       </w:pPr>
       <w:r>
         <w:rPr/>
-        <w:t>12. Implementation status</w:t>
+        <w:t>9. Implementation status</w:t>
       </w:r>
     </w:p>
     <w:tbl>
       <w:tblPr>
-        <w:tblW w:w="8217" w:type="dxa"/>
+        <w:tblW w:w="8427" w:type="dxa"/>
         <w:jc w:val="start"/>
         <w:tblInd w:w="0" w:type="dxa"/>
         <w:tblLayout w:type="fixed"/>
@@ -2264,7 +1931,7 @@
       </w:tblPr>
       <w:tblGrid>
         <w:gridCol w:w="4611"/>
-        <w:gridCol w:w="3606"/>
+        <w:gridCol w:w="3816"/>
       </w:tblGrid>
       <w:tr>
         <w:trPr>
@@ -2294,7 +1961,7 @@
         </w:tc>
         <w:tc>
           <w:tcPr>
-            <w:tcW w:w="3606" w:type="dxa"/>
+            <w:tcW w:w="3816" w:type="dxa"/>
             <w:tcBorders/>
             <w:vAlign w:val="center"/>
           </w:tcPr>
@@ -2339,7 +2006,7 @@
         </w:tc>
         <w:tc>
           <w:tcPr>
-            <w:tcW w:w="3606" w:type="dxa"/>
+            <w:tcW w:w="3816" w:type="dxa"/>
             <w:tcBorders/>
             <w:vAlign w:val="center"/>
           </w:tcPr>
@@ -2382,7 +2049,7 @@
         </w:tc>
         <w:tc>
           <w:tcPr>
-            <w:tcW w:w="3606" w:type="dxa"/>
+            <w:tcW w:w="3816" w:type="dxa"/>
             <w:tcBorders/>
             <w:vAlign w:val="center"/>
           </w:tcPr>
@@ -2419,13 +2086,13 @@
             </w:pPr>
             <w:r>
               <w:rPr/>
-              <w:t>Bun HTTP server and route table</w:t>
-            </w:r>
-          </w:p>
-        </w:tc>
-        <w:tc>
-          <w:tcPr>
-            <w:tcW w:w="3606" w:type="dxa"/>
+              <w:t>Client conversation machine in front-end</w:t>
+            </w:r>
+          </w:p>
+        </w:tc>
+        <w:tc>
+          <w:tcPr>
+            <w:tcW w:w="3816" w:type="dxa"/>
             <w:tcBorders/>
             <w:vAlign w:val="center"/>
           </w:tcPr>
@@ -2462,23 +2129,99 @@
             </w:pPr>
             <w:r>
               <w:rPr/>
-              <w:t xml:space="preserve">Vite </w:t>
-            </w:r>
-            <w:r>
-              <w:rPr>
-                <w:rStyle w:val="SourceText"/>
-              </w:rPr>
-              <w:t>/api</w:t>
-            </w:r>
-            <w:r>
-              <w:rPr/>
-              <w:t xml:space="preserve"> development proxy</w:t>
-            </w:r>
-          </w:p>
-        </w:tc>
-        <w:tc>
-          <w:tcPr>
-            <w:tcW w:w="3606" w:type="dxa"/>
+              <w:t>Bun API server and public routes</w:t>
+            </w:r>
+          </w:p>
+        </w:tc>
+        <w:tc>
+          <w:tcPr>
+            <w:tcW w:w="3816" w:type="dxa"/>
+            <w:tcBorders/>
+            <w:vAlign w:val="center"/>
+          </w:tcPr>
+          <w:p>
+            <w:pPr>
+              <w:pStyle w:val="TableContents"/>
+              <w:bidi w:val="0"/>
+              <w:spacing w:before="80" w:after="140"/>
+              <w:jc w:val="start"/>
+              <w:rPr/>
+            </w:pPr>
+            <w:r>
+              <w:rPr/>
+              <w:t>Implemented</w:t>
+            </w:r>
+          </w:p>
+        </w:tc>
+      </w:tr>
+      <w:tr>
+        <w:trPr/>
+        <w:tc>
+          <w:tcPr>
+            <w:tcW w:w="4611" w:type="dxa"/>
+            <w:tcBorders/>
+            <w:vAlign w:val="center"/>
+          </w:tcPr>
+          <w:p>
+            <w:pPr>
+              <w:pStyle w:val="TableContents"/>
+              <w:bidi w:val="0"/>
+              <w:spacing w:before="80" w:after="140"/>
+              <w:jc w:val="start"/>
+              <w:rPr/>
+            </w:pPr>
+            <w:r>
+              <w:rPr/>
+              <w:t>Bun workflow service and internal routes</w:t>
+            </w:r>
+          </w:p>
+        </w:tc>
+        <w:tc>
+          <w:tcPr>
+            <w:tcW w:w="3816" w:type="dxa"/>
+            <w:tcBorders/>
+            <w:vAlign w:val="center"/>
+          </w:tcPr>
+          <w:p>
+            <w:pPr>
+              <w:pStyle w:val="TableContents"/>
+              <w:bidi w:val="0"/>
+              <w:spacing w:before="80" w:after="140"/>
+              <w:jc w:val="start"/>
+              <w:rPr/>
+            </w:pPr>
+            <w:r>
+              <w:rPr/>
+              <w:t>Implemented</w:t>
+            </w:r>
+          </w:p>
+        </w:tc>
+      </w:tr>
+      <w:tr>
+        <w:trPr/>
+        <w:tc>
+          <w:tcPr>
+            <w:tcW w:w="4611" w:type="dxa"/>
+            <w:tcBorders/>
+            <w:vAlign w:val="center"/>
+          </w:tcPr>
+          <w:p>
+            <w:pPr>
+              <w:pStyle w:val="TableContents"/>
+              <w:bidi w:val="0"/>
+              <w:spacing w:before="80" w:after="140"/>
+              <w:jc w:val="start"/>
+              <w:rPr/>
+            </w:pPr>
+            <w:r>
+              <w:rPr/>
+              <w:t>API-to-workflow HTTP proxy</w:t>
+            </w:r>
+          </w:p>
+        </w:tc>
+        <w:tc>
+          <w:tcPr>
+            <w:tcW w:w="3816" w:type="dxa"/>
             <w:tcBorders/>
             <w:vAlign w:val="center"/>
           </w:tcPr>
@@ -2523,21 +2266,21 @@
         </w:tc>
         <w:tc>
           <w:tcPr>
-            <w:tcW w:w="3606" w:type="dxa"/>
-            <w:tcBorders/>
-            <w:vAlign w:val="center"/>
-          </w:tcPr>
-          <w:p>
-            <w:pPr>
-              <w:pStyle w:val="TableContents"/>
-              <w:bidi w:val="0"/>
-              <w:spacing w:before="80" w:after="140"/>
-              <w:jc w:val="start"/>
-              <w:rPr/>
-            </w:pPr>
-            <w:r>
-              <w:rPr/>
-              <w:t>Implemented (Bun API)</w:t>
+            <w:tcW w:w="3816" w:type="dxa"/>
+            <w:tcBorders/>
+            <w:vAlign w:val="center"/>
+          </w:tcPr>
+          <w:p>
+            <w:pPr>
+              <w:pStyle w:val="TableContents"/>
+              <w:bidi w:val="0"/>
+              <w:spacing w:before="80" w:after="140"/>
+              <w:jc w:val="start"/>
+              <w:rPr/>
+            </w:pPr>
+            <w:r>
+              <w:rPr/>
+              <w:t>Implemented</w:t>
             </w:r>
           </w:p>
         </w:tc>
@@ -2572,7 +2315,7 @@
         </w:tc>
         <w:tc>
           <w:tcPr>
-            <w:tcW w:w="3606" w:type="dxa"/>
+            <w:tcW w:w="3816" w:type="dxa"/>
             <w:tcBorders/>
             <w:vAlign w:val="center"/>
           </w:tcPr>
@@ -2621,7 +2364,7 @@
         </w:tc>
         <w:tc>
           <w:tcPr>
-            <w:tcW w:w="3606" w:type="dxa"/>
+            <w:tcW w:w="3816" w:type="dxa"/>
             <w:tcBorders/>
             <w:vAlign w:val="center"/>
           </w:tcPr>
@@ -2664,7 +2407,7 @@
         </w:tc>
         <w:tc>
           <w:tcPr>
-            <w:tcW w:w="3606" w:type="dxa"/>
+            <w:tcW w:w="3816" w:type="dxa"/>
             <w:tcBorders/>
             <w:vAlign w:val="center"/>
           </w:tcPr>
@@ -2707,7 +2450,7 @@
         </w:tc>
         <w:tc>
           <w:tcPr>
-            <w:tcW w:w="3606" w:type="dxa"/>
+            <w:tcW w:w="3816" w:type="dxa"/>
             <w:tcBorders/>
             <w:vAlign w:val="center"/>
           </w:tcPr>
@@ -2750,7 +2493,7 @@
         </w:tc>
         <w:tc>
           <w:tcPr>
-            <w:tcW w:w="3606" w:type="dxa"/>
+            <w:tcW w:w="3816" w:type="dxa"/>
             <w:tcBorders/>
             <w:vAlign w:val="center"/>
           </w:tcPr>
@@ -2793,7 +2536,7 @@
         </w:tc>
         <w:tc>
           <w:tcPr>
-            <w:tcW w:w="3606" w:type="dxa"/>
+            <w:tcW w:w="3816" w:type="dxa"/>
             <w:tcBorders/>
             <w:vAlign w:val="center"/>
           </w:tcPr>
@@ -2836,7 +2579,7 @@
         </w:tc>
         <w:tc>
           <w:tcPr>
-            <w:tcW w:w="3606" w:type="dxa"/>
+            <w:tcW w:w="3816" w:type="dxa"/>
             <w:tcBorders/>
             <w:vAlign w:val="center"/>
           </w:tcPr>
@@ -2879,50 +2622,7 @@
         </w:tc>
         <w:tc>
           <w:tcPr>
-            <w:tcW w:w="3606" w:type="dxa"/>
-            <w:tcBorders/>
-            <w:vAlign w:val="center"/>
-          </w:tcPr>
-          <w:p>
-            <w:pPr>
-              <w:pStyle w:val="TableContents"/>
-              <w:bidi w:val="0"/>
-              <w:spacing w:before="80" w:after="140"/>
-              <w:jc w:val="start"/>
-              <w:rPr/>
-            </w:pPr>
-            <w:r>
-              <w:rPr/>
-              <w:t>Implemented</w:t>
-            </w:r>
-          </w:p>
-        </w:tc>
-      </w:tr>
-      <w:tr>
-        <w:trPr/>
-        <w:tc>
-          <w:tcPr>
-            <w:tcW w:w="4611" w:type="dxa"/>
-            <w:tcBorders/>
-            <w:vAlign w:val="center"/>
-          </w:tcPr>
-          <w:p>
-            <w:pPr>
-              <w:pStyle w:val="TableContents"/>
-              <w:bidi w:val="0"/>
-              <w:spacing w:before="80" w:after="140"/>
-              <w:jc w:val="start"/>
-              <w:rPr/>
-            </w:pPr>
-            <w:r>
-              <w:rPr/>
-              <w:t>Local option resolution</w:t>
-            </w:r>
-          </w:p>
-        </w:tc>
-        <w:tc>
-          <w:tcPr>
-            <w:tcW w:w="3606" w:type="dxa"/>
+            <w:tcW w:w="3816" w:type="dxa"/>
             <w:tcBorders/>
             <w:vAlign w:val="center"/>
           </w:tcPr>
@@ -2975,7 +2675,7 @@
         </w:tc>
         <w:tc>
           <w:tcPr>
-            <w:tcW w:w="3606" w:type="dxa"/>
+            <w:tcW w:w="3816" w:type="dxa"/>
             <w:tcBorders/>
             <w:vAlign w:val="center"/>
           </w:tcPr>
@@ -3018,7 +2718,7 @@
         </w:tc>
         <w:tc>
           <w:tcPr>
-            <w:tcW w:w="3606" w:type="dxa"/>
+            <w:tcW w:w="3816" w:type="dxa"/>
             <w:tcBorders/>
             <w:vAlign w:val="center"/>
           </w:tcPr>
@@ -3061,7 +2761,7 @@
         </w:tc>
         <w:tc>
           <w:tcPr>
-            <w:tcW w:w="3606" w:type="dxa"/>
+            <w:tcW w:w="3816" w:type="dxa"/>
             <w:tcBorders/>
             <w:vAlign w:val="center"/>
           </w:tcPr>
@@ -3106,21 +2806,21 @@
         </w:tc>
         <w:tc>
           <w:tcPr>
-            <w:tcW w:w="3606" w:type="dxa"/>
-            <w:tcBorders/>
-            <w:vAlign w:val="center"/>
-          </w:tcPr>
-          <w:p>
-            <w:pPr>
-              <w:pStyle w:val="TableContents"/>
-              <w:bidi w:val="0"/>
-              <w:spacing w:before="80" w:after="140"/>
-              <w:jc w:val="start"/>
-              <w:rPr/>
-            </w:pPr>
-            <w:r>
-              <w:rPr/>
-              <w:t>Implemented (Bun API)</w:t>
+            <w:tcW w:w="3816" w:type="dxa"/>
+            <w:tcBorders/>
+            <w:vAlign w:val="center"/>
+          </w:tcPr>
+          <w:p>
+            <w:pPr>
+              <w:pStyle w:val="TableContents"/>
+              <w:bidi w:val="0"/>
+              <w:spacing w:before="80" w:after="140"/>
+              <w:jc w:val="start"/>
+              <w:rPr/>
+            </w:pPr>
+            <w:r>
+              <w:rPr/>
+              <w:t>Implemented</w:t>
             </w:r>
           </w:p>
         </w:tc>
@@ -3151,21 +2851,21 @@
         </w:tc>
         <w:tc>
           <w:tcPr>
-            <w:tcW w:w="3606" w:type="dxa"/>
-            <w:tcBorders/>
-            <w:vAlign w:val="center"/>
-          </w:tcPr>
-          <w:p>
-            <w:pPr>
-              <w:pStyle w:val="TableContents"/>
-              <w:bidi w:val="0"/>
-              <w:spacing w:before="80" w:after="140"/>
-              <w:jc w:val="start"/>
-              <w:rPr/>
-            </w:pPr>
-            <w:r>
-              <w:rPr/>
-              <w:t>Implemented (Bun API)</w:t>
+            <w:tcW w:w="3816" w:type="dxa"/>
+            <w:tcBorders/>
+            <w:vAlign w:val="center"/>
+          </w:tcPr>
+          <w:p>
+            <w:pPr>
+              <w:pStyle w:val="TableContents"/>
+              <w:bidi w:val="0"/>
+              <w:spacing w:before="80" w:after="140"/>
+              <w:jc w:val="start"/>
+              <w:rPr/>
+            </w:pPr>
+            <w:r>
+              <w:rPr/>
+              <w:t>Implemented</w:t>
             </w:r>
           </w:p>
         </w:tc>
@@ -3187,30 +2887,28 @@
               <w:rPr/>
             </w:pPr>
             <w:r>
-              <w:rPr>
-                <w:rStyle w:val="SourceText"/>
-              </w:rPr>
-              <w:t>GET /health</w:t>
-            </w:r>
-          </w:p>
-        </w:tc>
-        <w:tc>
-          <w:tcPr>
-            <w:tcW w:w="3606" w:type="dxa"/>
-            <w:tcBorders/>
-            <w:vAlign w:val="center"/>
-          </w:tcPr>
-          <w:p>
-            <w:pPr>
-              <w:pStyle w:val="TableContents"/>
-              <w:bidi w:val="0"/>
-              <w:spacing w:before="80" w:after="140"/>
-              <w:jc w:val="start"/>
-              <w:rPr/>
-            </w:pPr>
-            <w:r>
-              <w:rPr/>
-              <w:t>Implemented (Bun API)</w:t>
+              <w:rPr/>
+              <w:t>In-memory workflow queue</w:t>
+            </w:r>
+          </w:p>
+        </w:tc>
+        <w:tc>
+          <w:tcPr>
+            <w:tcW w:w="3816" w:type="dxa"/>
+            <w:tcBorders/>
+            <w:vAlign w:val="center"/>
+          </w:tcPr>
+          <w:p>
+            <w:pPr>
+              <w:pStyle w:val="TableContents"/>
+              <w:bidi w:val="0"/>
+              <w:spacing w:before="80" w:after="140"/>
+              <w:jc w:val="start"/>
+              <w:rPr/>
+            </w:pPr>
+            <w:r>
+              <w:rPr/>
+              <w:t>Implemented in the workflow service</w:t>
             </w:r>
           </w:p>
         </w:tc>
@@ -3233,56 +2931,13 @@
             </w:pPr>
             <w:r>
               <w:rPr/>
-              <w:t>In-memory workflow queue</w:t>
-            </w:r>
-          </w:p>
-        </w:tc>
-        <w:tc>
-          <w:tcPr>
-            <w:tcW w:w="3606" w:type="dxa"/>
-            <w:tcBorders/>
-            <w:vAlign w:val="center"/>
-          </w:tcPr>
-          <w:p>
-            <w:pPr>
-              <w:pStyle w:val="TableContents"/>
-              <w:bidi w:val="0"/>
-              <w:spacing w:before="80" w:after="140"/>
-              <w:jc w:val="start"/>
-              <w:rPr/>
-            </w:pPr>
-            <w:r>
-              <w:rPr/>
-              <w:t>Implemented</w:t>
-            </w:r>
-          </w:p>
-        </w:tc>
-      </w:tr>
-      <w:tr>
-        <w:trPr/>
-        <w:tc>
-          <w:tcPr>
-            <w:tcW w:w="4611" w:type="dxa"/>
-            <w:tcBorders/>
-            <w:vAlign w:val="center"/>
-          </w:tcPr>
-          <w:p>
-            <w:pPr>
-              <w:pStyle w:val="TableContents"/>
-              <w:bidi w:val="0"/>
-              <w:spacing w:before="80" w:after="140"/>
-              <w:jc w:val="start"/>
-              <w:rPr/>
-            </w:pPr>
-            <w:r>
-              <w:rPr/>
-              <w:t>Server-side root XState machine</w:t>
-            </w:r>
-          </w:p>
-        </w:tc>
-        <w:tc>
-          <w:tcPr>
-            <w:tcW w:w="3606" w:type="dxa"/>
+              <w:t>Main workflow machine</w:t>
+            </w:r>
+          </w:p>
+        </w:tc>
+        <w:tc>
+          <w:tcPr>
+            <w:tcW w:w="3816" w:type="dxa"/>
             <w:tcBorders/>
             <w:vAlign w:val="center"/>
           </w:tcPr>
@@ -3331,7 +2986,7 @@
         </w:tc>
         <w:tc>
           <w:tcPr>
-            <w:tcW w:w="3606" w:type="dxa"/>
+            <w:tcW w:w="3816" w:type="dxa"/>
             <w:tcBorders/>
             <w:vAlign w:val="center"/>
           </w:tcPr>
@@ -3374,13 +3029,13 @@
             </w:r>
             <w:r>
               <w:rPr/>
-              <w:t xml:space="preserve"> root state</w:t>
-            </w:r>
-          </w:p>
-        </w:tc>
-        <w:tc>
-          <w:tcPr>
-            <w:tcW w:w="3606" w:type="dxa"/>
+              <w:t xml:space="preserve"> actor</w:t>
+            </w:r>
+          </w:p>
+        </w:tc>
+        <w:tc>
+          <w:tcPr>
+            <w:tcW w:w="3816" w:type="dxa"/>
             <w:tcBorders/>
             <w:vAlign w:val="center"/>
           </w:tcPr>
@@ -3433,7 +3088,7 @@
         </w:tc>
         <w:tc>
           <w:tcPr>
-            <w:tcW w:w="3606" w:type="dxa"/>
+            <w:tcW w:w="3816" w:type="dxa"/>
             <w:tcBorders/>
             <w:vAlign w:val="center"/>
           </w:tcPr>
@@ -3476,7 +3131,7 @@
         </w:tc>
         <w:tc>
           <w:tcPr>
-            <w:tcW w:w="3606" w:type="dxa"/>
+            <w:tcW w:w="3816" w:type="dxa"/>
             <w:tcBorders/>
             <w:vAlign w:val="center"/>
           </w:tcPr>
@@ -3519,7 +3174,7 @@
               <w:rPr>
                 <w:rStyle w:val="SourceText"/>
               </w:rPr>
-              <w:t>POST /api/email</w:t>
+              <w:t>/api/email</w:t>
             </w:r>
             <w:r>
               <w:rPr/>
@@ -3529,21 +3184,21 @@
         </w:tc>
         <w:tc>
           <w:tcPr>
-            <w:tcW w:w="3606" w:type="dxa"/>
-            <w:tcBorders/>
-            <w:vAlign w:val="center"/>
-          </w:tcPr>
-          <w:p>
-            <w:pPr>
-              <w:pStyle w:val="TableContents"/>
-              <w:bidi w:val="0"/>
-              <w:spacing w:before="80" w:after="140"/>
-              <w:jc w:val="start"/>
-              <w:rPr/>
-            </w:pPr>
-            <w:r>
-              <w:rPr/>
-              <w:t>Implemented (Bun API)</w:t>
+            <w:tcW w:w="3816" w:type="dxa"/>
+            <w:tcBorders/>
+            <w:vAlign w:val="center"/>
+          </w:tcPr>
+          <w:p>
+            <w:pPr>
+              <w:pStyle w:val="TableContents"/>
+              <w:bidi w:val="0"/>
+              <w:spacing w:before="80" w:after="140"/>
+              <w:jc w:val="start"/>
+              <w:rPr/>
+            </w:pPr>
+            <w:r>
+              <w:rPr/>
+              <w:t>Implemented; proxied</w:t>
             </w:r>
           </w:p>
         </w:tc>
@@ -3572,7 +3227,7 @@
         </w:tc>
         <w:tc>
           <w:tcPr>
-            <w:tcW w:w="3606" w:type="dxa"/>
+            <w:tcW w:w="3816" w:type="dxa"/>
             <w:tcBorders/>
             <w:vAlign w:val="center"/>
           </w:tcPr>
@@ -3615,7 +3270,7 @@
         </w:tc>
         <w:tc>
           <w:tcPr>
-            <w:tcW w:w="3606" w:type="dxa"/>
+            <w:tcW w:w="3816" w:type="dxa"/>
             <w:tcBorders/>
             <w:vAlign w:val="center"/>
           </w:tcPr>
@@ -3658,7 +3313,7 @@
         </w:tc>
         <w:tc>
           <w:tcPr>
-            <w:tcW w:w="3606" w:type="dxa"/>
+            <w:tcW w:w="3816" w:type="dxa"/>
             <w:tcBorders/>
             <w:vAlign w:val="center"/>
           </w:tcPr>
@@ -3701,7 +3356,7 @@
         </w:tc>
         <w:tc>
           <w:tcPr>
-            <w:tcW w:w="3606" w:type="dxa"/>
+            <w:tcW w:w="3816" w:type="dxa"/>
             <w:tcBorders/>
             <w:vAlign w:val="center"/>
           </w:tcPr>
@@ -3744,7 +3399,7 @@
         </w:tc>
         <w:tc>
           <w:tcPr>
-            <w:tcW w:w="3606" w:type="dxa"/>
+            <w:tcW w:w="3816" w:type="dxa"/>
             <w:tcBorders/>
             <w:vAlign w:val="center"/>
           </w:tcPr>
@@ -3781,56 +3436,13 @@
             </w:pPr>
             <w:r>
               <w:rPr/>
-              <w:t>Sequence execution</w:t>
-            </w:r>
-          </w:p>
-        </w:tc>
-        <w:tc>
-          <w:tcPr>
-            <w:tcW w:w="3606" w:type="dxa"/>
-            <w:tcBorders/>
-            <w:vAlign w:val="center"/>
-          </w:tcPr>
-          <w:p>
-            <w:pPr>
-              <w:pStyle w:val="TableContents"/>
-              <w:bidi w:val="0"/>
-              <w:spacing w:before="80" w:after="140"/>
-              <w:jc w:val="start"/>
-              <w:rPr/>
-            </w:pPr>
-            <w:r>
-              <w:rPr/>
-              <w:t>Not implemented</w:t>
-            </w:r>
-          </w:p>
-        </w:tc>
-      </w:tr>
-      <w:tr>
-        <w:trPr/>
-        <w:tc>
-          <w:tcPr>
-            <w:tcW w:w="4611" w:type="dxa"/>
-            <w:tcBorders/>
-            <w:vAlign w:val="center"/>
-          </w:tcPr>
-          <w:p>
-            <w:pPr>
-              <w:pStyle w:val="TableContents"/>
-              <w:bidi w:val="0"/>
-              <w:spacing w:before="80" w:after="140"/>
-              <w:jc w:val="start"/>
-              <w:rPr/>
-            </w:pPr>
-            <w:r>
-              <w:rPr/>
               <w:t>Server-side authentication</w:t>
             </w:r>
           </w:p>
         </w:tc>
         <w:tc>
           <w:tcPr>
-            <w:tcW w:w="3606" w:type="dxa"/>
+            <w:tcW w:w="3816" w:type="dxa"/>
             <w:tcBorders/>
             <w:vAlign w:val="center"/>
           </w:tcPr>
@@ -3859,7 +3471,7 @@
       </w:pPr>
       <w:r>
         <w:rPr/>
-        <w:t>13. Endpoint inventory</w:t>
+        <w:t>10. Endpoint inventory</w:t>
       </w:r>
     </w:p>
     <w:p>
@@ -3871,17 +3483,7 @@
       </w:pPr>
       <w:r>
         <w:rPr/>
-        <w:t xml:space="preserve">All endpoints are served by the Bun API on </w:t>
-      </w:r>
-      <w:r>
-        <w:rPr>
-          <w:rStyle w:val="SourceText"/>
-        </w:rPr>
-        <w:t>HOST:PORT</w:t>
-      </w:r>
-      <w:r>
-        <w:rPr/>
-        <w:t xml:space="preserve"> (default </w:t>
+        <w:t xml:space="preserve">Public API server, default </w:t>
       </w:r>
       <w:r>
         <w:rPr>
@@ -3891,22 +3493,12 @@
       </w:r>
       <w:r>
         <w:rPr/>
-        <w:t xml:space="preserve">). In development, Astro proxies </w:t>
-      </w:r>
-      <w:r>
-        <w:rPr>
-          <w:rStyle w:val="SourceText"/>
-        </w:rPr>
-        <w:t>/api</w:t>
-      </w:r>
-      <w:r>
-        <w:rPr/>
-        <w:t xml:space="preserve"> to it.</w:t>
+        <w:t>:</w:t>
       </w:r>
     </w:p>
     <w:tbl>
       <w:tblPr>
-        <w:tblW w:w="10803" w:type="dxa"/>
+        <w:tblW w:w="8178" w:type="dxa"/>
         <w:jc w:val="start"/>
         <w:tblInd w:w="0" w:type="dxa"/>
         <w:tblLayout w:type="fixed"/>
@@ -3920,7 +3512,7 @@
       <w:tblGrid>
         <w:gridCol w:w="3711"/>
         <w:gridCol w:w="1521"/>
-        <w:gridCol w:w="5571"/>
+        <w:gridCol w:w="2946"/>
       </w:tblGrid>
       <w:tr>
         <w:trPr>
@@ -3972,7 +3564,7 @@
         </w:tc>
         <w:tc>
           <w:tcPr>
-            <w:tcW w:w="5571" w:type="dxa"/>
+            <w:tcW w:w="2946" w:type="dxa"/>
             <w:tcBorders/>
             <w:vAlign w:val="center"/>
           </w:tcPr>
@@ -4039,21 +3631,21 @@
         </w:tc>
         <w:tc>
           <w:tcPr>
-            <w:tcW w:w="5571" w:type="dxa"/>
-            <w:tcBorders/>
-            <w:vAlign w:val="center"/>
-          </w:tcPr>
-          <w:p>
-            <w:pPr>
-              <w:pStyle w:val="TableContents"/>
-              <w:bidi w:val="0"/>
-              <w:spacing w:before="80" w:after="140"/>
-              <w:jc w:val="start"/>
-              <w:rPr/>
-            </w:pPr>
-            <w:r>
-              <w:rPr/>
-              <w:t>Bun API health check</w:t>
+            <w:tcW w:w="2946" w:type="dxa"/>
+            <w:tcBorders/>
+            <w:vAlign w:val="center"/>
+          </w:tcPr>
+          <w:p>
+            <w:pPr>
+              <w:pStyle w:val="TableContents"/>
+              <w:bidi w:val="0"/>
+              <w:spacing w:before="80" w:after="140"/>
+              <w:jc w:val="start"/>
+              <w:rPr/>
+            </w:pPr>
+            <w:r>
+              <w:rPr/>
+              <w:t>API server health</w:t>
             </w:r>
           </w:p>
         </w:tc>
@@ -4104,86 +3696,21 @@
         </w:tc>
         <w:tc>
           <w:tcPr>
-            <w:tcW w:w="5571" w:type="dxa"/>
-            <w:tcBorders/>
-            <w:vAlign w:val="center"/>
-          </w:tcPr>
-          <w:p>
-            <w:pPr>
-              <w:pStyle w:val="TableContents"/>
-              <w:bidi w:val="0"/>
-              <w:spacing w:before="80" w:after="140"/>
-              <w:jc w:val="start"/>
-              <w:rPr/>
-            </w:pPr>
-            <w:r>
-              <w:rPr/>
-              <w:t>Identify an action from a chat message</w:t>
-            </w:r>
-          </w:p>
-        </w:tc>
-      </w:tr>
-      <w:tr>
-        <w:trPr/>
-        <w:tc>
-          <w:tcPr>
-            <w:tcW w:w="3711" w:type="dxa"/>
-            <w:tcBorders/>
-            <w:vAlign w:val="center"/>
-          </w:tcPr>
-          <w:p>
-            <w:pPr>
-              <w:pStyle w:val="TableContents"/>
-              <w:bidi w:val="0"/>
-              <w:spacing w:before="80" w:after="140"/>
-              <w:jc w:val="start"/>
-              <w:rPr/>
-            </w:pPr>
-            <w:r>
-              <w:rPr>
-                <w:rStyle w:val="SourceText"/>
-              </w:rPr>
-              <w:t>POST /api/chat/action/resolve</w:t>
-            </w:r>
-          </w:p>
-        </w:tc>
-        <w:tc>
-          <w:tcPr>
-            <w:tcW w:w="1521" w:type="dxa"/>
-            <w:tcBorders/>
-            <w:vAlign w:val="center"/>
-          </w:tcPr>
-          <w:p>
-            <w:pPr>
-              <w:pStyle w:val="TableContents"/>
-              <w:bidi w:val="0"/>
-              <w:spacing w:before="80" w:after="140"/>
-              <w:jc w:val="start"/>
-              <w:rPr/>
-            </w:pPr>
-            <w:r>
-              <w:rPr/>
-              <w:t>Removed</w:t>
-            </w:r>
-          </w:p>
-        </w:tc>
-        <w:tc>
-          <w:tcPr>
-            <w:tcW w:w="5571" w:type="dxa"/>
-            <w:tcBorders/>
-            <w:vAlign w:val="center"/>
-          </w:tcPr>
-          <w:p>
-            <w:pPr>
-              <w:pStyle w:val="TableContents"/>
-              <w:bidi w:val="0"/>
-              <w:spacing w:before="80" w:after="140"/>
-              <w:jc w:val="start"/>
-              <w:rPr/>
-            </w:pPr>
-            <w:r>
-              <w:rPr/>
-              <w:t>Previously resolved a selected option</w:t>
+            <w:tcW w:w="2946" w:type="dxa"/>
+            <w:tcBorders/>
+            <w:vAlign w:val="center"/>
+          </w:tcPr>
+          <w:p>
+            <w:pPr>
+              <w:pStyle w:val="TableContents"/>
+              <w:bidi w:val="0"/>
+              <w:spacing w:before="80" w:after="140"/>
+              <w:jc w:val="start"/>
+              <w:rPr/>
+            </w:pPr>
+            <w:r>
+              <w:rPr/>
+              <w:t>Identify an action</w:t>
             </w:r>
           </w:p>
         </w:tc>
@@ -4234,21 +3761,21 @@
         </w:tc>
         <w:tc>
           <w:tcPr>
-            <w:tcW w:w="5571" w:type="dxa"/>
-            <w:tcBorders/>
-            <w:vAlign w:val="center"/>
-          </w:tcPr>
-          <w:p>
-            <w:pPr>
-              <w:pStyle w:val="TableContents"/>
-              <w:bidi w:val="0"/>
-              <w:spacing w:before="80" w:after="140"/>
-              <w:jc w:val="start"/>
-              <w:rPr/>
-            </w:pPr>
-            <w:r>
-              <w:rPr/>
-              <w:t>Validate and enqueue a confirmed action</w:t>
+            <w:tcW w:w="2946" w:type="dxa"/>
+            <w:tcBorders/>
+            <w:vAlign w:val="center"/>
+          </w:tcPr>
+          <w:p>
+            <w:pPr>
+              <w:pStyle w:val="TableContents"/>
+              <w:bidi w:val="0"/>
+              <w:spacing w:before="80" w:after="140"/>
+              <w:jc w:val="start"/>
+              <w:rPr/>
+            </w:pPr>
+            <w:r>
+              <w:rPr/>
+              <w:t>Validate and proxy enqueue</w:t>
             </w:r>
           </w:p>
         </w:tc>
@@ -4299,21 +3826,21 @@
         </w:tc>
         <w:tc>
           <w:tcPr>
-            <w:tcW w:w="5571" w:type="dxa"/>
-            <w:tcBorders/>
-            <w:vAlign w:val="center"/>
-          </w:tcPr>
-          <w:p>
-            <w:pPr>
-              <w:pStyle w:val="TableContents"/>
-              <w:bidi w:val="0"/>
-              <w:spacing w:before="80" w:after="140"/>
-              <w:jc w:val="start"/>
-              <w:rPr/>
-            </w:pPr>
-            <w:r>
-              <w:rPr/>
-              <w:t>Read workflow job status and result</w:t>
+            <w:tcW w:w="2946" w:type="dxa"/>
+            <w:tcBorders/>
+            <w:vAlign w:val="center"/>
+          </w:tcPr>
+          <w:p>
+            <w:pPr>
+              <w:pStyle w:val="TableContents"/>
+              <w:bidi w:val="0"/>
+              <w:spacing w:before="80" w:after="140"/>
+              <w:jc w:val="start"/>
+              <w:rPr/>
+            </w:pPr>
+            <w:r>
+              <w:rPr/>
+              <w:t>Proxy job status</w:t>
             </w:r>
           </w:p>
         </w:tc>
@@ -4364,30 +3891,142 @@
         </w:tc>
         <w:tc>
           <w:tcPr>
-            <w:tcW w:w="5571" w:type="dxa"/>
-            <w:tcBorders/>
-            <w:vAlign w:val="center"/>
-          </w:tcPr>
-          <w:p>
-            <w:pPr>
-              <w:pStyle w:val="TableContents"/>
-              <w:bidi w:val="0"/>
-              <w:spacing w:before="80" w:after="140"/>
-              <w:jc w:val="start"/>
-              <w:rPr/>
-            </w:pPr>
-            <w:r>
-              <w:rPr/>
-              <w:t>Direct debug send through Brevo, bypassing the queue</w:t>
-            </w:r>
-          </w:p>
-        </w:tc>
-      </w:tr>
-      <w:tr>
-        <w:trPr/>
-        <w:tc>
-          <w:tcPr>
-            <w:tcW w:w="3711" w:type="dxa"/>
+            <w:tcW w:w="2946" w:type="dxa"/>
+            <w:tcBorders/>
+            <w:vAlign w:val="center"/>
+          </w:tcPr>
+          <w:p>
+            <w:pPr>
+              <w:pStyle w:val="TableContents"/>
+              <w:bidi w:val="0"/>
+              <w:spacing w:before="80" w:after="140"/>
+              <w:jc w:val="start"/>
+              <w:rPr/>
+            </w:pPr>
+            <w:r>
+              <w:rPr/>
+              <w:t>Proxy direct debug send</w:t>
+            </w:r>
+          </w:p>
+        </w:tc>
+      </w:tr>
+    </w:tbl>
+    <w:p>
+      <w:pPr>
+        <w:pStyle w:val="BodyText"/>
+        <w:bidi w:val="0"/>
+        <w:jc w:val="start"/>
+        <w:rPr/>
+      </w:pPr>
+      <w:r>
+        <w:rPr/>
+        <w:t xml:space="preserve">Internal workflow service, default </w:t>
+      </w:r>
+      <w:r>
+        <w:rPr>
+          <w:rStyle w:val="SourceText"/>
+        </w:rPr>
+        <w:t>127.0.0.1:3002</w:t>
+      </w:r>
+      <w:r>
+        <w:rPr/>
+        <w:t>:</w:t>
+      </w:r>
+    </w:p>
+    <w:tbl>
+      <w:tblPr>
+        <w:tblW w:w="8733" w:type="dxa"/>
+        <w:jc w:val="start"/>
+        <w:tblInd w:w="0" w:type="dxa"/>
+        <w:tblLayout w:type="fixed"/>
+        <w:tblCellMar>
+          <w:top w:w="28" w:type="dxa"/>
+          <w:start w:w="28" w:type="dxa"/>
+          <w:bottom w:w="28" w:type="dxa"/>
+          <w:end w:w="28" w:type="dxa"/>
+        </w:tblCellMar>
+      </w:tblPr>
+      <w:tblGrid>
+        <w:gridCol w:w="4266"/>
+        <w:gridCol w:w="1521"/>
+        <w:gridCol w:w="2946"/>
+      </w:tblGrid>
+      <w:tr>
+        <w:trPr>
+          <w:tblHeader w:val="true"/>
+        </w:trPr>
+        <w:tc>
+          <w:tcPr>
+            <w:tcW w:w="4266" w:type="dxa"/>
+            <w:tcBorders/>
+            <w:vAlign w:val="center"/>
+          </w:tcPr>
+          <w:p>
+            <w:pPr>
+              <w:pStyle w:val="TableHeading"/>
+              <w:suppressLineNumbers/>
+              <w:shd w:fill="F3F4F6" w:val="clear"/>
+              <w:bidi w:val="0"/>
+              <w:spacing w:before="80" w:after="140"/>
+              <w:jc w:val="start"/>
+              <w:rPr/>
+            </w:pPr>
+            <w:r>
+              <w:rPr/>
+              <w:t>Endpoint</w:t>
+            </w:r>
+          </w:p>
+        </w:tc>
+        <w:tc>
+          <w:tcPr>
+            <w:tcW w:w="1521" w:type="dxa"/>
+            <w:tcBorders/>
+            <w:vAlign w:val="center"/>
+          </w:tcPr>
+          <w:p>
+            <w:pPr>
+              <w:pStyle w:val="TableHeading"/>
+              <w:suppressLineNumbers/>
+              <w:shd w:fill="F3F4F6" w:val="clear"/>
+              <w:bidi w:val="0"/>
+              <w:spacing w:before="80" w:after="140"/>
+              <w:jc w:val="start"/>
+              <w:rPr/>
+            </w:pPr>
+            <w:r>
+              <w:rPr/>
+              <w:t>Status</w:t>
+            </w:r>
+          </w:p>
+        </w:tc>
+        <w:tc>
+          <w:tcPr>
+            <w:tcW w:w="2946" w:type="dxa"/>
+            <w:tcBorders/>
+            <w:vAlign w:val="center"/>
+          </w:tcPr>
+          <w:p>
+            <w:pPr>
+              <w:pStyle w:val="TableHeading"/>
+              <w:suppressLineNumbers/>
+              <w:shd w:fill="F3F4F6" w:val="clear"/>
+              <w:bidi w:val="0"/>
+              <w:spacing w:before="80" w:after="140"/>
+              <w:jc w:val="start"/>
+              <w:rPr/>
+            </w:pPr>
+            <w:r>
+              <w:rPr/>
+              <w:t>Purpose</w:t>
+            </w:r>
+          </w:p>
+        </w:tc>
+      </w:tr>
+      <w:tr>
+        <w:trPr/>
+        <w:tc>
+          <w:tcPr>
+            <w:tcW w:w="4266" w:type="dxa"/>
             <w:tcBorders/>
             <w:vAlign w:val="center"/>
           </w:tcPr>
@@ -4403,7 +4042,7 @@
               <w:rPr>
                 <w:rStyle w:val="SourceText"/>
               </w:rPr>
-              <w:t>POST /api/email/schedule</w:t>
+              <w:t>GET /health</w:t>
             </w:r>
           </w:p>
         </w:tc>
@@ -4423,36 +4062,36 @@
             </w:pPr>
             <w:r>
               <w:rPr/>
-              <w:t>Planned</w:t>
-            </w:r>
-          </w:p>
-        </w:tc>
-        <w:tc>
-          <w:tcPr>
-            <w:tcW w:w="5571" w:type="dxa"/>
-            <w:tcBorders/>
-            <w:vAlign w:val="center"/>
-          </w:tcPr>
-          <w:p>
-            <w:pPr>
-              <w:pStyle w:val="TableContents"/>
-              <w:bidi w:val="0"/>
-              <w:spacing w:before="80" w:after="140"/>
-              <w:jc w:val="start"/>
-              <w:rPr/>
-            </w:pPr>
-            <w:r>
-              <w:rPr/>
-              <w:t>Real scheduled delivery</w:t>
-            </w:r>
-          </w:p>
-        </w:tc>
-      </w:tr>
-      <w:tr>
-        <w:trPr/>
-        <w:tc>
-          <w:tcPr>
-            <w:tcW w:w="3711" w:type="dxa"/>
+              <w:t>Implemented</w:t>
+            </w:r>
+          </w:p>
+        </w:tc>
+        <w:tc>
+          <w:tcPr>
+            <w:tcW w:w="2946" w:type="dxa"/>
+            <w:tcBorders/>
+            <w:vAlign w:val="center"/>
+          </w:tcPr>
+          <w:p>
+            <w:pPr>
+              <w:pStyle w:val="TableContents"/>
+              <w:bidi w:val="0"/>
+              <w:spacing w:before="80" w:after="140"/>
+              <w:jc w:val="start"/>
+              <w:rPr/>
+            </w:pPr>
+            <w:r>
+              <w:rPr/>
+              <w:t>Workflow service health</w:t>
+            </w:r>
+          </w:p>
+        </w:tc>
+      </w:tr>
+      <w:tr>
+        <w:trPr/>
+        <w:tc>
+          <w:tcPr>
+            <w:tcW w:w="4266" w:type="dxa"/>
             <w:tcBorders/>
             <w:vAlign w:val="center"/>
           </w:tcPr>
@@ -4468,7 +4107,7 @@
               <w:rPr>
                 <w:rStyle w:val="SourceText"/>
               </w:rPr>
-              <w:t>GET /api/events</w:t>
+              <w:t>POST /internal/workflow/events</w:t>
             </w:r>
           </w:p>
         </w:tc>
@@ -4488,27 +4127,157 @@
             </w:pPr>
             <w:r>
               <w:rPr/>
-              <w:t>Not present</w:t>
-            </w:r>
-          </w:p>
-        </w:tc>
-        <w:tc>
-          <w:tcPr>
-            <w:tcW w:w="5571" w:type="dxa"/>
-            <w:tcBorders/>
-            <w:vAlign w:val="center"/>
-          </w:tcPr>
-          <w:p>
-            <w:pPr>
-              <w:pStyle w:val="TableContents"/>
-              <w:bidi w:val="0"/>
-              <w:spacing w:before="80" w:after="140"/>
-              <w:jc w:val="start"/>
-              <w:rPr/>
-            </w:pPr>
-            <w:r>
-              <w:rPr/>
-              <w:t>Event inspection used to be exposed</w:t>
+              <w:t>Implemented</w:t>
+            </w:r>
+          </w:p>
+        </w:tc>
+        <w:tc>
+          <w:tcPr>
+            <w:tcW w:w="2946" w:type="dxa"/>
+            <w:tcBorders/>
+            <w:vAlign w:val="center"/>
+          </w:tcPr>
+          <w:p>
+            <w:pPr>
+              <w:pStyle w:val="TableContents"/>
+              <w:bidi w:val="0"/>
+              <w:spacing w:before="80" w:after="140"/>
+              <w:jc w:val="start"/>
+              <w:rPr/>
+            </w:pPr>
+            <w:r>
+              <w:rPr/>
+              <w:t>Enqueue a confirmed action</w:t>
+            </w:r>
+          </w:p>
+        </w:tc>
+      </w:tr>
+      <w:tr>
+        <w:trPr/>
+        <w:tc>
+          <w:tcPr>
+            <w:tcW w:w="4266" w:type="dxa"/>
+            <w:tcBorders/>
+            <w:vAlign w:val="center"/>
+          </w:tcPr>
+          <w:p>
+            <w:pPr>
+              <w:pStyle w:val="TableContents"/>
+              <w:bidi w:val="0"/>
+              <w:spacing w:before="80" w:after="140"/>
+              <w:jc w:val="start"/>
+              <w:rPr/>
+            </w:pPr>
+            <w:r>
+              <w:rPr>
+                <w:rStyle w:val="SourceText"/>
+              </w:rPr>
+              <w:t>GET /internal/workflow/events/:eventId</w:t>
+            </w:r>
+          </w:p>
+        </w:tc>
+        <w:tc>
+          <w:tcPr>
+            <w:tcW w:w="1521" w:type="dxa"/>
+            <w:tcBorders/>
+            <w:vAlign w:val="center"/>
+          </w:tcPr>
+          <w:p>
+            <w:pPr>
+              <w:pStyle w:val="TableContents"/>
+              <w:bidi w:val="0"/>
+              <w:spacing w:before="80" w:after="140"/>
+              <w:jc w:val="start"/>
+              <w:rPr/>
+            </w:pPr>
+            <w:r>
+              <w:rPr/>
+              <w:t>Implemented</w:t>
+            </w:r>
+          </w:p>
+        </w:tc>
+        <w:tc>
+          <w:tcPr>
+            <w:tcW w:w="2946" w:type="dxa"/>
+            <w:tcBorders/>
+            <w:vAlign w:val="center"/>
+          </w:tcPr>
+          <w:p>
+            <w:pPr>
+              <w:pStyle w:val="TableContents"/>
+              <w:bidi w:val="0"/>
+              <w:spacing w:before="80" w:after="140"/>
+              <w:jc w:val="start"/>
+              <w:rPr/>
+            </w:pPr>
+            <w:r>
+              <w:rPr/>
+              <w:t>Read job status</w:t>
+            </w:r>
+          </w:p>
+        </w:tc>
+      </w:tr>
+      <w:tr>
+        <w:trPr/>
+        <w:tc>
+          <w:tcPr>
+            <w:tcW w:w="4266" w:type="dxa"/>
+            <w:tcBorders/>
+            <w:vAlign w:val="center"/>
+          </w:tcPr>
+          <w:p>
+            <w:pPr>
+              <w:pStyle w:val="TableContents"/>
+              <w:bidi w:val="0"/>
+              <w:spacing w:before="80" w:after="140"/>
+              <w:jc w:val="start"/>
+              <w:rPr/>
+            </w:pPr>
+            <w:r>
+              <w:rPr>
+                <w:rStyle w:val="SourceText"/>
+              </w:rPr>
+              <w:t>POST /internal/email</w:t>
+            </w:r>
+          </w:p>
+        </w:tc>
+        <w:tc>
+          <w:tcPr>
+            <w:tcW w:w="1521" w:type="dxa"/>
+            <w:tcBorders/>
+            <w:vAlign w:val="center"/>
+          </w:tcPr>
+          <w:p>
+            <w:pPr>
+              <w:pStyle w:val="TableContents"/>
+              <w:bidi w:val="0"/>
+              <w:spacing w:before="80" w:after="140"/>
+              <w:jc w:val="start"/>
+              <w:rPr/>
+            </w:pPr>
+            <w:r>
+              <w:rPr/>
+              <w:t>Implemented</w:t>
+            </w:r>
+          </w:p>
+        </w:tc>
+        <w:tc>
+          <w:tcPr>
+            <w:tcW w:w="2946" w:type="dxa"/>
+            <w:tcBorders/>
+            <w:vAlign w:val="center"/>
+          </w:tcPr>
+          <w:p>
+            <w:pPr>
+              <w:pStyle w:val="TableContents"/>
+              <w:bidi w:val="0"/>
+              <w:spacing w:before="80" w:after="140"/>
+              <w:jc w:val="start"/>
+              <w:rPr/>
+            </w:pPr>
+            <w:r>
+              <w:rPr/>
+              <w:t>Direct debug send</w:t>
             </w:r>
           </w:p>
         </w:tc>
@@ -4523,7 +4292,7 @@
       </w:pPr>
       <w:r>
         <w:rPr/>
-        <w:t>14. Related documents</w:t>
+        <w:t>11. Related documents</w:t>
       </w:r>
     </w:p>
     <w:p>
@@ -4543,7 +4312,7 @@
         <w:jc w:val="start"/>
         <w:rPr/>
       </w:pPr>
-      <w:hyperlink r:id="rId12">
+      <w:hyperlink r:id="rId9">
         <w:r>
           <w:rPr>
             <w:rStyle w:val="Hyperlink"/>
@@ -4573,7 +4342,7 @@
         <w:jc w:val="start"/>
         <w:rPr/>
       </w:pPr>
-      <w:hyperlink r:id="rId13">
+      <w:hyperlink r:id="rId10">
         <w:r>
           <w:rPr>
             <w:rStyle w:val="Hyperlink"/>
@@ -4603,7 +4372,7 @@
         <w:jc w:val="start"/>
         <w:rPr/>
       </w:pPr>
-      <w:hyperlink r:id="rId14">
+      <w:hyperlink r:id="rId11">
         <w:r>
           <w:rPr>
             <w:rStyle w:val="Hyperlink"/>

</xml_diff>